<commit_message>
Updated collection form data  📈
</commit_message>
<xml_diff>
--- a/25027doc.docx
+++ b/25027doc.docx
@@ -559,27 +559,7 @@
           <w:szCs w:val="20"/>
         </w:rPr>
         <w:br/>
-        <w:t xml:space="preserve">• IoT/GPS-enabled mobile </w:t>
-      </w:r>
-      <w:proofErr w:type="spellStart"/>
-      <w:r>
-        <w:rPr>
-          <w:rFonts w:ascii="montserratregular" w:hAnsi="montserratregular"/>
-          <w:color w:val="212529"/>
-          <w:sz w:val="20"/>
-          <w:szCs w:val="20"/>
-        </w:rPr>
-        <w:t>DApp</w:t>
-      </w:r>
-      <w:proofErr w:type="spellEnd"/>
-      <w:r>
-        <w:rPr>
-          <w:rFonts w:ascii="montserratregular" w:hAnsi="montserratregular"/>
-          <w:color w:val="212529"/>
-          <w:sz w:val="20"/>
-          <w:szCs w:val="20"/>
-        </w:rPr>
-        <w:t xml:space="preserve"> (or SMS-over-blockchain gateway) for collectors to record "CollectionEvent" metadata: latitude/longitude, timestamp, collector ID, species and initial quality metrics.</w:t>
+        <w:t>• IoT/GPS-enabled mobile DApp (or SMS-over-blockchain gateway) for collectors to record "CollectionEvent" metadata: latitude/longitude, timestamp, collector ID, species and initial quality metrics.</w:t>
       </w:r>
       <w:r>
         <w:rPr>
@@ -618,9 +598,96 @@
           <w:sz w:val="20"/>
           <w:szCs w:val="20"/>
         </w:rPr>
-        <w:t xml:space="preserve">3. Smart </w:t>
-      </w:r>
-      <w:proofErr w:type="spellStart"/>
+        <w:t>3. Smart Labeling &amp; Consumer Portal</w:t>
+      </w:r>
+      <w:r>
+        <w:rPr>
+          <w:rFonts w:ascii="montserratregular" w:hAnsi="montserratregular"/>
+          <w:color w:val="212529"/>
+          <w:sz w:val="20"/>
+          <w:szCs w:val="20"/>
+        </w:rPr>
+        <w:br/>
+        <w:t>• On-chain generation of unique QR codes for each finished product batch.</w:t>
+      </w:r>
+      <w:r>
+        <w:rPr>
+          <w:rFonts w:ascii="montserratregular" w:hAnsi="montserratregular"/>
+          <w:color w:val="212529"/>
+          <w:sz w:val="20"/>
+          <w:szCs w:val="20"/>
+        </w:rPr>
+        <w:br/>
+        <w:t>• A lightweight web/mobile portal (no specialised install required) allowing end customers to scan QR codes and retrieve a complete FHIR-style provenance bundle:</w:t>
+      </w:r>
+      <w:r>
+        <w:rPr>
+          <w:rFonts w:ascii="montserratregular" w:hAnsi="montserratregular"/>
+          <w:color w:val="212529"/>
+          <w:sz w:val="20"/>
+          <w:szCs w:val="20"/>
+        </w:rPr>
+        <w:br/>
+        <w:t>- Collection location map and harvest details</w:t>
+      </w:r>
+      <w:r>
+        <w:rPr>
+          <w:rFonts w:ascii="montserratregular" w:hAnsi="montserratregular"/>
+          <w:color w:val="212529"/>
+          <w:sz w:val="20"/>
+          <w:szCs w:val="20"/>
+        </w:rPr>
+        <w:br/>
+        <w:t>- Chain-of-custody handoffs through each supply-chain node</w:t>
+      </w:r>
+      <w:r>
+        <w:rPr>
+          <w:rFonts w:ascii="montserratregular" w:hAnsi="montserratregular"/>
+          <w:color w:val="212529"/>
+          <w:sz w:val="20"/>
+          <w:szCs w:val="20"/>
+        </w:rPr>
+        <w:br/>
+        <w:t>- Laboratory certificates for moisture, pesticide analysis, DNA authentication</w:t>
+      </w:r>
+      <w:r>
+        <w:rPr>
+          <w:rFonts w:ascii="montserratregular" w:hAnsi="montserratregular"/>
+          <w:color w:val="212529"/>
+          <w:sz w:val="20"/>
+          <w:szCs w:val="20"/>
+        </w:rPr>
+        <w:br/>
+        <w:t>- Sustainability compliance proofs and fair-trade verifications</w:t>
+      </w:r>
+      <w:r>
+        <w:rPr>
+          <w:rFonts w:ascii="montserratregular" w:hAnsi="montserratregular"/>
+          <w:color w:val="212529"/>
+          <w:sz w:val="20"/>
+          <w:szCs w:val="20"/>
+        </w:rPr>
+        <w:br/>
+        <w:t>- Interactive farmer/community profiles and conservation credentials</w:t>
+      </w:r>
+      <w:r>
+        <w:rPr>
+          <w:rFonts w:ascii="montserratregular" w:hAnsi="montserratregular"/>
+          <w:color w:val="212529"/>
+          <w:sz w:val="20"/>
+          <w:szCs w:val="20"/>
+        </w:rPr>
+        <w:br/>
+      </w:r>
+      <w:r>
+        <w:rPr>
+          <w:rFonts w:ascii="montserratregular" w:hAnsi="montserratregular"/>
+          <w:color w:val="212529"/>
+          <w:sz w:val="20"/>
+          <w:szCs w:val="20"/>
+        </w:rPr>
+        <w:br/>
+      </w:r>
       <w:r>
         <w:rPr>
           <w:rFonts w:ascii="montserratregular" w:hAnsi="montserratregular"/>
@@ -630,9 +697,56 @@
           <w:sz w:val="20"/>
           <w:szCs w:val="20"/>
         </w:rPr>
-        <w:t>Labeling</w:t>
-      </w:r>
-      <w:proofErr w:type="spellEnd"/>
+        <w:t>4. Integration &amp; Interoperability</w:t>
+      </w:r>
+      <w:r>
+        <w:rPr>
+          <w:rFonts w:ascii="montserratregular" w:hAnsi="montserratregular"/>
+          <w:color w:val="212529"/>
+          <w:sz w:val="20"/>
+          <w:szCs w:val="20"/>
+        </w:rPr>
+        <w:br/>
+        <w:t>• RESTful APIs for supply-chain managers to query real-time dashboards of harvest volumes, batch statuses, QA results and sustainability metrics.</w:t>
+      </w:r>
+      <w:r>
+        <w:rPr>
+          <w:rFonts w:ascii="montserratregular" w:hAnsi="montserratregular"/>
+          <w:color w:val="212529"/>
+          <w:sz w:val="20"/>
+          <w:szCs w:val="20"/>
+        </w:rPr>
+        <w:br/>
+        <w:t>• Plugins or connectors to existing ERP/quality-management systems for seamless data exchange.</w:t>
+      </w:r>
+      <w:r>
+        <w:rPr>
+          <w:rFonts w:ascii="montserratregular" w:hAnsi="montserratregular"/>
+          <w:color w:val="212529"/>
+          <w:sz w:val="20"/>
+          <w:szCs w:val="20"/>
+        </w:rPr>
+        <w:br/>
+        <w:t>• Use of FHIR-style resource models (CollectionEvent, QualityTest, ProcessingStep, Provenance) for standardized metadata exchange.</w:t>
+      </w:r>
+      <w:r>
+        <w:rPr>
+          <w:rFonts w:ascii="montserratregular" w:hAnsi="montserratregular"/>
+          <w:color w:val="212529"/>
+          <w:sz w:val="20"/>
+          <w:szCs w:val="20"/>
+        </w:rPr>
+        <w:br/>
+      </w:r>
+      <w:r>
+        <w:rPr>
+          <w:rFonts w:ascii="montserratregular" w:hAnsi="montserratregular"/>
+          <w:color w:val="212529"/>
+          <w:sz w:val="20"/>
+          <w:szCs w:val="20"/>
+        </w:rPr>
+        <w:br/>
+      </w:r>
       <w:r>
         <w:rPr>
           <w:rFonts w:ascii="montserratregular" w:hAnsi="montserratregular"/>
@@ -642,7 +756,7 @@
           <w:sz w:val="20"/>
           <w:szCs w:val="20"/>
         </w:rPr>
-        <w:t xml:space="preserve"> &amp; Consumer Portal</w:t>
+        <w:t>5. User Interfaces &amp; Reporting</w:t>
       </w:r>
       <w:r>
         <w:rPr>
@@ -652,7 +766,7 @@
           <w:szCs w:val="20"/>
         </w:rPr>
         <w:br/>
-        <w:t>• On-chain generation of unique QR codes for each finished product batch.</w:t>
+        <w:t>• A mobile DApp interface optimized for low-bandwidth rural environments, with offline data capture and SMS synchronization.</w:t>
       </w:r>
       <w:r>
         <w:rPr>
@@ -662,7 +776,7 @@
           <w:szCs w:val="20"/>
         </w:rPr>
         <w:br/>
-        <w:t>• A lightweight web/mobile portal (no specialised install required) allowing end customers to scan QR codes and retrieve a complete FHIR-style provenance bundle:</w:t>
+        <w:t>• A web dashboard for stakeholders to monitor network health, query provenance records and generate compliance reports aligned with AYUSH Ministry export and sustainability requirements.</w:t>
       </w:r>
       <w:r>
         <w:rPr>
@@ -672,47 +786,7 @@
           <w:szCs w:val="20"/>
         </w:rPr>
         <w:br/>
-        <w:t>- Collection location map and harvest details</w:t>
-      </w:r>
-      <w:r>
-        <w:rPr>
-          <w:rFonts w:ascii="montserratregular" w:hAnsi="montserratregular"/>
-          <w:color w:val="212529"/>
-          <w:sz w:val="20"/>
-          <w:szCs w:val="20"/>
-        </w:rPr>
-        <w:br/>
-        <w:t>- Chain-of-custody handoffs through each supply-chain node</w:t>
-      </w:r>
-      <w:r>
-        <w:rPr>
-          <w:rFonts w:ascii="montserratregular" w:hAnsi="montserratregular"/>
-          <w:color w:val="212529"/>
-          <w:sz w:val="20"/>
-          <w:szCs w:val="20"/>
-        </w:rPr>
-        <w:br/>
-        <w:t>- Laboratory certificates for moisture, pesticide analysis, DNA authentication</w:t>
-      </w:r>
-      <w:r>
-        <w:rPr>
-          <w:rFonts w:ascii="montserratregular" w:hAnsi="montserratregular"/>
-          <w:color w:val="212529"/>
-          <w:sz w:val="20"/>
-          <w:szCs w:val="20"/>
-        </w:rPr>
-        <w:br/>
-        <w:t>- Sustainability compliance proofs and fair-trade verifications</w:t>
-      </w:r>
-      <w:r>
-        <w:rPr>
-          <w:rFonts w:ascii="montserratregular" w:hAnsi="montserratregular"/>
-          <w:color w:val="212529"/>
-          <w:sz w:val="20"/>
-          <w:szCs w:val="20"/>
-        </w:rPr>
-        <w:br/>
-        <w:t>- Interactive farmer/community profiles and conservation credentials</w:t>
+        <w:t>• Automated reporting modules that compile environmental-impact metrics and conservation compliance data for certification bodies.</w:t>
       </w:r>
       <w:r>
         <w:rPr>
@@ -741,7 +815,7 @@
           <w:sz w:val="20"/>
           <w:szCs w:val="20"/>
         </w:rPr>
-        <w:t>4. Integration &amp; Interoperability</w:t>
+        <w:t>6. Demonstration &amp; Evaluation</w:t>
       </w:r>
       <w:r>
         <w:rPr>
@@ -751,7 +825,7 @@
           <w:szCs w:val="20"/>
         </w:rPr>
         <w:br/>
-        <w:t>• RESTful APIs for supply-chain managers to query real-time dashboards of harvest volumes, batch statuses, QA results and sustainability metrics.</w:t>
+        <w:t>• A live pilot using one botanical species (e.g., Ashwagandha) across a small farming cooperative and a collaborating processor.</w:t>
       </w:r>
       <w:r>
         <w:rPr>
@@ -761,7 +835,7 @@
           <w:szCs w:val="20"/>
         </w:rPr>
         <w:br/>
-        <w:t>• Plugins or connectors to existing ERP/quality-management systems for seamless data exchange.</w:t>
+        <w:t>• End-to-end demonstration: geo-tagging harvest, adding lab results, processing events, QR code scanning by simulated consumers and recall simulation.</w:t>
       </w:r>
       <w:r>
         <w:rPr>
@@ -771,7 +845,7 @@
           <w:szCs w:val="20"/>
         </w:rPr>
         <w:br/>
-        <w:t>• Use of FHIR-style resource models (CollectionEvent, QualityTest, ProcessingStep, Provenance) for standardized metadata exchange.</w:t>
+        <w:t>• Metrics collection on data-capture latency, transaction throughput, offline sync reliability and consumer-</w:t>
       </w:r>
       <w:r>
         <w:rPr>
@@ -780,7 +854,8 @@
           <w:sz w:val="20"/>
           <w:szCs w:val="20"/>
         </w:rPr>
-        <w:br/>
+        <w:lastRenderedPageBreak/>
+        <w:t>scan engagement.</w:t>
       </w:r>
       <w:r>
         <w:rPr>
@@ -794,182 +869,101 @@
       <w:r>
         <w:rPr>
           <w:rFonts w:ascii="montserratregular" w:hAnsi="montserratregular"/>
-          <w:b/>
-          <w:bCs/>
           <w:color w:val="212529"/>
           <w:sz w:val="20"/>
           <w:szCs w:val="20"/>
         </w:rPr>
-        <w:t>5. User Interfaces &amp; Reporting</w:t>
-      </w:r>
-      <w:r>
+        <w:br/>
+        <w:t>By delivering these elements, participants will showcase a replicable, transparent and sustainable model for botanical traceability that bridges traditional Ayurvedic sourcing with modern blockchain technology and consumer empowerment.</w:t>
+      </w:r>
+    </w:p>
+    <w:p>
+      <w:pPr>
         <w:rPr>
           <w:rFonts w:ascii="montserratregular" w:hAnsi="montserratregular"/>
           <w:color w:val="212529"/>
           <w:sz w:val="20"/>
           <w:szCs w:val="20"/>
         </w:rPr>
-        <w:br/>
-        <w:t xml:space="preserve">• A mobile </w:t>
-      </w:r>
-      <w:proofErr w:type="spellStart"/>
-      <w:r>
+      </w:pPr>
+    </w:p>
+    <w:p>
+      <w:pPr>
         <w:rPr>
           <w:rFonts w:ascii="montserratregular" w:hAnsi="montserratregular"/>
           <w:color w:val="212529"/>
           <w:sz w:val="20"/>
           <w:szCs w:val="20"/>
         </w:rPr>
-        <w:t>DApp</w:t>
-      </w:r>
-      <w:proofErr w:type="spellEnd"/>
-      <w:r>
+      </w:pPr>
+    </w:p>
+    <w:p>
+      <w:pPr>
         <w:rPr>
           <w:rFonts w:ascii="montserratregular" w:hAnsi="montserratregular"/>
           <w:color w:val="212529"/>
           <w:sz w:val="20"/>
           <w:szCs w:val="20"/>
         </w:rPr>
-        <w:t xml:space="preserve"> interface optimized for low-bandwidth rural environments, with offline data capture and SMS synchronization.</w:t>
-      </w:r>
-      <w:r>
-        <w:rPr>
-          <w:rFonts w:ascii="montserratregular" w:hAnsi="montserratregular"/>
-          <w:color w:val="212529"/>
-          <w:sz w:val="20"/>
-          <w:szCs w:val="20"/>
-        </w:rPr>
-        <w:br/>
-        <w:t>• A web dashboard for stakeholders to monitor network health, query provenance records and generate compliance reports aligned with AYUSH Ministry export and sustainability requirements.</w:t>
-      </w:r>
-      <w:r>
-        <w:rPr>
-          <w:rFonts w:ascii="montserratregular" w:hAnsi="montserratregular"/>
-          <w:color w:val="212529"/>
-          <w:sz w:val="20"/>
-          <w:szCs w:val="20"/>
-        </w:rPr>
-        <w:br/>
-        <w:t>• Automated reporting modules that compile environmental-impact metrics and conservation compliance data for certification bodies.</w:t>
-      </w:r>
-      <w:r>
-        <w:rPr>
-          <w:rFonts w:ascii="montserratregular" w:hAnsi="montserratregular"/>
-          <w:color w:val="212529"/>
-          <w:sz w:val="20"/>
-          <w:szCs w:val="20"/>
-        </w:rPr>
-        <w:br/>
-      </w:r>
-      <w:r>
-        <w:rPr>
-          <w:rFonts w:ascii="montserratregular" w:hAnsi="montserratregular"/>
-          <w:color w:val="212529"/>
-          <w:sz w:val="20"/>
-          <w:szCs w:val="20"/>
-        </w:rPr>
-        <w:br/>
-      </w:r>
-      <w:r>
-        <w:rPr>
-          <w:rFonts w:ascii="montserratregular" w:hAnsi="montserratregular"/>
+      </w:pPr>
+    </w:p>
+    <w:p>
+      <w:pPr>
+        <w:spacing w:before="100" w:beforeAutospacing="1" w:after="100" w:afterAutospacing="1"/>
+        <w:rPr>
+          <w:rFonts w:ascii="Times New Roman" w:eastAsia="Times New Roman" w:hAnsi="Times New Roman" w:cs="Times New Roman"/>
+          <w:kern w:val="0"/>
+          <w:lang w:eastAsia="en-GB"/>
+          <w14:ligatures w14:val="none"/>
+        </w:rPr>
+      </w:pPr>
+      <w:r>
+        <w:rPr>
+          <w:rFonts w:ascii="Times New Roman" w:eastAsia="Times New Roman" w:hAnsi="Times New Roman" w:cs="Times New Roman"/>
+          <w:kern w:val="0"/>
+          <w:lang w:eastAsia="en-GB"/>
+          <w14:ligatures w14:val="none"/>
+        </w:rPr>
+        <w:t xml:space="preserve">Got it </w:t>
+      </w:r>
+      <w:r>
+        <w:rPr>
+          <w:rFonts w:ascii="Apple Color Emoji" w:eastAsia="Times New Roman" w:hAnsi="Apple Color Emoji" w:cs="Apple Color Emoji"/>
+          <w:kern w:val="0"/>
+          <w:lang w:eastAsia="en-GB"/>
+          <w14:ligatures w14:val="none"/>
+        </w:rPr>
+        <w:t>👍</w:t>
+      </w:r>
+      <w:r>
+        <w:rPr>
+          <w:rFonts w:ascii="Times New Roman" w:eastAsia="Times New Roman" w:hAnsi="Times New Roman" w:cs="Times New Roman"/>
+          <w:kern w:val="0"/>
+          <w:lang w:eastAsia="en-GB"/>
+          <w14:ligatures w14:val="none"/>
+        </w:rPr>
+        <w:t xml:space="preserve"> — let’s break this down clearly for </w:t>
+      </w:r>
+      <w:r>
+        <w:rPr>
+          <w:rFonts w:ascii="Times New Roman" w:eastAsia="Times New Roman" w:hAnsi="Times New Roman" w:cs="Times New Roman"/>
           <w:b/>
           <w:bCs/>
-          <w:color w:val="212529"/>
-          <w:sz w:val="20"/>
-          <w:szCs w:val="20"/>
-        </w:rPr>
-        <w:t>6. Demonstration &amp; Evaluation</w:t>
-      </w:r>
-      <w:r>
-        <w:rPr>
-          <w:rFonts w:ascii="montserratregular" w:hAnsi="montserratregular"/>
-          <w:color w:val="212529"/>
-          <w:sz w:val="20"/>
-          <w:szCs w:val="20"/>
-        </w:rPr>
-        <w:br/>
-        <w:t>• A live pilot using one botanical species (e.g., Ashwagandha) across a small farming cooperative and a collaborating processor.</w:t>
-      </w:r>
-      <w:r>
-        <w:rPr>
-          <w:rFonts w:ascii="montserratregular" w:hAnsi="montserratregular"/>
-          <w:color w:val="212529"/>
-          <w:sz w:val="20"/>
-          <w:szCs w:val="20"/>
-        </w:rPr>
-        <w:br/>
-        <w:t>• End-to-end demonstration: geo-tagging harvest, adding lab results, processing events, QR code scanning by simulated consumers and recall simulation.</w:t>
-      </w:r>
-      <w:r>
-        <w:rPr>
-          <w:rFonts w:ascii="montserratregular" w:hAnsi="montserratregular"/>
-          <w:color w:val="212529"/>
-          <w:sz w:val="20"/>
-          <w:szCs w:val="20"/>
-        </w:rPr>
-        <w:br/>
-        <w:t>• Metrics collection on data-capture latency, transaction throughput, offline sync reliability and consumer-</w:t>
-      </w:r>
-      <w:r>
-        <w:rPr>
-          <w:rFonts w:ascii="montserratregular" w:hAnsi="montserratregular"/>
-          <w:color w:val="212529"/>
-          <w:sz w:val="20"/>
-          <w:szCs w:val="20"/>
-        </w:rPr>
-        <w:lastRenderedPageBreak/>
-        <w:t>scan engagement.</w:t>
-      </w:r>
-      <w:r>
-        <w:rPr>
-          <w:rFonts w:ascii="montserratregular" w:hAnsi="montserratregular"/>
-          <w:color w:val="212529"/>
-          <w:sz w:val="20"/>
-          <w:szCs w:val="20"/>
-        </w:rPr>
-        <w:br/>
-      </w:r>
-      <w:r>
-        <w:rPr>
-          <w:rFonts w:ascii="montserratregular" w:hAnsi="montserratregular"/>
-          <w:color w:val="212529"/>
-          <w:sz w:val="20"/>
-          <w:szCs w:val="20"/>
-        </w:rPr>
-        <w:br/>
-        <w:t>By delivering these elements, participants will showcase a replicable, transparent and sustainable model for botanical traceability that bridges traditional Ayurvedic sourcing with modern blockchain technology and consumer empowerment.</w:t>
-      </w:r>
-    </w:p>
-    <w:p>
-      <w:pPr>
-        <w:rPr>
-          <w:rFonts w:ascii="montserratregular" w:hAnsi="montserratregular"/>
-          <w:color w:val="212529"/>
-          <w:sz w:val="20"/>
-          <w:szCs w:val="20"/>
-        </w:rPr>
-      </w:pPr>
-    </w:p>
-    <w:p>
-      <w:pPr>
-        <w:rPr>
-          <w:rFonts w:ascii="montserratregular" w:hAnsi="montserratregular"/>
-          <w:color w:val="212529"/>
-          <w:sz w:val="20"/>
-          <w:szCs w:val="20"/>
-        </w:rPr>
-      </w:pPr>
-    </w:p>
-    <w:p>
-      <w:pPr>
-        <w:rPr>
-          <w:rFonts w:ascii="montserratregular" w:hAnsi="montserratregular"/>
-          <w:color w:val="212529"/>
-          <w:sz w:val="20"/>
-          <w:szCs w:val="20"/>
-        </w:rPr>
-      </w:pPr>
+          <w:kern w:val="0"/>
+          <w:lang w:eastAsia="en-GB"/>
+          <w14:ligatures w14:val="none"/>
+        </w:rPr>
+        <w:t>“who will be giving data”</w:t>
+      </w:r>
+      <w:r>
+        <w:rPr>
+          <w:rFonts w:ascii="Times New Roman" w:eastAsia="Times New Roman" w:hAnsi="Times New Roman" w:cs="Times New Roman"/>
+          <w:kern w:val="0"/>
+          <w:lang w:eastAsia="en-GB"/>
+          <w14:ligatures w14:val="none"/>
+        </w:rPr>
+        <w:t xml:space="preserve"> at each stage of the blockchain-based Ayurvedic herb traceability system.</w:t>
+      </w:r>
     </w:p>
     <w:p>
       <w:pPr>
@@ -981,69 +975,23 @@
           <w14:ligatures w14:val="none"/>
         </w:rPr>
       </w:pPr>
-      <w:r>
-        <w:rPr>
-          <w:rFonts w:ascii="Times New Roman" w:eastAsia="Times New Roman" w:hAnsi="Times New Roman" w:cs="Times New Roman"/>
-          <w:kern w:val="0"/>
-          <w:lang w:eastAsia="en-GB"/>
-          <w14:ligatures w14:val="none"/>
-        </w:rPr>
-        <w:t xml:space="preserve">Got it </w:t>
-      </w:r>
-      <w:r>
-        <w:rPr>
-          <w:rFonts w:ascii="Apple Color Emoji" w:eastAsia="Times New Roman" w:hAnsi="Apple Color Emoji" w:cs="Apple Color Emoji"/>
-          <w:kern w:val="0"/>
-          <w:lang w:eastAsia="en-GB"/>
-          <w14:ligatures w14:val="none"/>
-        </w:rPr>
-        <w:t>👍</w:t>
-      </w:r>
-      <w:r>
-        <w:rPr>
-          <w:rFonts w:ascii="Times New Roman" w:eastAsia="Times New Roman" w:hAnsi="Times New Roman" w:cs="Times New Roman"/>
-          <w:kern w:val="0"/>
-          <w:lang w:eastAsia="en-GB"/>
-          <w14:ligatures w14:val="none"/>
-        </w:rPr>
-        <w:t xml:space="preserve"> — let’s break this down clearly for </w:t>
-      </w:r>
-      <w:r>
+    </w:p>
+    <w:p>
+      <w:pPr>
+        <w:spacing w:before="100" w:beforeAutospacing="1" w:after="100" w:afterAutospacing="1"/>
+        <w:outlineLvl w:val="2"/>
         <w:rPr>
           <w:rFonts w:ascii="Times New Roman" w:eastAsia="Times New Roman" w:hAnsi="Times New Roman" w:cs="Times New Roman"/>
           <w:b/>
           <w:bCs/>
           <w:kern w:val="0"/>
-          <w:lang w:eastAsia="en-GB"/>
-          <w14:ligatures w14:val="none"/>
-        </w:rPr>
-        <w:t>“who will be giving data”</w:t>
-      </w:r>
-      <w:r>
-        <w:rPr>
-          <w:rFonts w:ascii="Times New Roman" w:eastAsia="Times New Roman" w:hAnsi="Times New Roman" w:cs="Times New Roman"/>
-          <w:kern w:val="0"/>
-          <w:lang w:eastAsia="en-GB"/>
-          <w14:ligatures w14:val="none"/>
-        </w:rPr>
-        <w:t xml:space="preserve"> at each stage of the blockchain-based Ayurvedic herb traceability system.</w:t>
-      </w:r>
-    </w:p>
-    <w:p>
-      <w:pPr>
-        <w:spacing w:before="100" w:beforeAutospacing="1" w:after="100" w:afterAutospacing="1"/>
-        <w:rPr>
-          <w:rFonts w:ascii="Times New Roman" w:eastAsia="Times New Roman" w:hAnsi="Times New Roman" w:cs="Times New Roman"/>
-          <w:kern w:val="0"/>
-          <w:lang w:eastAsia="en-GB"/>
-          <w14:ligatures w14:val="none"/>
-        </w:rPr>
-      </w:pPr>
-    </w:p>
-    <w:p>
-      <w:pPr>
-        <w:spacing w:before="100" w:beforeAutospacing="1" w:after="100" w:afterAutospacing="1"/>
-        <w:outlineLvl w:val="2"/>
+          <w:sz w:val="27"/>
+          <w:szCs w:val="27"/>
+          <w:lang w:eastAsia="en-GB"/>
+          <w14:ligatures w14:val="none"/>
+        </w:rPr>
+      </w:pPr>
+      <w:r>
         <w:rPr>
           <w:rFonts w:ascii="Times New Roman" w:eastAsia="Times New Roman" w:hAnsi="Times New Roman" w:cs="Times New Roman"/>
           <w:b/>
@@ -1054,18 +1002,6 @@
           <w:lang w:eastAsia="en-GB"/>
           <w14:ligatures w14:val="none"/>
         </w:rPr>
-      </w:pPr>
-      <w:r>
-        <w:rPr>
-          <w:rFonts w:ascii="Times New Roman" w:eastAsia="Times New Roman" w:hAnsi="Times New Roman" w:cs="Times New Roman"/>
-          <w:b/>
-          <w:bCs/>
-          <w:kern w:val="0"/>
-          <w:sz w:val="27"/>
-          <w:szCs w:val="27"/>
-          <w:lang w:eastAsia="en-GB"/>
-          <w14:ligatures w14:val="none"/>
-        </w:rPr>
         <w:t>Data Providers Across the Supply Chain</w:t>
       </w:r>
     </w:p>
@@ -1110,13 +1046,8 @@
         </w:rPr>
       </w:pPr>
       <w:r>
-        <w:rPr>
-          <w:noProof/>
-        </w:rPr>
-      </w:r>
-      <w:r>
         <w:pict w14:anchorId="47EFDA5A">
-          <v:rect id="Horizontal Line 6" o:spid="_x0000_s1031" style="width:451.3pt;height:.1pt;visibility:visible;mso-wrap-style:square;mso-left-percent:-10001;mso-top-percent:-10001;mso-position-horizontal:absolute;mso-position-horizontal-relative:char;mso-position-vertical:absolute;mso-position-vertical-relative:line;mso-left-percent:-10001;mso-top-percent:-10001;v-text-anchor:top" o:gfxdata="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" filled="f">
+          <v:rect id="Horizontal Line 6" o:spid="_x0000_s1031" alt="" style="width:451.3pt;height:.1pt;visibility:visible;mso-wrap-style:square;mso-width-percent:0;mso-height-percent:0;mso-left-percent:-10001;mso-top-percent:-10001;mso-position-horizontal:absolute;mso-position-horizontal-relative:char;mso-position-vertical:absolute;mso-position-vertical-relative:line;mso-width-percent:0;mso-height-percent:0;mso-left-percent:-10001;mso-top-percent:-10001;v-text-anchor:top" filled="f">
             <o:lock v:ext="edit" rotation="t" aspectratio="t" verticies="t" text="t" shapetype="t"/>
             <w10:anchorlock/>
           </v:rect>
@@ -1341,27 +1272,7 @@
           <w:lang w:eastAsia="en-GB"/>
           <w14:ligatures w14:val="none"/>
         </w:rPr>
-        <w:t xml:space="preserve">Mobile </w:t>
-      </w:r>
-      <w:proofErr w:type="spellStart"/>
-      <w:r>
-        <w:rPr>
-          <w:rFonts w:ascii="Times New Roman" w:eastAsia="Times New Roman" w:hAnsi="Times New Roman" w:cs="Times New Roman"/>
-          <w:kern w:val="0"/>
-          <w:lang w:eastAsia="en-GB"/>
-          <w14:ligatures w14:val="none"/>
-        </w:rPr>
-        <w:t>DApp</w:t>
-      </w:r>
-      <w:proofErr w:type="spellEnd"/>
-      <w:r>
-        <w:rPr>
-          <w:rFonts w:ascii="Times New Roman" w:eastAsia="Times New Roman" w:hAnsi="Times New Roman" w:cs="Times New Roman"/>
-          <w:kern w:val="0"/>
-          <w:lang w:eastAsia="en-GB"/>
-          <w14:ligatures w14:val="none"/>
-        </w:rPr>
-        <w:t xml:space="preserve"> (offline capture possible)</w:t>
+        <w:t>Mobile DApp (offline capture possible)</w:t>
       </w:r>
     </w:p>
     <w:p>
@@ -1429,7 +1340,7 @@
           <w:lang w:eastAsia="en-GB"/>
         </w:rPr>
         <w:pict w14:anchorId="327D4C32">
-          <v:rect id="_x0000_i1039" alt="" style="width:451.3pt;height:.05pt;mso-width-percent:0;mso-height-percent:0;mso-width-percent:0;mso-height-percent:0" o:hralign="center" o:hrstd="t" o:hr="t" fillcolor="#a0a0a0" stroked="f"/>
+          <v:rect id="_x0000_i1032" alt="" style="width:451.3pt;height:.05pt;mso-width-percent:0;mso-height-percent:0;mso-width-percent:0;mso-height-percent:0" o:hralign="center" o:hrstd="t" o:hr="t" fillcolor="#a0a0a0" stroked="f"/>
         </w:pict>
       </w:r>
     </w:p>
@@ -1623,7 +1534,7 @@
           <w:lang w:eastAsia="en-GB"/>
         </w:rPr>
         <w:pict w14:anchorId="0BE0D97B">
-          <v:rect id="_x0000_i1038" alt="" style="width:451.3pt;height:.05pt;mso-width-percent:0;mso-height-percent:0;mso-width-percent:0;mso-height-percent:0" o:hralign="center" o:hrstd="t" o:hr="t" fillcolor="#a0a0a0" stroked="f"/>
+          <v:rect id="_x0000_i1031" alt="" style="width:451.3pt;height:.05pt;mso-width-percent:0;mso-height-percent:0;mso-width-percent:0;mso-height-percent:0" o:hralign="center" o:hrstd="t" o:hr="t" fillcolor="#a0a0a0" stroked="f"/>
         </w:pict>
       </w:r>
     </w:p>
@@ -1866,7 +1777,7 @@
           <w:lang w:eastAsia="en-GB"/>
         </w:rPr>
         <w:pict w14:anchorId="4C0409D1">
-          <v:rect id="_x0000_i1037" alt="" style="width:451.3pt;height:.05pt;mso-width-percent:0;mso-height-percent:0;mso-width-percent:0;mso-height-percent:0" o:hralign="center" o:hrstd="t" o:hr="t" fillcolor="#a0a0a0" stroked="f"/>
+          <v:rect id="_x0000_i1030" alt="" style="width:451.3pt;height:.05pt;mso-width-percent:0;mso-height-percent:0;mso-width-percent:0;mso-height-percent:0" o:hralign="center" o:hrstd="t" o:hr="t" fillcolor="#a0a0a0" stroked="f"/>
         </w:pict>
       </w:r>
     </w:p>
@@ -2121,13 +2032,8 @@
         </w:rPr>
       </w:pPr>
       <w:r>
-        <w:rPr>
-          <w:noProof/>
-        </w:rPr>
-      </w:r>
-      <w:r>
         <w:pict w14:anchorId="5070B282">
-          <v:rect id="Horizontal Line 10" o:spid="_x0000_s1030" style="width:451.3pt;height:.1pt;visibility:visible;mso-wrap-style:square;mso-left-percent:-10001;mso-top-percent:-10001;mso-position-horizontal:absolute;mso-position-horizontal-relative:char;mso-position-vertical:absolute;mso-position-vertical-relative:line;mso-left-percent:-10001;mso-top-percent:-10001;v-text-anchor:top" o:gfxdata="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" filled="f">
+          <v:rect id="Horizontal Line 10" o:spid="_x0000_s1030" alt="" style="width:451.3pt;height:.1pt;visibility:visible;mso-wrap-style:square;mso-width-percent:0;mso-height-percent:0;mso-left-percent:-10001;mso-top-percent:-10001;mso-position-horizontal:absolute;mso-position-horizontal-relative:char;mso-position-vertical:absolute;mso-position-vertical-relative:line;mso-width-percent:0;mso-height-percent:0;mso-left-percent:-10001;mso-top-percent:-10001;v-text-anchor:top" filled="f">
             <o:lock v:ext="edit" rotation="t" aspectratio="t" verticies="t" text="t" shapetype="t"/>
             <w10:anchorlock/>
           </v:rect>
@@ -2243,13 +2149,8 @@
         </w:rPr>
       </w:pPr>
       <w:r>
-        <w:rPr>
-          <w:noProof/>
-        </w:rPr>
-      </w:r>
-      <w:r>
         <w:pict w14:anchorId="2B513630">
-          <v:rect id="Horizontal Line 11" o:spid="_x0000_s1029" style="width:451.3pt;height:.1pt;visibility:visible;mso-wrap-style:square;mso-left-percent:-10001;mso-top-percent:-10001;mso-position-horizontal:absolute;mso-position-horizontal-relative:char;mso-position-vertical:absolute;mso-position-vertical-relative:line;mso-left-percent:-10001;mso-top-percent:-10001;v-text-anchor:top" o:gfxdata="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" filled="f">
+          <v:rect id="Horizontal Line 11" o:spid="_x0000_s1029" alt="" style="width:451.3pt;height:.1pt;visibility:visible;mso-wrap-style:square;mso-width-percent:0;mso-height-percent:0;mso-left-percent:-10001;mso-top-percent:-10001;mso-position-horizontal:absolute;mso-position-horizontal-relative:char;mso-position-vertical:absolute;mso-position-vertical-relative:line;mso-width-percent:0;mso-height-percent:0;mso-left-percent:-10001;mso-top-percent:-10001;v-text-anchor:top" filled="f">
             <o:lock v:ext="edit" rotation="t" aspectratio="t" verticies="t" text="t" shapetype="t"/>
             <w10:anchorlock/>
           </v:rect>
@@ -2463,13 +2364,8 @@
         </w:rPr>
       </w:pPr>
       <w:r>
-        <w:rPr>
-          <w:noProof/>
-        </w:rPr>
-      </w:r>
-      <w:r>
         <w:pict w14:anchorId="4F19CB45">
-          <v:rect id="Horizontal Line 12" o:spid="_x0000_s1028" style="width:451.3pt;height:.1pt;visibility:visible;mso-wrap-style:square;mso-left-percent:-10001;mso-top-percent:-10001;mso-position-horizontal:absolute;mso-position-horizontal-relative:char;mso-position-vertical:absolute;mso-position-vertical-relative:line;mso-left-percent:-10001;mso-top-percent:-10001;v-text-anchor:top" o:gfxdata="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" filled="f">
+          <v:rect id="Horizontal Line 12" o:spid="_x0000_s1028" alt="" style="width:451.3pt;height:.1pt;visibility:visible;mso-wrap-style:square;mso-width-percent:0;mso-height-percent:0;mso-left-percent:-10001;mso-top-percent:-10001;mso-position-horizontal:absolute;mso-position-horizontal-relative:char;mso-position-vertical:absolute;mso-position-vertical-relative:line;mso-width-percent:0;mso-height-percent:0;mso-left-percent:-10001;mso-top-percent:-10001;v-text-anchor:top" filled="f">
             <o:lock v:ext="edit" rotation="t" aspectratio="t" verticies="t" text="t" shapetype="t"/>
             <w10:anchorlock/>
           </v:rect>
@@ -2638,13 +2534,8 @@
         </w:rPr>
       </w:pPr>
       <w:r>
-        <w:rPr>
-          <w:noProof/>
-        </w:rPr>
-      </w:r>
-      <w:r>
         <w:pict w14:anchorId="38C59DD7">
-          <v:rect id="Horizontal Line 13" o:spid="_x0000_s1027" style="width:451.3pt;height:.1pt;visibility:visible;mso-wrap-style:square;mso-left-percent:-10001;mso-top-percent:-10001;mso-position-horizontal:absolute;mso-position-horizontal-relative:char;mso-position-vertical:absolute;mso-position-vertical-relative:line;mso-left-percent:-10001;mso-top-percent:-10001;v-text-anchor:top" o:gfxdata="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" filled="f">
+          <v:rect id="Horizontal Line 13" o:spid="_x0000_s1027" alt="" style="width:451.3pt;height:.1pt;visibility:visible;mso-wrap-style:square;mso-width-percent:0;mso-height-percent:0;mso-left-percent:-10001;mso-top-percent:-10001;mso-position-horizontal:absolute;mso-position-horizontal-relative:char;mso-position-vertical:absolute;mso-position-vertical-relative:line;mso-width-percent:0;mso-height-percent:0;mso-left-percent:-10001;mso-top-percent:-10001;v-text-anchor:top" filled="f">
             <o:lock v:ext="edit" rotation="t" aspectratio="t" verticies="t" text="t" shapetype="t"/>
             <w10:anchorlock/>
           </v:rect>
@@ -2883,13 +2774,8 @@
         </w:rPr>
       </w:pPr>
       <w:r>
-        <w:rPr>
-          <w:noProof/>
-        </w:rPr>
-      </w:r>
-      <w:r>
         <w:pict w14:anchorId="63D20CAA">
-          <v:rect id="Horizontal Line 14" o:spid="_x0000_s1026" style="width:451.3pt;height:.1pt;visibility:visible;mso-wrap-style:square;mso-left-percent:-10001;mso-top-percent:-10001;mso-position-horizontal:absolute;mso-position-horizontal-relative:char;mso-position-vertical:absolute;mso-position-vertical-relative:line;mso-left-percent:-10001;mso-top-percent:-10001;v-text-anchor:top" o:gfxdata="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" filled="f">
+          <v:rect id="Horizontal Line 14" o:spid="_x0000_s1026" alt="" style="width:451.3pt;height:.1pt;visibility:visible;mso-wrap-style:square;mso-width-percent:0;mso-height-percent:0;mso-left-percent:-10001;mso-top-percent:-10001;mso-position-horizontal:absolute;mso-position-horizontal-relative:char;mso-position-vertical:absolute;mso-position-vertical-relative:line;mso-width-percent:0;mso-height-percent:0;mso-left-percent:-10001;mso-top-percent:-10001;v-text-anchor:top" filled="f">
             <o:lock v:ext="edit" rotation="t" aspectratio="t" verticies="t" text="t" shapetype="t"/>
             <w10:anchorlock/>
           </v:rect>
@@ -2982,2107 +2868,508 @@
     </w:p>
     <w:p>
       <w:pPr>
-        <w:pStyle w:val="Heading2"/>
-        <w:rPr>
-          <w:rFonts w:ascii="Times New Roman" w:eastAsia="Times New Roman" w:hAnsi="Times New Roman" w:cs="Times New Roman"/>
-          <w:b/>
-          <w:bCs/>
-          <w:color w:val="auto"/>
-          <w:kern w:val="0"/>
-          <w:sz w:val="36"/>
-          <w:szCs w:val="36"/>
-          <w:lang w:eastAsia="en-GB"/>
-          <w14:ligatures w14:val="none"/>
-        </w:rPr>
-      </w:pPr>
-      <w:r>
-        <w:rPr>
-          <w:rFonts w:ascii="Times New Roman" w:eastAsia="Times New Roman" w:hAnsi="Times New Roman" w:cs="Times New Roman"/>
-          <w:kern w:val="0"/>
-          <w:lang w:eastAsia="en-GB"/>
-          <w14:ligatures w14:val="none"/>
-        </w:rPr>
+        <w:pStyle w:val="p1"/>
+      </w:pPr>
+      <w:r>
         <w:t>DB</w:t>
       </w:r>
       <w:r>
-        <w:rPr>
-          <w:rFonts w:ascii="Times New Roman" w:eastAsia="Times New Roman" w:hAnsi="Times New Roman" w:cs="Times New Roman"/>
-          <w:kern w:val="0"/>
-          <w:lang w:eastAsia="en-GB"/>
-          <w14:ligatures w14:val="none"/>
-        </w:rPr>
         <w:br/>
         <w:t>Location in each</w:t>
       </w:r>
       <w:r>
-        <w:rPr>
-          <w:rFonts w:ascii="Times New Roman" w:eastAsia="Times New Roman" w:hAnsi="Times New Roman" w:cs="Times New Roman"/>
-          <w:kern w:val="0"/>
-          <w:lang w:eastAsia="en-GB"/>
-          <w14:ligatures w14:val="none"/>
-        </w:rPr>
         <w:br/>
       </w:r>
       <w:r>
-        <w:rPr>
-          <w:rFonts w:ascii="Times New Roman" w:eastAsia="Times New Roman" w:hAnsi="Times New Roman" w:cs="Times New Roman"/>
-          <w:kern w:val="0"/>
-          <w:lang w:eastAsia="en-GB"/>
-          <w14:ligatures w14:val="none"/>
-        </w:rPr>
         <w:br/>
       </w:r>
       <w:r>
-        <w:rPr>
-          <w:rFonts w:ascii="Times New Roman" w:eastAsia="Times New Roman" w:hAnsi="Times New Roman" w:cs="Times New Roman"/>
-          <w:b/>
-          <w:bCs/>
-          <w:color w:val="auto"/>
-          <w:kern w:val="0"/>
-          <w:sz w:val="36"/>
-          <w:szCs w:val="36"/>
-          <w:lang w:eastAsia="en-GB"/>
-          <w14:ligatures w14:val="none"/>
-        </w:rPr>
-        <w:t>1. Farmers (Cultivated Collection)</w:t>
-      </w:r>
-    </w:p>
-    <w:p>
-      <w:pPr>
-        <w:numPr>
-          <w:ilvl w:val="0"/>
-          <w:numId w:val="17"/>
-        </w:numPr>
-        <w:spacing w:before="100" w:beforeAutospacing="1" w:after="100" w:afterAutospacing="1"/>
-        <w:rPr>
-          <w:rFonts w:ascii="Times New Roman" w:eastAsia="Times New Roman" w:hAnsi="Times New Roman" w:cs="Times New Roman"/>
-          <w:kern w:val="0"/>
-          <w:lang w:eastAsia="en-GB"/>
-          <w14:ligatures w14:val="none"/>
-        </w:rPr>
-      </w:pPr>
-      <w:proofErr w:type="spellStart"/>
-      <w:r>
-        <w:rPr>
-          <w:rFonts w:ascii="Times New Roman" w:eastAsia="Times New Roman" w:hAnsi="Times New Roman" w:cs="Times New Roman"/>
-          <w:kern w:val="0"/>
-          <w:lang w:eastAsia="en-GB"/>
-          <w14:ligatures w14:val="none"/>
-        </w:rPr>
-        <w:t>FarmerBatchID</w:t>
-      </w:r>
-      <w:proofErr w:type="spellEnd"/>
-      <w:r>
-        <w:rPr>
-          <w:rFonts w:ascii="Times New Roman" w:eastAsia="Times New Roman" w:hAnsi="Times New Roman" w:cs="Times New Roman"/>
-          <w:kern w:val="0"/>
-          <w:lang w:eastAsia="en-GB"/>
-          <w14:ligatures w14:val="none"/>
-        </w:rPr>
-        <w:t xml:space="preserve"> (auto)</w:t>
-      </w:r>
-    </w:p>
-    <w:p>
-      <w:pPr>
-        <w:numPr>
-          <w:ilvl w:val="0"/>
-          <w:numId w:val="17"/>
-        </w:numPr>
-        <w:spacing w:before="100" w:beforeAutospacing="1" w:after="100" w:afterAutospacing="1"/>
-        <w:rPr>
-          <w:rFonts w:ascii="Times New Roman" w:eastAsia="Times New Roman" w:hAnsi="Times New Roman" w:cs="Times New Roman"/>
-          <w:kern w:val="0"/>
-          <w:lang w:eastAsia="en-GB"/>
-          <w14:ligatures w14:val="none"/>
-        </w:rPr>
-      </w:pPr>
-      <w:r>
-        <w:rPr>
-          <w:rFonts w:ascii="Times New Roman" w:eastAsia="Times New Roman" w:hAnsi="Times New Roman" w:cs="Times New Roman"/>
-          <w:kern w:val="0"/>
-          <w:lang w:eastAsia="en-GB"/>
-          <w14:ligatures w14:val="none"/>
-        </w:rPr>
-        <w:t>Farmer Name (</w:t>
-      </w:r>
-      <w:proofErr w:type="spellStart"/>
-      <w:r>
-        <w:rPr>
-          <w:rFonts w:ascii="Times New Roman" w:eastAsia="Times New Roman" w:hAnsi="Times New Roman" w:cs="Times New Roman"/>
-          <w:kern w:val="0"/>
-          <w:lang w:eastAsia="en-GB"/>
-          <w14:ligatures w14:val="none"/>
-        </w:rPr>
-        <w:t>fName</w:t>
-      </w:r>
-      <w:proofErr w:type="spellEnd"/>
-      <w:r>
-        <w:rPr>
-          <w:rFonts w:ascii="Times New Roman" w:eastAsia="Times New Roman" w:hAnsi="Times New Roman" w:cs="Times New Roman"/>
-          <w:kern w:val="0"/>
-          <w:lang w:eastAsia="en-GB"/>
-          <w14:ligatures w14:val="none"/>
-        </w:rPr>
-        <w:t>)</w:t>
-      </w:r>
-    </w:p>
-    <w:p>
-      <w:pPr>
-        <w:numPr>
-          <w:ilvl w:val="0"/>
-          <w:numId w:val="17"/>
-        </w:numPr>
-        <w:spacing w:before="100" w:beforeAutospacing="1" w:after="100" w:afterAutospacing="1"/>
-        <w:rPr>
-          <w:rFonts w:ascii="Times New Roman" w:eastAsia="Times New Roman" w:hAnsi="Times New Roman" w:cs="Times New Roman"/>
-          <w:kern w:val="0"/>
-          <w:lang w:eastAsia="en-GB"/>
-          <w14:ligatures w14:val="none"/>
-        </w:rPr>
-      </w:pPr>
-      <w:r>
-        <w:rPr>
-          <w:rFonts w:ascii="Times New Roman" w:eastAsia="Times New Roman" w:hAnsi="Times New Roman" w:cs="Times New Roman"/>
-          <w:kern w:val="0"/>
-          <w:lang w:eastAsia="en-GB"/>
-          <w14:ligatures w14:val="none"/>
-        </w:rPr>
-        <w:t>Farmer Phone / Farmer ID (</w:t>
-      </w:r>
-      <w:proofErr w:type="spellStart"/>
-      <w:r>
-        <w:rPr>
-          <w:rFonts w:ascii="Times New Roman" w:eastAsia="Times New Roman" w:hAnsi="Times New Roman" w:cs="Times New Roman"/>
-          <w:kern w:val="0"/>
-          <w:lang w:eastAsia="en-GB"/>
-          <w14:ligatures w14:val="none"/>
-        </w:rPr>
-        <w:t>fPhone</w:t>
-      </w:r>
-      <w:proofErr w:type="spellEnd"/>
-      <w:r>
-        <w:rPr>
-          <w:rFonts w:ascii="Times New Roman" w:eastAsia="Times New Roman" w:hAnsi="Times New Roman" w:cs="Times New Roman"/>
-          <w:kern w:val="0"/>
-          <w:lang w:eastAsia="en-GB"/>
-          <w14:ligatures w14:val="none"/>
-        </w:rPr>
-        <w:t>/</w:t>
-      </w:r>
-      <w:proofErr w:type="spellStart"/>
-      <w:r>
-        <w:rPr>
-          <w:rFonts w:ascii="Times New Roman" w:eastAsia="Times New Roman" w:hAnsi="Times New Roman" w:cs="Times New Roman"/>
-          <w:kern w:val="0"/>
-          <w:lang w:eastAsia="en-GB"/>
-          <w14:ligatures w14:val="none"/>
-        </w:rPr>
-        <w:t>fID</w:t>
-      </w:r>
-      <w:proofErr w:type="spellEnd"/>
-      <w:r>
-        <w:rPr>
-          <w:rFonts w:ascii="Times New Roman" w:eastAsia="Times New Roman" w:hAnsi="Times New Roman" w:cs="Times New Roman"/>
-          <w:kern w:val="0"/>
-          <w:lang w:eastAsia="en-GB"/>
-          <w14:ligatures w14:val="none"/>
-        </w:rPr>
-        <w:t>)</w:t>
-      </w:r>
-    </w:p>
-    <w:p>
-      <w:pPr>
-        <w:numPr>
-          <w:ilvl w:val="0"/>
-          <w:numId w:val="17"/>
-        </w:numPr>
-        <w:spacing w:before="100" w:beforeAutospacing="1" w:after="100" w:afterAutospacing="1"/>
-        <w:rPr>
-          <w:rFonts w:ascii="Times New Roman" w:eastAsia="Times New Roman" w:hAnsi="Times New Roman" w:cs="Times New Roman"/>
-          <w:kern w:val="0"/>
-          <w:lang w:eastAsia="en-GB"/>
-          <w14:ligatures w14:val="none"/>
-        </w:rPr>
-      </w:pPr>
-      <w:r>
-        <w:rPr>
-          <w:rFonts w:ascii="Times New Roman" w:eastAsia="Times New Roman" w:hAnsi="Times New Roman" w:cs="Times New Roman"/>
-          <w:kern w:val="0"/>
-          <w:lang w:eastAsia="en-GB"/>
-          <w14:ligatures w14:val="none"/>
-        </w:rPr>
-        <w:t>Type of Herb (dropdown, standardized)</w:t>
-      </w:r>
-    </w:p>
-    <w:p>
-      <w:pPr>
-        <w:numPr>
-          <w:ilvl w:val="0"/>
-          <w:numId w:val="17"/>
-        </w:numPr>
-        <w:spacing w:before="100" w:beforeAutospacing="1" w:after="100" w:afterAutospacing="1"/>
-        <w:rPr>
-          <w:rFonts w:ascii="Times New Roman" w:eastAsia="Times New Roman" w:hAnsi="Times New Roman" w:cs="Times New Roman"/>
-          <w:kern w:val="0"/>
-          <w:lang w:eastAsia="en-GB"/>
-          <w14:ligatures w14:val="none"/>
-        </w:rPr>
-      </w:pPr>
-      <w:r>
-        <w:rPr>
-          <w:rFonts w:ascii="Times New Roman" w:eastAsia="Times New Roman" w:hAnsi="Times New Roman" w:cs="Times New Roman"/>
-          <w:kern w:val="0"/>
-          <w:lang w:eastAsia="en-GB"/>
-          <w14:ligatures w14:val="none"/>
-        </w:rPr>
-        <w:t>Scientific Name (linked automatically)</w:t>
-      </w:r>
-    </w:p>
-    <w:p>
-      <w:pPr>
-        <w:numPr>
-          <w:ilvl w:val="0"/>
-          <w:numId w:val="17"/>
-        </w:numPr>
-        <w:spacing w:before="100" w:beforeAutospacing="1" w:after="100" w:afterAutospacing="1"/>
-        <w:rPr>
-          <w:rFonts w:ascii="Times New Roman" w:eastAsia="Times New Roman" w:hAnsi="Times New Roman" w:cs="Times New Roman"/>
-          <w:kern w:val="0"/>
-          <w:lang w:eastAsia="en-GB"/>
-          <w14:ligatures w14:val="none"/>
-        </w:rPr>
-      </w:pPr>
-      <w:r>
-        <w:rPr>
-          <w:rFonts w:ascii="Times New Roman" w:eastAsia="Times New Roman" w:hAnsi="Times New Roman" w:cs="Times New Roman"/>
-          <w:kern w:val="0"/>
-          <w:lang w:eastAsia="en-GB"/>
-          <w14:ligatures w14:val="none"/>
-        </w:rPr>
-        <w:t>Quantity (kg)</w:t>
-      </w:r>
-    </w:p>
-    <w:p>
-      <w:pPr>
-        <w:numPr>
-          <w:ilvl w:val="0"/>
-          <w:numId w:val="17"/>
-        </w:numPr>
-        <w:spacing w:before="100" w:beforeAutospacing="1" w:after="100" w:afterAutospacing="1"/>
-        <w:rPr>
-          <w:rFonts w:ascii="Times New Roman" w:eastAsia="Times New Roman" w:hAnsi="Times New Roman" w:cs="Times New Roman"/>
-          <w:kern w:val="0"/>
-          <w:lang w:eastAsia="en-GB"/>
-          <w14:ligatures w14:val="none"/>
-        </w:rPr>
-      </w:pPr>
-      <w:r>
-        <w:rPr>
-          <w:rFonts w:ascii="Times New Roman" w:eastAsia="Times New Roman" w:hAnsi="Times New Roman" w:cs="Times New Roman"/>
-          <w:kern w:val="0"/>
-          <w:lang w:eastAsia="en-GB"/>
-          <w14:ligatures w14:val="none"/>
-        </w:rPr>
-        <w:t>Location (GPS auto)</w:t>
-      </w:r>
-    </w:p>
-    <w:p>
-      <w:pPr>
-        <w:numPr>
-          <w:ilvl w:val="0"/>
-          <w:numId w:val="17"/>
-        </w:numPr>
-        <w:spacing w:before="100" w:beforeAutospacing="1" w:after="100" w:afterAutospacing="1"/>
-        <w:rPr>
-          <w:rFonts w:ascii="Times New Roman" w:eastAsia="Times New Roman" w:hAnsi="Times New Roman" w:cs="Times New Roman"/>
-          <w:kern w:val="0"/>
-          <w:lang w:eastAsia="en-GB"/>
-          <w14:ligatures w14:val="none"/>
-        </w:rPr>
-      </w:pPr>
-      <w:r>
-        <w:rPr>
-          <w:rFonts w:ascii="Times New Roman" w:eastAsia="Times New Roman" w:hAnsi="Times New Roman" w:cs="Times New Roman"/>
-          <w:kern w:val="0"/>
-          <w:lang w:eastAsia="en-GB"/>
-          <w14:ligatures w14:val="none"/>
-        </w:rPr>
-        <w:t>Accuracy (GPS auto)</w:t>
-      </w:r>
-    </w:p>
-    <w:p>
-      <w:pPr>
-        <w:numPr>
-          <w:ilvl w:val="0"/>
-          <w:numId w:val="17"/>
-        </w:numPr>
-        <w:spacing w:before="100" w:beforeAutospacing="1" w:after="100" w:afterAutospacing="1"/>
-        <w:rPr>
-          <w:rFonts w:ascii="Times New Roman" w:eastAsia="Times New Roman" w:hAnsi="Times New Roman" w:cs="Times New Roman"/>
-          <w:kern w:val="0"/>
-          <w:lang w:eastAsia="en-GB"/>
-          <w14:ligatures w14:val="none"/>
-        </w:rPr>
-      </w:pPr>
-      <w:r>
-        <w:rPr>
-          <w:rFonts w:ascii="Times New Roman" w:eastAsia="Times New Roman" w:hAnsi="Times New Roman" w:cs="Times New Roman"/>
-          <w:kern w:val="0"/>
-          <w:lang w:eastAsia="en-GB"/>
-          <w14:ligatures w14:val="none"/>
-        </w:rPr>
-        <w:t>Timestamp (auto)</w:t>
-      </w:r>
-    </w:p>
-    <w:p>
-      <w:pPr>
-        <w:numPr>
-          <w:ilvl w:val="0"/>
-          <w:numId w:val="17"/>
-        </w:numPr>
-        <w:spacing w:before="100" w:beforeAutospacing="1" w:after="100" w:afterAutospacing="1"/>
-        <w:rPr>
-          <w:rFonts w:ascii="Times New Roman" w:eastAsia="Times New Roman" w:hAnsi="Times New Roman" w:cs="Times New Roman"/>
-          <w:kern w:val="0"/>
-          <w:lang w:eastAsia="en-GB"/>
-          <w14:ligatures w14:val="none"/>
-        </w:rPr>
-      </w:pPr>
-      <w:r>
-        <w:rPr>
-          <w:rFonts w:ascii="Times New Roman" w:eastAsia="Times New Roman" w:hAnsi="Times New Roman" w:cs="Times New Roman"/>
-          <w:kern w:val="0"/>
-          <w:lang w:eastAsia="en-GB"/>
-          <w14:ligatures w14:val="none"/>
-        </w:rPr>
-        <w:t>Photos (plant, field, harvest proof)</w:t>
-      </w:r>
-    </w:p>
-    <w:p>
-      <w:pPr>
-        <w:numPr>
-          <w:ilvl w:val="0"/>
-          <w:numId w:val="17"/>
-        </w:numPr>
-        <w:spacing w:before="100" w:beforeAutospacing="1" w:after="100" w:afterAutospacing="1"/>
-        <w:rPr>
-          <w:rFonts w:ascii="Times New Roman" w:eastAsia="Times New Roman" w:hAnsi="Times New Roman" w:cs="Times New Roman"/>
-          <w:kern w:val="0"/>
-          <w:lang w:eastAsia="en-GB"/>
-          <w14:ligatures w14:val="none"/>
-        </w:rPr>
-      </w:pPr>
-      <w:r>
-        <w:rPr>
-          <w:rFonts w:ascii="Times New Roman" w:eastAsia="Times New Roman" w:hAnsi="Times New Roman" w:cs="Times New Roman"/>
-          <w:kern w:val="0"/>
-          <w:lang w:eastAsia="en-GB"/>
-          <w14:ligatures w14:val="none"/>
-        </w:rPr>
-        <w:t>District (auto from GPS)</w:t>
-      </w:r>
-    </w:p>
-    <w:p>
-      <w:pPr>
-        <w:numPr>
-          <w:ilvl w:val="0"/>
-          <w:numId w:val="17"/>
-        </w:numPr>
-        <w:spacing w:before="100" w:beforeAutospacing="1" w:after="100" w:afterAutospacing="1"/>
-        <w:rPr>
-          <w:rFonts w:ascii="Times New Roman" w:eastAsia="Times New Roman" w:hAnsi="Times New Roman" w:cs="Times New Roman"/>
-          <w:kern w:val="0"/>
-          <w:lang w:eastAsia="en-GB"/>
-          <w14:ligatures w14:val="none"/>
-        </w:rPr>
-      </w:pPr>
-      <w:r>
-        <w:rPr>
-          <w:rFonts w:ascii="Times New Roman" w:eastAsia="Times New Roman" w:hAnsi="Times New Roman" w:cs="Times New Roman"/>
-          <w:kern w:val="0"/>
-          <w:lang w:eastAsia="en-GB"/>
-          <w14:ligatures w14:val="none"/>
-        </w:rPr>
-        <w:t>Harvest Method (manual/mechanical – optional)</w:t>
-      </w:r>
-    </w:p>
-    <w:p>
-      <w:pPr>
-        <w:rPr>
-          <w:rFonts w:ascii="Times New Roman" w:eastAsia="Times New Roman" w:hAnsi="Times New Roman" w:cs="Times New Roman"/>
-          <w:kern w:val="0"/>
-          <w:lang w:eastAsia="en-GB"/>
-          <w14:ligatures w14:val="none"/>
-        </w:rPr>
-      </w:pPr>
-      <w:r>
-        <w:rPr>
-          <w:rFonts w:ascii="Times New Roman" w:eastAsia="Times New Roman" w:hAnsi="Times New Roman" w:cs="Times New Roman"/>
-          <w:noProof/>
-          <w:kern w:val="0"/>
-          <w:lang w:eastAsia="en-GB"/>
-        </w:rPr>
-        <w:pict w14:anchorId="06493233">
-          <v:rect id="_x0000_i1031" alt="" style="width:451.3pt;height:.05pt;mso-width-percent:0;mso-height-percent:0;mso-width-percent:0;mso-height-percent:0" o:hralign="center" o:hrstd="t" o:hr="t" fillcolor="#a0a0a0" stroked="f"/>
-        </w:pict>
-      </w:r>
-    </w:p>
-    <w:p>
-      <w:pPr>
-        <w:spacing w:before="100" w:beforeAutospacing="1" w:after="100" w:afterAutospacing="1"/>
-        <w:outlineLvl w:val="1"/>
-        <w:rPr>
-          <w:rFonts w:ascii="Times New Roman" w:eastAsia="Times New Roman" w:hAnsi="Times New Roman" w:cs="Times New Roman"/>
-          <w:b/>
-          <w:bCs/>
-          <w:kern w:val="0"/>
-          <w:sz w:val="36"/>
-          <w:szCs w:val="36"/>
-          <w:lang w:eastAsia="en-GB"/>
-          <w14:ligatures w14:val="none"/>
-        </w:rPr>
-      </w:pPr>
-      <w:r>
-        <w:rPr>
-          <w:rFonts w:ascii="Times New Roman" w:eastAsia="Times New Roman" w:hAnsi="Times New Roman" w:cs="Times New Roman"/>
-          <w:b/>
-          <w:bCs/>
-          <w:kern w:val="0"/>
-          <w:sz w:val="36"/>
-          <w:szCs w:val="36"/>
-          <w:lang w:eastAsia="en-GB"/>
-          <w14:ligatures w14:val="none"/>
-        </w:rPr>
-        <w:t>2. Wild Collectors (Forest / Natural Habitat Collection)</w:t>
-      </w:r>
-    </w:p>
-    <w:p>
-      <w:pPr>
-        <w:numPr>
-          <w:ilvl w:val="0"/>
-          <w:numId w:val="18"/>
-        </w:numPr>
-        <w:spacing w:before="100" w:beforeAutospacing="1" w:after="100" w:afterAutospacing="1"/>
-        <w:rPr>
-          <w:rFonts w:ascii="Times New Roman" w:eastAsia="Times New Roman" w:hAnsi="Times New Roman" w:cs="Times New Roman"/>
-          <w:kern w:val="0"/>
-          <w:lang w:eastAsia="en-GB"/>
-          <w14:ligatures w14:val="none"/>
-        </w:rPr>
-      </w:pPr>
-      <w:proofErr w:type="spellStart"/>
-      <w:r>
-        <w:rPr>
-          <w:rFonts w:ascii="Times New Roman" w:eastAsia="Times New Roman" w:hAnsi="Times New Roman" w:cs="Times New Roman"/>
-          <w:kern w:val="0"/>
-          <w:lang w:eastAsia="en-GB"/>
-          <w14:ligatures w14:val="none"/>
-        </w:rPr>
+        <w:t>for the table for data collection i have made two</w:t>
+      </w:r>
+      <w:r>
+        <w:rPr>
+          <w:rStyle w:val="apple-converted-space"/>
+          <w:rFonts w:eastAsiaTheme="majorEastAsia"/>
+        </w:rPr>
+        <w:t> </w:t>
+      </w:r>
+    </w:p>
+    <w:p>
+      <w:pPr>
+        <w:pStyle w:val="p1"/>
+      </w:pPr>
+      <w:r>
+        <w:t>farmer data_collection = FbatchID,fid,typeofherb,harvestedby , quantity,location,locationaccuracy,timestamp,district,photos</w:t>
+      </w:r>
+    </w:p>
+    <w:p>
+      <w:pPr>
+        <w:pStyle w:val="p1"/>
+      </w:pPr>
+      <w:r>
+        <w:t>processordata_collection = PbatchID,Pid , linked farmerBatchID,processing step,weightgivenby farmer,weightbeforeproc,weightafterprocessing,parameter,location,location accuracy , district , timestamp</w:t>
+      </w:r>
+      <w:r>
+        <w:rPr>
+          <w:rStyle w:val="apple-converted-space"/>
+          <w:rFonts w:eastAsiaTheme="majorEastAsia"/>
+        </w:rPr>
+        <w:t> </w:t>
+      </w:r>
+    </w:p>
+    <w:p>
+      <w:pPr>
+        <w:pStyle w:val="p2"/>
+      </w:pPr>
+    </w:p>
+    <w:p>
+      <w:pPr>
+        <w:pStyle w:val="p1"/>
+      </w:pPr>
+      <w:r>
+        <w:t>LabTesterData_Collection</w:t>
+      </w:r>
+    </w:p>
+    <w:p>
+      <w:pPr>
+        <w:pStyle w:val="p1"/>
+      </w:pPr>
+      <w:r>
+        <w:t>•</w:t>
+      </w:r>
+      <w:r>
+        <w:rPr>
+          <w:rStyle w:val="apple-tab-span"/>
+          <w:rFonts w:eastAsiaTheme="majorEastAsia"/>
+        </w:rPr>
+        <w:t xml:space="preserve"> </w:t>
+      </w:r>
+      <w:r>
+        <w:t>LbatchID (Primary Key, auto)</w:t>
+      </w:r>
+    </w:p>
+    <w:p>
+      <w:pPr>
+        <w:pStyle w:val="p1"/>
+      </w:pPr>
+      <w:r>
+        <w:t>•</w:t>
+      </w:r>
+      <w:r>
+        <w:rPr>
+          <w:rStyle w:val="apple-tab-span"/>
+          <w:rFonts w:eastAsiaTheme="majorEastAsia"/>
+        </w:rPr>
+        <w:t xml:space="preserve"> </w:t>
+      </w:r>
+      <w:r>
+        <w:t>LabID (who tested)</w:t>
+      </w:r>
+    </w:p>
+    <w:p>
+      <w:pPr>
+        <w:pStyle w:val="p1"/>
+      </w:pPr>
+      <w:r>
+        <w:t>•</w:t>
+      </w:r>
+      <w:r>
+        <w:rPr>
+          <w:rStyle w:val="apple-tab-span"/>
+          <w:rFonts w:eastAsiaTheme="majorEastAsia"/>
+        </w:rPr>
+        <w:t xml:space="preserve"> </w:t>
+      </w:r>
+      <w:r>
+        <w:t>LinkedBatchID ( processor)</w:t>
+      </w:r>
+    </w:p>
+    <w:p>
+      <w:pPr>
+        <w:pStyle w:val="p1"/>
+      </w:pPr>
+      <w:r>
         <w:lastRenderedPageBreak/>
-        <w:t>CollectorBatchID</w:t>
-      </w:r>
-      <w:proofErr w:type="spellEnd"/>
-      <w:r>
-        <w:rPr>
-          <w:rFonts w:ascii="Times New Roman" w:eastAsia="Times New Roman" w:hAnsi="Times New Roman" w:cs="Times New Roman"/>
-          <w:kern w:val="0"/>
-          <w:lang w:eastAsia="en-GB"/>
-          <w14:ligatures w14:val="none"/>
-        </w:rPr>
-        <w:t xml:space="preserve"> (auto)</w:t>
-      </w:r>
-    </w:p>
-    <w:p>
-      <w:pPr>
-        <w:numPr>
-          <w:ilvl w:val="0"/>
-          <w:numId w:val="18"/>
-        </w:numPr>
-        <w:spacing w:before="100" w:beforeAutospacing="1" w:after="100" w:afterAutospacing="1"/>
-        <w:rPr>
-          <w:rFonts w:ascii="Times New Roman" w:eastAsia="Times New Roman" w:hAnsi="Times New Roman" w:cs="Times New Roman"/>
-          <w:kern w:val="0"/>
-          <w:lang w:eastAsia="en-GB"/>
-          <w14:ligatures w14:val="none"/>
-        </w:rPr>
-      </w:pPr>
-      <w:r>
-        <w:rPr>
-          <w:rFonts w:ascii="Times New Roman" w:eastAsia="Times New Roman" w:hAnsi="Times New Roman" w:cs="Times New Roman"/>
-          <w:kern w:val="0"/>
-          <w:lang w:eastAsia="en-GB"/>
-          <w14:ligatures w14:val="none"/>
-        </w:rPr>
-        <w:t>Collector Name (</w:t>
-      </w:r>
-      <w:proofErr w:type="spellStart"/>
-      <w:r>
-        <w:rPr>
-          <w:rFonts w:ascii="Times New Roman" w:eastAsia="Times New Roman" w:hAnsi="Times New Roman" w:cs="Times New Roman"/>
-          <w:kern w:val="0"/>
-          <w:lang w:eastAsia="en-GB"/>
-          <w14:ligatures w14:val="none"/>
-        </w:rPr>
-        <w:t>cName</w:t>
-      </w:r>
-      <w:proofErr w:type="spellEnd"/>
-      <w:r>
-        <w:rPr>
-          <w:rFonts w:ascii="Times New Roman" w:eastAsia="Times New Roman" w:hAnsi="Times New Roman" w:cs="Times New Roman"/>
-          <w:kern w:val="0"/>
-          <w:lang w:eastAsia="en-GB"/>
-          <w14:ligatures w14:val="none"/>
-        </w:rPr>
-        <w:t>)</w:t>
-      </w:r>
-    </w:p>
-    <w:p>
-      <w:pPr>
-        <w:numPr>
-          <w:ilvl w:val="0"/>
-          <w:numId w:val="18"/>
-        </w:numPr>
-        <w:spacing w:before="100" w:beforeAutospacing="1" w:after="100" w:afterAutospacing="1"/>
-        <w:rPr>
-          <w:rFonts w:ascii="Times New Roman" w:eastAsia="Times New Roman" w:hAnsi="Times New Roman" w:cs="Times New Roman"/>
-          <w:kern w:val="0"/>
-          <w:lang w:eastAsia="en-GB"/>
-          <w14:ligatures w14:val="none"/>
-        </w:rPr>
-      </w:pPr>
-      <w:r>
-        <w:rPr>
-          <w:rFonts w:ascii="Times New Roman" w:eastAsia="Times New Roman" w:hAnsi="Times New Roman" w:cs="Times New Roman"/>
-          <w:kern w:val="0"/>
-          <w:lang w:eastAsia="en-GB"/>
-          <w14:ligatures w14:val="none"/>
-        </w:rPr>
-        <w:t>Collector ID / Permit No. (forest license or ID card)</w:t>
-      </w:r>
-    </w:p>
-    <w:p>
-      <w:pPr>
-        <w:numPr>
-          <w:ilvl w:val="0"/>
-          <w:numId w:val="18"/>
-        </w:numPr>
-        <w:spacing w:before="100" w:beforeAutospacing="1" w:after="100" w:afterAutospacing="1"/>
-        <w:rPr>
-          <w:rFonts w:ascii="Times New Roman" w:eastAsia="Times New Roman" w:hAnsi="Times New Roman" w:cs="Times New Roman"/>
-          <w:kern w:val="0"/>
-          <w:lang w:eastAsia="en-GB"/>
-          <w14:ligatures w14:val="none"/>
-        </w:rPr>
-      </w:pPr>
-      <w:r>
-        <w:rPr>
-          <w:rFonts w:ascii="Times New Roman" w:eastAsia="Times New Roman" w:hAnsi="Times New Roman" w:cs="Times New Roman"/>
-          <w:kern w:val="0"/>
-          <w:lang w:eastAsia="en-GB"/>
-          <w14:ligatures w14:val="none"/>
-        </w:rPr>
-        <w:t>Type of Herb (dropdown)</w:t>
-      </w:r>
-    </w:p>
-    <w:p>
-      <w:pPr>
-        <w:numPr>
-          <w:ilvl w:val="0"/>
-          <w:numId w:val="18"/>
-        </w:numPr>
-        <w:spacing w:before="100" w:beforeAutospacing="1" w:after="100" w:afterAutospacing="1"/>
-        <w:rPr>
-          <w:rFonts w:ascii="Times New Roman" w:eastAsia="Times New Roman" w:hAnsi="Times New Roman" w:cs="Times New Roman"/>
-          <w:kern w:val="0"/>
-          <w:lang w:eastAsia="en-GB"/>
-          <w14:ligatures w14:val="none"/>
-        </w:rPr>
-      </w:pPr>
-      <w:r>
-        <w:rPr>
-          <w:rFonts w:ascii="Times New Roman" w:eastAsia="Times New Roman" w:hAnsi="Times New Roman" w:cs="Times New Roman"/>
-          <w:kern w:val="0"/>
-          <w:lang w:eastAsia="en-GB"/>
-          <w14:ligatures w14:val="none"/>
-        </w:rPr>
-        <w:t>Scientific Name (auto linked)</w:t>
-      </w:r>
-    </w:p>
-    <w:p>
-      <w:pPr>
-        <w:numPr>
-          <w:ilvl w:val="0"/>
-          <w:numId w:val="18"/>
-        </w:numPr>
-        <w:spacing w:before="100" w:beforeAutospacing="1" w:after="100" w:afterAutospacing="1"/>
-        <w:rPr>
-          <w:rFonts w:ascii="Times New Roman" w:eastAsia="Times New Roman" w:hAnsi="Times New Roman" w:cs="Times New Roman"/>
-          <w:kern w:val="0"/>
-          <w:lang w:eastAsia="en-GB"/>
-          <w14:ligatures w14:val="none"/>
-        </w:rPr>
-      </w:pPr>
-      <w:r>
-        <w:rPr>
-          <w:rFonts w:ascii="Times New Roman" w:eastAsia="Times New Roman" w:hAnsi="Times New Roman" w:cs="Times New Roman"/>
-          <w:kern w:val="0"/>
-          <w:lang w:eastAsia="en-GB"/>
-          <w14:ligatures w14:val="none"/>
-        </w:rPr>
-        <w:t>Quantity (kg)</w:t>
-      </w:r>
-    </w:p>
-    <w:p>
-      <w:pPr>
-        <w:numPr>
-          <w:ilvl w:val="0"/>
-          <w:numId w:val="18"/>
-        </w:numPr>
-        <w:spacing w:before="100" w:beforeAutospacing="1" w:after="100" w:afterAutospacing="1"/>
-        <w:rPr>
-          <w:rFonts w:ascii="Times New Roman" w:eastAsia="Times New Roman" w:hAnsi="Times New Roman" w:cs="Times New Roman"/>
-          <w:kern w:val="0"/>
-          <w:lang w:eastAsia="en-GB"/>
-          <w14:ligatures w14:val="none"/>
-        </w:rPr>
-      </w:pPr>
-      <w:r>
-        <w:rPr>
-          <w:rFonts w:ascii="Times New Roman" w:eastAsia="Times New Roman" w:hAnsi="Times New Roman" w:cs="Times New Roman"/>
-          <w:kern w:val="0"/>
-          <w:lang w:eastAsia="en-GB"/>
-          <w14:ligatures w14:val="none"/>
-        </w:rPr>
-        <w:t>Location (GPS auto)</w:t>
-      </w:r>
-    </w:p>
-    <w:p>
-      <w:pPr>
-        <w:numPr>
-          <w:ilvl w:val="0"/>
-          <w:numId w:val="18"/>
-        </w:numPr>
-        <w:spacing w:before="100" w:beforeAutospacing="1" w:after="100" w:afterAutospacing="1"/>
-        <w:rPr>
-          <w:rFonts w:ascii="Times New Roman" w:eastAsia="Times New Roman" w:hAnsi="Times New Roman" w:cs="Times New Roman"/>
-          <w:kern w:val="0"/>
-          <w:lang w:eastAsia="en-GB"/>
-          <w14:ligatures w14:val="none"/>
-        </w:rPr>
-      </w:pPr>
-      <w:r>
-        <w:rPr>
-          <w:rFonts w:ascii="Times New Roman" w:eastAsia="Times New Roman" w:hAnsi="Times New Roman" w:cs="Times New Roman"/>
-          <w:kern w:val="0"/>
-          <w:lang w:eastAsia="en-GB"/>
-          <w14:ligatures w14:val="none"/>
-        </w:rPr>
-        <w:t>Accuracy (GPS auto)</w:t>
-      </w:r>
-    </w:p>
-    <w:p>
-      <w:pPr>
-        <w:numPr>
-          <w:ilvl w:val="0"/>
-          <w:numId w:val="18"/>
-        </w:numPr>
-        <w:spacing w:before="100" w:beforeAutospacing="1" w:after="100" w:afterAutospacing="1"/>
-        <w:rPr>
-          <w:rFonts w:ascii="Times New Roman" w:eastAsia="Times New Roman" w:hAnsi="Times New Roman" w:cs="Times New Roman"/>
-          <w:kern w:val="0"/>
-          <w:lang w:eastAsia="en-GB"/>
-          <w14:ligatures w14:val="none"/>
-        </w:rPr>
-      </w:pPr>
-      <w:r>
-        <w:rPr>
-          <w:rFonts w:ascii="Times New Roman" w:eastAsia="Times New Roman" w:hAnsi="Times New Roman" w:cs="Times New Roman"/>
-          <w:kern w:val="0"/>
-          <w:lang w:eastAsia="en-GB"/>
-          <w14:ligatures w14:val="none"/>
-        </w:rPr>
-        <w:t>Timestamp (auto)</w:t>
-      </w:r>
-    </w:p>
-    <w:p>
-      <w:pPr>
-        <w:numPr>
-          <w:ilvl w:val="0"/>
-          <w:numId w:val="18"/>
-        </w:numPr>
-        <w:spacing w:before="100" w:beforeAutospacing="1" w:after="100" w:afterAutospacing="1"/>
-        <w:rPr>
-          <w:rFonts w:ascii="Times New Roman" w:eastAsia="Times New Roman" w:hAnsi="Times New Roman" w:cs="Times New Roman"/>
-          <w:kern w:val="0"/>
-          <w:lang w:eastAsia="en-GB"/>
-          <w14:ligatures w14:val="none"/>
-        </w:rPr>
-      </w:pPr>
-      <w:r>
-        <w:rPr>
-          <w:rFonts w:ascii="Times New Roman" w:eastAsia="Times New Roman" w:hAnsi="Times New Roman" w:cs="Times New Roman"/>
-          <w:kern w:val="0"/>
-          <w:lang w:eastAsia="en-GB"/>
-          <w14:ligatures w14:val="none"/>
-        </w:rPr>
-        <w:t>Photos (plant, site)</w:t>
-      </w:r>
-    </w:p>
-    <w:p>
-      <w:pPr>
-        <w:numPr>
-          <w:ilvl w:val="0"/>
-          <w:numId w:val="18"/>
-        </w:numPr>
-        <w:spacing w:before="100" w:beforeAutospacing="1" w:after="100" w:afterAutospacing="1"/>
-        <w:rPr>
-          <w:rFonts w:ascii="Times New Roman" w:eastAsia="Times New Roman" w:hAnsi="Times New Roman" w:cs="Times New Roman"/>
-          <w:kern w:val="0"/>
-          <w:lang w:eastAsia="en-GB"/>
-          <w14:ligatures w14:val="none"/>
-        </w:rPr>
-      </w:pPr>
-      <w:r>
-        <w:rPr>
-          <w:rFonts w:ascii="Times New Roman" w:eastAsia="Times New Roman" w:hAnsi="Times New Roman" w:cs="Times New Roman"/>
-          <w:kern w:val="0"/>
-          <w:lang w:eastAsia="en-GB"/>
-          <w14:ligatures w14:val="none"/>
-        </w:rPr>
-        <w:t>Forest Division / Range (auto from GPS or manual select)</w:t>
-      </w:r>
-    </w:p>
-    <w:p>
-      <w:pPr>
-        <w:numPr>
-          <w:ilvl w:val="0"/>
-          <w:numId w:val="18"/>
-        </w:numPr>
-        <w:spacing w:before="100" w:beforeAutospacing="1" w:after="100" w:afterAutospacing="1"/>
-        <w:rPr>
-          <w:rFonts w:ascii="Times New Roman" w:eastAsia="Times New Roman" w:hAnsi="Times New Roman" w:cs="Times New Roman"/>
-          <w:kern w:val="0"/>
-          <w:lang w:eastAsia="en-GB"/>
-          <w14:ligatures w14:val="none"/>
-        </w:rPr>
-      </w:pPr>
-      <w:r>
-        <w:rPr>
-          <w:rFonts w:ascii="Times New Roman" w:eastAsia="Times New Roman" w:hAnsi="Times New Roman" w:cs="Times New Roman"/>
-          <w:kern w:val="0"/>
-          <w:lang w:eastAsia="en-GB"/>
-          <w14:ligatures w14:val="none"/>
-        </w:rPr>
-        <w:t>Sustainability Certificate / Permit Reference (if required)</w:t>
-      </w:r>
-    </w:p>
-    <w:p>
-      <w:pPr>
-        <w:rPr>
-          <w:rFonts w:ascii="Times New Roman" w:eastAsia="Times New Roman" w:hAnsi="Times New Roman" w:cs="Times New Roman"/>
-          <w:kern w:val="0"/>
-          <w:lang w:eastAsia="en-GB"/>
-          <w14:ligatures w14:val="none"/>
-        </w:rPr>
-      </w:pPr>
-      <w:r>
-        <w:rPr>
-          <w:rFonts w:ascii="Times New Roman" w:eastAsia="Times New Roman" w:hAnsi="Times New Roman" w:cs="Times New Roman"/>
-          <w:noProof/>
-          <w:kern w:val="0"/>
-          <w:lang w:eastAsia="en-GB"/>
-        </w:rPr>
-        <w:pict w14:anchorId="41177185">
-          <v:rect id="_x0000_i1030" alt="" style="width:451.3pt;height:.05pt;mso-width-percent:0;mso-height-percent:0;mso-width-percent:0;mso-height-percent:0" o:hralign="center" o:hrstd="t" o:hr="t" fillcolor="#a0a0a0" stroked="f"/>
-        </w:pict>
-      </w:r>
-    </w:p>
-    <w:p>
-      <w:pPr>
-        <w:spacing w:before="100" w:beforeAutospacing="1" w:after="100" w:afterAutospacing="1"/>
-        <w:outlineLvl w:val="1"/>
-        <w:rPr>
-          <w:rFonts w:ascii="Times New Roman" w:eastAsia="Times New Roman" w:hAnsi="Times New Roman" w:cs="Times New Roman"/>
-          <w:b/>
-          <w:bCs/>
-          <w:kern w:val="0"/>
-          <w:sz w:val="36"/>
-          <w:szCs w:val="36"/>
-          <w:lang w:eastAsia="en-GB"/>
-          <w14:ligatures w14:val="none"/>
-        </w:rPr>
-      </w:pPr>
-      <w:r>
-        <w:rPr>
-          <w:rFonts w:ascii="Times New Roman" w:eastAsia="Times New Roman" w:hAnsi="Times New Roman" w:cs="Times New Roman"/>
-          <w:b/>
-          <w:bCs/>
-          <w:kern w:val="0"/>
-          <w:sz w:val="36"/>
-          <w:szCs w:val="36"/>
-          <w:lang w:eastAsia="en-GB"/>
-          <w14:ligatures w14:val="none"/>
-        </w:rPr>
-        <w:t>3. Processing Facilities</w:t>
-      </w:r>
-    </w:p>
-    <w:p>
-      <w:pPr>
-        <w:numPr>
-          <w:ilvl w:val="0"/>
-          <w:numId w:val="19"/>
-        </w:numPr>
-        <w:spacing w:before="100" w:beforeAutospacing="1" w:after="100" w:afterAutospacing="1"/>
-        <w:rPr>
-          <w:rFonts w:ascii="Times New Roman" w:eastAsia="Times New Roman" w:hAnsi="Times New Roman" w:cs="Times New Roman"/>
-          <w:kern w:val="0"/>
-          <w:lang w:eastAsia="en-GB"/>
-          <w14:ligatures w14:val="none"/>
-        </w:rPr>
-      </w:pPr>
-      <w:proofErr w:type="spellStart"/>
-      <w:r>
-        <w:rPr>
-          <w:rFonts w:ascii="Times New Roman" w:eastAsia="Times New Roman" w:hAnsi="Times New Roman" w:cs="Times New Roman"/>
-          <w:kern w:val="0"/>
-          <w:lang w:eastAsia="en-GB"/>
-          <w14:ligatures w14:val="none"/>
-        </w:rPr>
-        <w:t>ProcessingBatchID</w:t>
-      </w:r>
-      <w:proofErr w:type="spellEnd"/>
-      <w:r>
-        <w:rPr>
-          <w:rFonts w:ascii="Times New Roman" w:eastAsia="Times New Roman" w:hAnsi="Times New Roman" w:cs="Times New Roman"/>
-          <w:kern w:val="0"/>
-          <w:lang w:eastAsia="en-GB"/>
-          <w14:ligatures w14:val="none"/>
-        </w:rPr>
-        <w:t xml:space="preserve"> (auto)</w:t>
-      </w:r>
-    </w:p>
-    <w:p>
-      <w:pPr>
-        <w:numPr>
-          <w:ilvl w:val="0"/>
-          <w:numId w:val="19"/>
-        </w:numPr>
-        <w:spacing w:before="100" w:beforeAutospacing="1" w:after="100" w:afterAutospacing="1"/>
-        <w:rPr>
-          <w:rFonts w:ascii="Times New Roman" w:eastAsia="Times New Roman" w:hAnsi="Times New Roman" w:cs="Times New Roman"/>
-          <w:kern w:val="0"/>
-          <w:lang w:eastAsia="en-GB"/>
-          <w14:ligatures w14:val="none"/>
-        </w:rPr>
-      </w:pPr>
-      <w:r>
-        <w:rPr>
-          <w:rFonts w:ascii="Times New Roman" w:eastAsia="Times New Roman" w:hAnsi="Times New Roman" w:cs="Times New Roman"/>
-          <w:kern w:val="0"/>
-          <w:lang w:eastAsia="en-GB"/>
-          <w14:ligatures w14:val="none"/>
-        </w:rPr>
-        <w:t>Linked Collection Batch IDs (farmer/collector input batches)</w:t>
-      </w:r>
-    </w:p>
-    <w:p>
-      <w:pPr>
-        <w:numPr>
-          <w:ilvl w:val="0"/>
-          <w:numId w:val="19"/>
-        </w:numPr>
-        <w:spacing w:before="100" w:beforeAutospacing="1" w:after="100" w:afterAutospacing="1"/>
-        <w:rPr>
-          <w:rFonts w:ascii="Times New Roman" w:eastAsia="Times New Roman" w:hAnsi="Times New Roman" w:cs="Times New Roman"/>
-          <w:kern w:val="0"/>
-          <w:lang w:eastAsia="en-GB"/>
-          <w14:ligatures w14:val="none"/>
-        </w:rPr>
-      </w:pPr>
-      <w:r>
-        <w:rPr>
-          <w:rFonts w:ascii="Times New Roman" w:eastAsia="Times New Roman" w:hAnsi="Times New Roman" w:cs="Times New Roman"/>
-          <w:kern w:val="0"/>
-          <w:lang w:eastAsia="en-GB"/>
-          <w14:ligatures w14:val="none"/>
-        </w:rPr>
-        <w:t>Processing Step (drying, grinding, extraction, storage, etc.)</w:t>
-      </w:r>
-    </w:p>
-    <w:p>
-      <w:pPr>
-        <w:numPr>
-          <w:ilvl w:val="0"/>
-          <w:numId w:val="19"/>
-        </w:numPr>
-        <w:spacing w:before="100" w:beforeAutospacing="1" w:after="100" w:afterAutospacing="1"/>
-        <w:rPr>
-          <w:rFonts w:ascii="Times New Roman" w:eastAsia="Times New Roman" w:hAnsi="Times New Roman" w:cs="Times New Roman"/>
-          <w:kern w:val="0"/>
-          <w:lang w:eastAsia="en-GB"/>
-          <w14:ligatures w14:val="none"/>
-        </w:rPr>
-      </w:pPr>
-      <w:r>
-        <w:rPr>
-          <w:rFonts w:ascii="Times New Roman" w:eastAsia="Times New Roman" w:hAnsi="Times New Roman" w:cs="Times New Roman"/>
-          <w:kern w:val="0"/>
-          <w:lang w:eastAsia="en-GB"/>
-          <w14:ligatures w14:val="none"/>
-        </w:rPr>
-        <w:t>Parameters (e.g., drying temp, time, humidity)</w:t>
-      </w:r>
-    </w:p>
-    <w:p>
-      <w:pPr>
-        <w:numPr>
-          <w:ilvl w:val="0"/>
-          <w:numId w:val="19"/>
-        </w:numPr>
-        <w:spacing w:before="100" w:beforeAutospacing="1" w:after="100" w:afterAutospacing="1"/>
-        <w:rPr>
-          <w:rFonts w:ascii="Times New Roman" w:eastAsia="Times New Roman" w:hAnsi="Times New Roman" w:cs="Times New Roman"/>
-          <w:kern w:val="0"/>
-          <w:lang w:eastAsia="en-GB"/>
-          <w14:ligatures w14:val="none"/>
-        </w:rPr>
-      </w:pPr>
-      <w:r>
-        <w:rPr>
-          <w:rFonts w:ascii="Times New Roman" w:eastAsia="Times New Roman" w:hAnsi="Times New Roman" w:cs="Times New Roman"/>
-          <w:kern w:val="0"/>
-          <w:lang w:eastAsia="en-GB"/>
-          <w14:ligatures w14:val="none"/>
-        </w:rPr>
-        <w:t>Facility ID / License No.</w:t>
-      </w:r>
-    </w:p>
-    <w:p>
-      <w:pPr>
-        <w:numPr>
-          <w:ilvl w:val="0"/>
-          <w:numId w:val="19"/>
-        </w:numPr>
-        <w:spacing w:before="100" w:beforeAutospacing="1" w:after="100" w:afterAutospacing="1"/>
-        <w:rPr>
-          <w:rFonts w:ascii="Times New Roman" w:eastAsia="Times New Roman" w:hAnsi="Times New Roman" w:cs="Times New Roman"/>
-          <w:kern w:val="0"/>
-          <w:lang w:eastAsia="en-GB"/>
-          <w14:ligatures w14:val="none"/>
-        </w:rPr>
-      </w:pPr>
-      <w:r>
-        <w:rPr>
-          <w:rFonts w:ascii="Times New Roman" w:eastAsia="Times New Roman" w:hAnsi="Times New Roman" w:cs="Times New Roman"/>
-          <w:kern w:val="0"/>
-          <w:lang w:eastAsia="en-GB"/>
-          <w14:ligatures w14:val="none"/>
-        </w:rPr>
+        <w:t>•</w:t>
+      </w:r>
+      <w:r>
+        <w:rPr>
+          <w:rStyle w:val="apple-tab-span"/>
+          <w:rFonts w:eastAsiaTheme="majorEastAsia"/>
+        </w:rPr>
+        <w:t xml:space="preserve"> </w:t>
+      </w:r>
+      <w:r>
+        <w:t>TestType (Moisture, Pesticide, DNA, etc.)</w:t>
+      </w:r>
+    </w:p>
+    <w:p>
+      <w:pPr>
+        <w:pStyle w:val="p1"/>
+      </w:pPr>
+      <w:r>
+        <w:t>•</w:t>
+      </w:r>
+      <w:r>
+        <w:rPr>
+          <w:rStyle w:val="apple-tab-span"/>
+          <w:rFonts w:eastAsiaTheme="majorEastAsia"/>
+        </w:rPr>
+        <w:t xml:space="preserve"> </w:t>
+      </w:r>
+      <w:r>
+        <w:t>TestResults (TEXT → JSON or plain text report)</w:t>
+      </w:r>
+    </w:p>
+    <w:p>
+      <w:pPr>
+        <w:pStyle w:val="p1"/>
+      </w:pPr>
+      <w:r>
+        <w:t>•</w:t>
+      </w:r>
+      <w:r>
+        <w:rPr>
+          <w:rStyle w:val="apple-tab-span"/>
+          <w:rFonts w:eastAsiaTheme="majorEastAsia"/>
+        </w:rPr>
+        <w:t xml:space="preserve"> </w:t>
+      </w:r>
+      <w:r>
+        <w:t>PassFailStatus (enum: Pass / Fail / Pending)</w:t>
+      </w:r>
+    </w:p>
+    <w:p>
+      <w:pPr>
+        <w:pStyle w:val="p1"/>
+      </w:pPr>
+      <w:r>
+        <w:t>•</w:t>
+      </w:r>
+      <w:r>
+        <w:rPr>
+          <w:rStyle w:val="apple-tab-span"/>
+          <w:rFonts w:eastAsiaTheme="majorEastAsia"/>
+        </w:rPr>
+        <w:t xml:space="preserve"> </w:t>
+      </w:r>
+      <w:r>
+        <w:t>CertificateFile (path or link to PDF/image)</w:t>
+      </w:r>
+    </w:p>
+    <w:p>
+      <w:pPr>
+        <w:pStyle w:val="p1"/>
+      </w:pPr>
+      <w:r>
+        <w:t>•</w:t>
+      </w:r>
+      <w:r>
+        <w:rPr>
+          <w:rStyle w:val="apple-tab-span"/>
+          <w:rFonts w:eastAsiaTheme="majorEastAsia"/>
+        </w:rPr>
+        <w:t xml:space="preserve"> </w:t>
+      </w:r>
+      <w:r>
         <w:t>Location (GPS optional)</w:t>
       </w:r>
     </w:p>
     <w:p>
       <w:pPr>
-        <w:numPr>
-          <w:ilvl w:val="0"/>
-          <w:numId w:val="19"/>
-        </w:numPr>
-        <w:spacing w:before="100" w:beforeAutospacing="1" w:after="100" w:afterAutospacing="1"/>
-        <w:rPr>
-          <w:rFonts w:ascii="Times New Roman" w:eastAsia="Times New Roman" w:hAnsi="Times New Roman" w:cs="Times New Roman"/>
-          <w:kern w:val="0"/>
-          <w:lang w:eastAsia="en-GB"/>
-          <w14:ligatures w14:val="none"/>
-        </w:rPr>
-      </w:pPr>
-      <w:r>
-        <w:rPr>
-          <w:rFonts w:ascii="Times New Roman" w:eastAsia="Times New Roman" w:hAnsi="Times New Roman" w:cs="Times New Roman"/>
-          <w:kern w:val="0"/>
-          <w:lang w:eastAsia="en-GB"/>
-          <w14:ligatures w14:val="none"/>
-        </w:rPr>
-        <w:t>Timestamp (auto)</w:t>
-      </w:r>
-    </w:p>
-    <w:p>
-      <w:pPr>
-        <w:numPr>
-          <w:ilvl w:val="0"/>
-          <w:numId w:val="19"/>
-        </w:numPr>
-        <w:spacing w:before="100" w:beforeAutospacing="1" w:after="100" w:afterAutospacing="1"/>
-        <w:rPr>
-          <w:rFonts w:ascii="Times New Roman" w:eastAsia="Times New Roman" w:hAnsi="Times New Roman" w:cs="Times New Roman"/>
-          <w:kern w:val="0"/>
-          <w:lang w:eastAsia="en-GB"/>
-          <w14:ligatures w14:val="none"/>
-        </w:rPr>
-      </w:pPr>
-      <w:r>
-        <w:rPr>
-          <w:rFonts w:ascii="Times New Roman" w:eastAsia="Times New Roman" w:hAnsi="Times New Roman" w:cs="Times New Roman"/>
-          <w:kern w:val="0"/>
-          <w:lang w:eastAsia="en-GB"/>
-          <w14:ligatures w14:val="none"/>
-        </w:rPr>
-        <w:t>Photos (optional: facility, processed material)</w:t>
-      </w:r>
-    </w:p>
-    <w:p>
-      <w:pPr>
-        <w:rPr>
-          <w:rFonts w:ascii="Times New Roman" w:eastAsia="Times New Roman" w:hAnsi="Times New Roman" w:cs="Times New Roman"/>
-          <w:kern w:val="0"/>
-          <w:lang w:eastAsia="en-GB"/>
-          <w14:ligatures w14:val="none"/>
-        </w:rPr>
-      </w:pPr>
-      <w:r>
-        <w:rPr>
-          <w:rFonts w:ascii="Times New Roman" w:eastAsia="Times New Roman" w:hAnsi="Times New Roman" w:cs="Times New Roman"/>
-          <w:noProof/>
-          <w:kern w:val="0"/>
-          <w:lang w:eastAsia="en-GB"/>
-        </w:rPr>
-        <w:pict w14:anchorId="3B6ACE7D">
-          <v:rect id="_x0000_i1029" alt="" style="width:451.3pt;height:.05pt;mso-width-percent:0;mso-height-percent:0;mso-width-percent:0;mso-height-percent:0" o:hralign="center" o:hrstd="t" o:hr="t" fillcolor="#a0a0a0" stroked="f"/>
-        </w:pict>
-      </w:r>
-    </w:p>
-    <w:p>
-      <w:pPr>
-        <w:spacing w:before="100" w:beforeAutospacing="1" w:after="100" w:afterAutospacing="1"/>
-        <w:outlineLvl w:val="1"/>
-        <w:rPr>
-          <w:rFonts w:ascii="Times New Roman" w:eastAsia="Times New Roman" w:hAnsi="Times New Roman" w:cs="Times New Roman"/>
-          <w:b/>
-          <w:bCs/>
-          <w:kern w:val="0"/>
-          <w:sz w:val="36"/>
-          <w:szCs w:val="36"/>
-          <w:lang w:eastAsia="en-GB"/>
-          <w14:ligatures w14:val="none"/>
-        </w:rPr>
-      </w:pPr>
-      <w:r>
-        <w:rPr>
-          <w:rFonts w:ascii="Times New Roman" w:eastAsia="Times New Roman" w:hAnsi="Times New Roman" w:cs="Times New Roman"/>
-          <w:b/>
-          <w:bCs/>
-          <w:kern w:val="0"/>
-          <w:sz w:val="36"/>
-          <w:szCs w:val="36"/>
-          <w:lang w:eastAsia="en-GB"/>
-          <w14:ligatures w14:val="none"/>
-        </w:rPr>
-        <w:t>4. Testing Laboratories</w:t>
-      </w:r>
-    </w:p>
-    <w:p>
-      <w:pPr>
-        <w:numPr>
-          <w:ilvl w:val="0"/>
-          <w:numId w:val="20"/>
-        </w:numPr>
-        <w:spacing w:before="100" w:beforeAutospacing="1" w:after="100" w:afterAutospacing="1"/>
-        <w:rPr>
-          <w:rFonts w:ascii="Times New Roman" w:eastAsia="Times New Roman" w:hAnsi="Times New Roman" w:cs="Times New Roman"/>
-          <w:kern w:val="0"/>
-          <w:lang w:eastAsia="en-GB"/>
-          <w14:ligatures w14:val="none"/>
-        </w:rPr>
-      </w:pPr>
-      <w:proofErr w:type="spellStart"/>
-      <w:r>
-        <w:rPr>
-          <w:rFonts w:ascii="Times New Roman" w:eastAsia="Times New Roman" w:hAnsi="Times New Roman" w:cs="Times New Roman"/>
-          <w:kern w:val="0"/>
-          <w:lang w:eastAsia="en-GB"/>
-          <w14:ligatures w14:val="none"/>
-        </w:rPr>
-        <w:t>TestBatchID</w:t>
-      </w:r>
-      <w:proofErr w:type="spellEnd"/>
-      <w:r>
-        <w:rPr>
-          <w:rFonts w:ascii="Times New Roman" w:eastAsia="Times New Roman" w:hAnsi="Times New Roman" w:cs="Times New Roman"/>
-          <w:kern w:val="0"/>
-          <w:lang w:eastAsia="en-GB"/>
-          <w14:ligatures w14:val="none"/>
-        </w:rPr>
-        <w:t xml:space="preserve"> (auto)</w:t>
-      </w:r>
-    </w:p>
-    <w:p>
-      <w:pPr>
-        <w:numPr>
-          <w:ilvl w:val="0"/>
-          <w:numId w:val="20"/>
-        </w:numPr>
-        <w:spacing w:before="100" w:beforeAutospacing="1" w:after="100" w:afterAutospacing="1"/>
-        <w:rPr>
-          <w:rFonts w:ascii="Times New Roman" w:eastAsia="Times New Roman" w:hAnsi="Times New Roman" w:cs="Times New Roman"/>
-          <w:kern w:val="0"/>
-          <w:lang w:eastAsia="en-GB"/>
-          <w14:ligatures w14:val="none"/>
-        </w:rPr>
-      </w:pPr>
-      <w:r>
-        <w:rPr>
-          <w:rFonts w:ascii="Times New Roman" w:eastAsia="Times New Roman" w:hAnsi="Times New Roman" w:cs="Times New Roman"/>
-          <w:kern w:val="0"/>
-          <w:lang w:eastAsia="en-GB"/>
-          <w14:ligatures w14:val="none"/>
-        </w:rPr>
-        <w:t>Linked Batch ID (from farmer/collector/processor)</w:t>
-      </w:r>
-    </w:p>
-    <w:p>
-      <w:pPr>
-        <w:numPr>
-          <w:ilvl w:val="0"/>
-          <w:numId w:val="20"/>
-        </w:numPr>
-        <w:spacing w:before="100" w:beforeAutospacing="1" w:after="100" w:afterAutospacing="1"/>
-        <w:rPr>
-          <w:rFonts w:ascii="Times New Roman" w:eastAsia="Times New Roman" w:hAnsi="Times New Roman" w:cs="Times New Roman"/>
-          <w:kern w:val="0"/>
-          <w:lang w:eastAsia="en-GB"/>
-          <w14:ligatures w14:val="none"/>
-        </w:rPr>
-      </w:pPr>
-      <w:r>
-        <w:rPr>
-          <w:rFonts w:ascii="Times New Roman" w:eastAsia="Times New Roman" w:hAnsi="Times New Roman" w:cs="Times New Roman"/>
-          <w:kern w:val="0"/>
-          <w:lang w:eastAsia="en-GB"/>
-          <w14:ligatures w14:val="none"/>
-        </w:rPr>
-        <w:t>Lab ID / Accreditation No.</w:t>
-      </w:r>
-    </w:p>
-    <w:p>
-      <w:pPr>
-        <w:numPr>
-          <w:ilvl w:val="0"/>
-          <w:numId w:val="20"/>
-        </w:numPr>
-        <w:spacing w:before="100" w:beforeAutospacing="1" w:after="100" w:afterAutospacing="1"/>
-        <w:rPr>
-          <w:rFonts w:ascii="Times New Roman" w:eastAsia="Times New Roman" w:hAnsi="Times New Roman" w:cs="Times New Roman"/>
-          <w:kern w:val="0"/>
-          <w:lang w:eastAsia="en-GB"/>
-          <w14:ligatures w14:val="none"/>
-        </w:rPr>
-      </w:pPr>
-      <w:r>
-        <w:rPr>
-          <w:rFonts w:ascii="Times New Roman" w:eastAsia="Times New Roman" w:hAnsi="Times New Roman" w:cs="Times New Roman"/>
-          <w:kern w:val="0"/>
-          <w:lang w:eastAsia="en-GB"/>
-          <w14:ligatures w14:val="none"/>
-        </w:rPr>
-        <w:t>Test Type (Moisture, Pesticide, DNA Barcoding, etc.)</w:t>
-      </w:r>
-    </w:p>
-    <w:p>
-      <w:pPr>
-        <w:numPr>
-          <w:ilvl w:val="0"/>
-          <w:numId w:val="20"/>
-        </w:numPr>
-        <w:spacing w:before="100" w:beforeAutospacing="1" w:after="100" w:afterAutospacing="1"/>
-        <w:rPr>
-          <w:rFonts w:ascii="Times New Roman" w:eastAsia="Times New Roman" w:hAnsi="Times New Roman" w:cs="Times New Roman"/>
-          <w:kern w:val="0"/>
-          <w:lang w:eastAsia="en-GB"/>
-          <w14:ligatures w14:val="none"/>
-        </w:rPr>
-      </w:pPr>
-      <w:r>
-        <w:rPr>
-          <w:rFonts w:ascii="Times New Roman" w:eastAsia="Times New Roman" w:hAnsi="Times New Roman" w:cs="Times New Roman"/>
-          <w:kern w:val="0"/>
-          <w:lang w:eastAsia="en-GB"/>
-          <w14:ligatures w14:val="none"/>
-        </w:rPr>
-        <w:t>Test Results (structured values + PDF certificate)</w:t>
-      </w:r>
-    </w:p>
-    <w:p>
-      <w:pPr>
-        <w:numPr>
-          <w:ilvl w:val="0"/>
-          <w:numId w:val="20"/>
-        </w:numPr>
-        <w:spacing w:before="100" w:beforeAutospacing="1" w:after="100" w:afterAutospacing="1"/>
-        <w:rPr>
-          <w:rFonts w:ascii="Times New Roman" w:eastAsia="Times New Roman" w:hAnsi="Times New Roman" w:cs="Times New Roman"/>
-          <w:kern w:val="0"/>
-          <w:lang w:eastAsia="en-GB"/>
-          <w14:ligatures w14:val="none"/>
-        </w:rPr>
-      </w:pPr>
-      <w:r>
-        <w:rPr>
-          <w:rFonts w:ascii="Times New Roman" w:eastAsia="Times New Roman" w:hAnsi="Times New Roman" w:cs="Times New Roman"/>
-          <w:kern w:val="0"/>
-          <w:lang w:eastAsia="en-GB"/>
-          <w14:ligatures w14:val="none"/>
-        </w:rPr>
-        <w:t>Pass/Fail Status (auto derived)</w:t>
-      </w:r>
-    </w:p>
-    <w:p>
-      <w:pPr>
-        <w:numPr>
-          <w:ilvl w:val="0"/>
-          <w:numId w:val="20"/>
-        </w:numPr>
-        <w:spacing w:before="100" w:beforeAutospacing="1" w:after="100" w:afterAutospacing="1"/>
-        <w:rPr>
-          <w:rFonts w:ascii="Times New Roman" w:eastAsia="Times New Roman" w:hAnsi="Times New Roman" w:cs="Times New Roman"/>
-          <w:kern w:val="0"/>
-          <w:lang w:eastAsia="en-GB"/>
-          <w14:ligatures w14:val="none"/>
-        </w:rPr>
-      </w:pPr>
-      <w:r>
-        <w:rPr>
-          <w:rFonts w:ascii="Times New Roman" w:eastAsia="Times New Roman" w:hAnsi="Times New Roman" w:cs="Times New Roman"/>
-          <w:kern w:val="0"/>
-          <w:lang w:eastAsia="en-GB"/>
-          <w14:ligatures w14:val="none"/>
-        </w:rPr>
-        <w:t>Timestamp (auto)</w:t>
-      </w:r>
-    </w:p>
-    <w:p>
-      <w:pPr>
-        <w:rPr>
-          <w:rFonts w:ascii="Times New Roman" w:eastAsia="Times New Roman" w:hAnsi="Times New Roman" w:cs="Times New Roman"/>
-          <w:kern w:val="0"/>
-          <w:lang w:eastAsia="en-GB"/>
-          <w14:ligatures w14:val="none"/>
-        </w:rPr>
-      </w:pPr>
-      <w:r>
-        <w:rPr>
-          <w:rFonts w:ascii="Times New Roman" w:eastAsia="Times New Roman" w:hAnsi="Times New Roman" w:cs="Times New Roman"/>
-          <w:noProof/>
-          <w:kern w:val="0"/>
-          <w:lang w:eastAsia="en-GB"/>
-        </w:rPr>
-        <w:pict w14:anchorId="0B805CB7">
-          <v:rect id="_x0000_i1028" alt="" style="width:451.3pt;height:.05pt;mso-width-percent:0;mso-height-percent:0;mso-width-percent:0;mso-height-percent:0" o:hralign="center" o:hrstd="t" o:hr="t" fillcolor="#a0a0a0" stroked="f"/>
-        </w:pict>
-      </w:r>
-    </w:p>
-    <w:p>
-      <w:pPr>
-        <w:spacing w:before="100" w:beforeAutospacing="1" w:after="100" w:afterAutospacing="1"/>
-        <w:outlineLvl w:val="1"/>
-        <w:rPr>
-          <w:rFonts w:ascii="Times New Roman" w:eastAsia="Times New Roman" w:hAnsi="Times New Roman" w:cs="Times New Roman"/>
-          <w:b/>
-          <w:bCs/>
-          <w:kern w:val="0"/>
-          <w:sz w:val="36"/>
-          <w:szCs w:val="36"/>
-          <w:lang w:eastAsia="en-GB"/>
-          <w14:ligatures w14:val="none"/>
-        </w:rPr>
-      </w:pPr>
-      <w:r>
-        <w:rPr>
-          <w:rFonts w:ascii="Times New Roman" w:eastAsia="Times New Roman" w:hAnsi="Times New Roman" w:cs="Times New Roman"/>
-          <w:b/>
-          <w:bCs/>
-          <w:kern w:val="0"/>
-          <w:sz w:val="36"/>
-          <w:szCs w:val="36"/>
-          <w:lang w:eastAsia="en-GB"/>
-          <w14:ligatures w14:val="none"/>
-        </w:rPr>
-        <w:t>5. Manufacturers (Formulation Stage)</w:t>
-      </w:r>
-    </w:p>
-    <w:p>
-      <w:pPr>
-        <w:numPr>
-          <w:ilvl w:val="0"/>
-          <w:numId w:val="21"/>
-        </w:numPr>
-        <w:spacing w:before="100" w:beforeAutospacing="1" w:after="100" w:afterAutospacing="1"/>
-        <w:rPr>
-          <w:rFonts w:ascii="Times New Roman" w:eastAsia="Times New Roman" w:hAnsi="Times New Roman" w:cs="Times New Roman"/>
-          <w:kern w:val="0"/>
-          <w:lang w:eastAsia="en-GB"/>
-          <w14:ligatures w14:val="none"/>
-        </w:rPr>
-      </w:pPr>
-      <w:proofErr w:type="spellStart"/>
-      <w:r>
-        <w:rPr>
-          <w:rFonts w:ascii="Times New Roman" w:eastAsia="Times New Roman" w:hAnsi="Times New Roman" w:cs="Times New Roman"/>
-          <w:kern w:val="0"/>
-          <w:lang w:eastAsia="en-GB"/>
-          <w14:ligatures w14:val="none"/>
-        </w:rPr>
-        <w:t>ManufacturingBatchID</w:t>
-      </w:r>
-      <w:proofErr w:type="spellEnd"/>
-      <w:r>
-        <w:rPr>
-          <w:rFonts w:ascii="Times New Roman" w:eastAsia="Times New Roman" w:hAnsi="Times New Roman" w:cs="Times New Roman"/>
-          <w:kern w:val="0"/>
-          <w:lang w:eastAsia="en-GB"/>
-          <w14:ligatures w14:val="none"/>
-        </w:rPr>
-        <w:t xml:space="preserve"> (auto)</w:t>
-      </w:r>
-    </w:p>
-    <w:p>
-      <w:pPr>
-        <w:numPr>
-          <w:ilvl w:val="0"/>
-          <w:numId w:val="21"/>
-        </w:numPr>
-        <w:spacing w:before="100" w:beforeAutospacing="1" w:after="100" w:afterAutospacing="1"/>
-        <w:rPr>
-          <w:rFonts w:ascii="Times New Roman" w:eastAsia="Times New Roman" w:hAnsi="Times New Roman" w:cs="Times New Roman"/>
-          <w:kern w:val="0"/>
-          <w:lang w:eastAsia="en-GB"/>
-          <w14:ligatures w14:val="none"/>
-        </w:rPr>
-      </w:pPr>
-      <w:r>
-        <w:rPr>
-          <w:rFonts w:ascii="Times New Roman" w:eastAsia="Times New Roman" w:hAnsi="Times New Roman" w:cs="Times New Roman"/>
-          <w:kern w:val="0"/>
-          <w:lang w:eastAsia="en-GB"/>
-          <w14:ligatures w14:val="none"/>
-        </w:rPr>
-        <w:t>Linked Processing/Lab Batch IDs</w:t>
-      </w:r>
-    </w:p>
-    <w:p>
-      <w:pPr>
-        <w:numPr>
-          <w:ilvl w:val="0"/>
-          <w:numId w:val="21"/>
-        </w:numPr>
-        <w:spacing w:before="100" w:beforeAutospacing="1" w:after="100" w:afterAutospacing="1"/>
-        <w:rPr>
-          <w:rFonts w:ascii="Times New Roman" w:eastAsia="Times New Roman" w:hAnsi="Times New Roman" w:cs="Times New Roman"/>
-          <w:kern w:val="0"/>
-          <w:lang w:eastAsia="en-GB"/>
-          <w14:ligatures w14:val="none"/>
-        </w:rPr>
-      </w:pPr>
-      <w:r>
-        <w:rPr>
-          <w:rFonts w:ascii="Times New Roman" w:eastAsia="Times New Roman" w:hAnsi="Times New Roman" w:cs="Times New Roman"/>
-          <w:kern w:val="0"/>
-          <w:lang w:eastAsia="en-GB"/>
-          <w14:ligatures w14:val="none"/>
-        </w:rPr>
-        <w:t>Product Name &amp; Form (tablet, powder, oil, etc.)</w:t>
-      </w:r>
-    </w:p>
-    <w:p>
-      <w:pPr>
-        <w:numPr>
-          <w:ilvl w:val="0"/>
-          <w:numId w:val="21"/>
-        </w:numPr>
-        <w:spacing w:before="100" w:beforeAutospacing="1" w:after="100" w:afterAutospacing="1"/>
-        <w:rPr>
-          <w:rFonts w:ascii="Times New Roman" w:eastAsia="Times New Roman" w:hAnsi="Times New Roman" w:cs="Times New Roman"/>
-          <w:kern w:val="0"/>
-          <w:lang w:eastAsia="en-GB"/>
-          <w14:ligatures w14:val="none"/>
-        </w:rPr>
-      </w:pPr>
-      <w:r>
-        <w:rPr>
-          <w:rFonts w:ascii="Times New Roman" w:eastAsia="Times New Roman" w:hAnsi="Times New Roman" w:cs="Times New Roman"/>
-          <w:kern w:val="0"/>
-          <w:lang w:eastAsia="en-GB"/>
-          <w14:ligatures w14:val="none"/>
-        </w:rPr>
-        <w:t>Ingredients (list with proportions)</w:t>
-      </w:r>
-    </w:p>
-    <w:p>
-      <w:pPr>
-        <w:numPr>
-          <w:ilvl w:val="0"/>
-          <w:numId w:val="21"/>
-        </w:numPr>
-        <w:spacing w:before="100" w:beforeAutospacing="1" w:after="100" w:afterAutospacing="1"/>
-        <w:rPr>
-          <w:rFonts w:ascii="Times New Roman" w:eastAsia="Times New Roman" w:hAnsi="Times New Roman" w:cs="Times New Roman"/>
-          <w:kern w:val="0"/>
-          <w:lang w:eastAsia="en-GB"/>
-          <w14:ligatures w14:val="none"/>
-        </w:rPr>
-      </w:pPr>
-      <w:r>
-        <w:rPr>
-          <w:rFonts w:ascii="Times New Roman" w:eastAsia="Times New Roman" w:hAnsi="Times New Roman" w:cs="Times New Roman"/>
-          <w:kern w:val="0"/>
-          <w:lang w:eastAsia="en-GB"/>
-          <w14:ligatures w14:val="none"/>
-        </w:rPr>
-        <w:t>Packaging Info (size, count, unit)</w:t>
-      </w:r>
-    </w:p>
-    <w:p>
-      <w:pPr>
-        <w:numPr>
-          <w:ilvl w:val="0"/>
-          <w:numId w:val="21"/>
-        </w:numPr>
-        <w:spacing w:before="100" w:beforeAutospacing="1" w:after="100" w:afterAutospacing="1"/>
-        <w:rPr>
-          <w:rFonts w:ascii="Times New Roman" w:eastAsia="Times New Roman" w:hAnsi="Times New Roman" w:cs="Times New Roman"/>
-          <w:kern w:val="0"/>
-          <w:lang w:eastAsia="en-GB"/>
-          <w14:ligatures w14:val="none"/>
-        </w:rPr>
-      </w:pPr>
-      <w:r>
-        <w:rPr>
-          <w:rFonts w:ascii="Times New Roman" w:eastAsia="Times New Roman" w:hAnsi="Times New Roman" w:cs="Times New Roman"/>
-          <w:kern w:val="0"/>
-          <w:lang w:eastAsia="en-GB"/>
-          <w14:ligatures w14:val="none"/>
-        </w:rPr>
-        <w:t>QR Code ID (auto-generated on-chain)</w:t>
-      </w:r>
-    </w:p>
-    <w:p>
-      <w:pPr>
-        <w:numPr>
-          <w:ilvl w:val="0"/>
-          <w:numId w:val="21"/>
-        </w:numPr>
-        <w:spacing w:before="100" w:beforeAutospacing="1" w:after="100" w:afterAutospacing="1"/>
-        <w:rPr>
-          <w:rFonts w:ascii="Times New Roman" w:eastAsia="Times New Roman" w:hAnsi="Times New Roman" w:cs="Times New Roman"/>
-          <w:kern w:val="0"/>
-          <w:lang w:eastAsia="en-GB"/>
-          <w14:ligatures w14:val="none"/>
-        </w:rPr>
-      </w:pPr>
-      <w:r>
-        <w:rPr>
-          <w:rFonts w:ascii="Times New Roman" w:eastAsia="Times New Roman" w:hAnsi="Times New Roman" w:cs="Times New Roman"/>
-          <w:kern w:val="0"/>
-          <w:lang w:eastAsia="en-GB"/>
-          <w14:ligatures w14:val="none"/>
-        </w:rPr>
-        <w:lastRenderedPageBreak/>
-        <w:t>Factory ID / License No.</w:t>
-      </w:r>
-    </w:p>
-    <w:p>
-      <w:pPr>
-        <w:numPr>
-          <w:ilvl w:val="0"/>
-          <w:numId w:val="21"/>
-        </w:numPr>
-        <w:spacing w:before="100" w:beforeAutospacing="1" w:after="100" w:afterAutospacing="1"/>
-        <w:rPr>
-          <w:rFonts w:ascii="Times New Roman" w:eastAsia="Times New Roman" w:hAnsi="Times New Roman" w:cs="Times New Roman"/>
-          <w:kern w:val="0"/>
-          <w:lang w:eastAsia="en-GB"/>
-          <w14:ligatures w14:val="none"/>
-        </w:rPr>
-      </w:pPr>
-      <w:r>
-        <w:rPr>
-          <w:rFonts w:ascii="Times New Roman" w:eastAsia="Times New Roman" w:hAnsi="Times New Roman" w:cs="Times New Roman"/>
-          <w:kern w:val="0"/>
-          <w:lang w:eastAsia="en-GB"/>
-          <w14:ligatures w14:val="none"/>
-        </w:rPr>
-        <w:t>Timestamp (auto)</w:t>
-      </w:r>
-    </w:p>
-    <w:p>
-      <w:pPr>
-        <w:rPr>
-          <w:rFonts w:ascii="Times New Roman" w:eastAsia="Times New Roman" w:hAnsi="Times New Roman" w:cs="Times New Roman"/>
-          <w:kern w:val="0"/>
-          <w:lang w:eastAsia="en-GB"/>
-          <w14:ligatures w14:val="none"/>
-        </w:rPr>
-      </w:pPr>
-      <w:r>
-        <w:rPr>
-          <w:rFonts w:ascii="Times New Roman" w:eastAsia="Times New Roman" w:hAnsi="Times New Roman" w:cs="Times New Roman"/>
-          <w:noProof/>
-          <w:kern w:val="0"/>
-          <w:lang w:eastAsia="en-GB"/>
-        </w:rPr>
-        <w:pict w14:anchorId="5671A103">
-          <v:rect id="_x0000_i1027" alt="" style="width:451.3pt;height:.05pt;mso-width-percent:0;mso-height-percent:0;mso-width-percent:0;mso-height-percent:0" o:hralign="center" o:hrstd="t" o:hr="t" fillcolor="#a0a0a0" stroked="f"/>
-        </w:pict>
-      </w:r>
-    </w:p>
-    <w:p>
-      <w:pPr>
-        <w:spacing w:before="100" w:beforeAutospacing="1" w:after="100" w:afterAutospacing="1"/>
-        <w:outlineLvl w:val="1"/>
-        <w:rPr>
-          <w:rFonts w:ascii="Times New Roman" w:eastAsia="Times New Roman" w:hAnsi="Times New Roman" w:cs="Times New Roman"/>
-          <w:b/>
-          <w:bCs/>
-          <w:kern w:val="0"/>
-          <w:sz w:val="36"/>
-          <w:szCs w:val="36"/>
-          <w:lang w:eastAsia="en-GB"/>
-          <w14:ligatures w14:val="none"/>
-        </w:rPr>
-      </w:pPr>
-      <w:r>
-        <w:rPr>
-          <w:rFonts w:ascii="Times New Roman" w:eastAsia="Times New Roman" w:hAnsi="Times New Roman" w:cs="Times New Roman"/>
-          <w:b/>
-          <w:bCs/>
-          <w:kern w:val="0"/>
-          <w:sz w:val="36"/>
-          <w:szCs w:val="36"/>
-          <w:lang w:eastAsia="en-GB"/>
-          <w14:ligatures w14:val="none"/>
-        </w:rPr>
-        <w:t>6. Distributors / Retailers (Optional but useful)</w:t>
-      </w:r>
-    </w:p>
-    <w:p>
-      <w:pPr>
-        <w:numPr>
-          <w:ilvl w:val="0"/>
-          <w:numId w:val="22"/>
-        </w:numPr>
-        <w:spacing w:before="100" w:beforeAutospacing="1" w:after="100" w:afterAutospacing="1"/>
-        <w:rPr>
-          <w:rFonts w:ascii="Times New Roman" w:eastAsia="Times New Roman" w:hAnsi="Times New Roman" w:cs="Times New Roman"/>
-          <w:kern w:val="0"/>
-          <w:lang w:eastAsia="en-GB"/>
-          <w14:ligatures w14:val="none"/>
-        </w:rPr>
-      </w:pPr>
-      <w:proofErr w:type="spellStart"/>
-      <w:r>
-        <w:rPr>
-          <w:rFonts w:ascii="Times New Roman" w:eastAsia="Times New Roman" w:hAnsi="Times New Roman" w:cs="Times New Roman"/>
-          <w:kern w:val="0"/>
-          <w:lang w:eastAsia="en-GB"/>
-          <w14:ligatures w14:val="none"/>
-        </w:rPr>
-        <w:t>DistributionBatchID</w:t>
-      </w:r>
-      <w:proofErr w:type="spellEnd"/>
-      <w:r>
-        <w:rPr>
-          <w:rFonts w:ascii="Times New Roman" w:eastAsia="Times New Roman" w:hAnsi="Times New Roman" w:cs="Times New Roman"/>
-          <w:kern w:val="0"/>
-          <w:lang w:eastAsia="en-GB"/>
-          <w14:ligatures w14:val="none"/>
-        </w:rPr>
-        <w:t xml:space="preserve"> (auto)</w:t>
-      </w:r>
-    </w:p>
-    <w:p>
-      <w:pPr>
-        <w:numPr>
-          <w:ilvl w:val="0"/>
-          <w:numId w:val="22"/>
-        </w:numPr>
-        <w:spacing w:before="100" w:beforeAutospacing="1" w:after="100" w:afterAutospacing="1"/>
-        <w:rPr>
-          <w:rFonts w:ascii="Times New Roman" w:eastAsia="Times New Roman" w:hAnsi="Times New Roman" w:cs="Times New Roman"/>
-          <w:kern w:val="0"/>
-          <w:lang w:eastAsia="en-GB"/>
-          <w14:ligatures w14:val="none"/>
-        </w:rPr>
-      </w:pPr>
-      <w:r>
-        <w:rPr>
-          <w:rFonts w:ascii="Times New Roman" w:eastAsia="Times New Roman" w:hAnsi="Times New Roman" w:cs="Times New Roman"/>
-          <w:kern w:val="0"/>
-          <w:lang w:eastAsia="en-GB"/>
-          <w14:ligatures w14:val="none"/>
-        </w:rPr>
-        <w:t>Linked Manufacturing Batch IDs</w:t>
-      </w:r>
-    </w:p>
-    <w:p>
-      <w:pPr>
-        <w:numPr>
-          <w:ilvl w:val="0"/>
-          <w:numId w:val="22"/>
-        </w:numPr>
-        <w:spacing w:before="100" w:beforeAutospacing="1" w:after="100" w:afterAutospacing="1"/>
-        <w:rPr>
-          <w:rFonts w:ascii="Times New Roman" w:eastAsia="Times New Roman" w:hAnsi="Times New Roman" w:cs="Times New Roman"/>
-          <w:kern w:val="0"/>
-          <w:lang w:eastAsia="en-GB"/>
-          <w14:ligatures w14:val="none"/>
-        </w:rPr>
-      </w:pPr>
-      <w:r>
-        <w:rPr>
-          <w:rFonts w:ascii="Times New Roman" w:eastAsia="Times New Roman" w:hAnsi="Times New Roman" w:cs="Times New Roman"/>
-          <w:kern w:val="0"/>
-          <w:lang w:eastAsia="en-GB"/>
-          <w14:ligatures w14:val="none"/>
-        </w:rPr>
-        <w:t>Shipment Details (dispatch date, arrival date, transport ID)</w:t>
-      </w:r>
-    </w:p>
-    <w:p>
-      <w:pPr>
-        <w:numPr>
-          <w:ilvl w:val="0"/>
-          <w:numId w:val="22"/>
-        </w:numPr>
-        <w:spacing w:before="100" w:beforeAutospacing="1" w:after="100" w:afterAutospacing="1"/>
-        <w:rPr>
-          <w:rFonts w:ascii="Times New Roman" w:eastAsia="Times New Roman" w:hAnsi="Times New Roman" w:cs="Times New Roman"/>
-          <w:kern w:val="0"/>
-          <w:lang w:eastAsia="en-GB"/>
-          <w14:ligatures w14:val="none"/>
-        </w:rPr>
-      </w:pPr>
-      <w:r>
-        <w:rPr>
-          <w:rFonts w:ascii="Times New Roman" w:eastAsia="Times New Roman" w:hAnsi="Times New Roman" w:cs="Times New Roman"/>
-          <w:kern w:val="0"/>
-          <w:lang w:eastAsia="en-GB"/>
-          <w14:ligatures w14:val="none"/>
-        </w:rPr>
-        <w:t>Warehouse/Store ID</w:t>
-      </w:r>
-    </w:p>
-    <w:p>
-      <w:pPr>
-        <w:numPr>
-          <w:ilvl w:val="0"/>
-          <w:numId w:val="22"/>
-        </w:numPr>
-        <w:spacing w:before="100" w:beforeAutospacing="1" w:after="100" w:afterAutospacing="1"/>
-        <w:rPr>
-          <w:rFonts w:ascii="Times New Roman" w:eastAsia="Times New Roman" w:hAnsi="Times New Roman" w:cs="Times New Roman"/>
-          <w:kern w:val="0"/>
-          <w:lang w:eastAsia="en-GB"/>
-          <w14:ligatures w14:val="none"/>
-        </w:rPr>
-      </w:pPr>
-      <w:r>
-        <w:rPr>
-          <w:rFonts w:ascii="Times New Roman" w:eastAsia="Times New Roman" w:hAnsi="Times New Roman" w:cs="Times New Roman"/>
-          <w:kern w:val="0"/>
-          <w:lang w:eastAsia="en-GB"/>
-          <w14:ligatures w14:val="none"/>
-        </w:rPr>
-        <w:t>Storage Conditions (if sensitive)</w:t>
-      </w:r>
-    </w:p>
-    <w:p>
-      <w:pPr>
-        <w:numPr>
-          <w:ilvl w:val="0"/>
-          <w:numId w:val="22"/>
-        </w:numPr>
-        <w:spacing w:before="100" w:beforeAutospacing="1" w:after="100" w:afterAutospacing="1"/>
-        <w:rPr>
-          <w:rFonts w:ascii="Times New Roman" w:eastAsia="Times New Roman" w:hAnsi="Times New Roman" w:cs="Times New Roman"/>
-          <w:kern w:val="0"/>
-          <w:lang w:eastAsia="en-GB"/>
-          <w14:ligatures w14:val="none"/>
-        </w:rPr>
-      </w:pPr>
-      <w:r>
-        <w:rPr>
-          <w:rFonts w:ascii="Times New Roman" w:eastAsia="Times New Roman" w:hAnsi="Times New Roman" w:cs="Times New Roman"/>
-          <w:kern w:val="0"/>
-          <w:lang w:eastAsia="en-GB"/>
-          <w14:ligatures w14:val="none"/>
-        </w:rPr>
-        <w:t>Timestamp (auto)</w:t>
-      </w:r>
-    </w:p>
-    <w:p>
-      <w:pPr>
-        <w:rPr>
-          <w:rFonts w:ascii="Times New Roman" w:eastAsia="Times New Roman" w:hAnsi="Times New Roman" w:cs="Times New Roman"/>
-          <w:kern w:val="0"/>
-          <w:lang w:eastAsia="en-GB"/>
-          <w14:ligatures w14:val="none"/>
-        </w:rPr>
-      </w:pPr>
-      <w:r>
-        <w:rPr>
-          <w:rFonts w:ascii="Times New Roman" w:eastAsia="Times New Roman" w:hAnsi="Times New Roman" w:cs="Times New Roman"/>
-          <w:noProof/>
-          <w:kern w:val="0"/>
-          <w:lang w:eastAsia="en-GB"/>
-        </w:rPr>
-        <w:pict w14:anchorId="603AC355">
-          <v:rect id="_x0000_i1026" alt="" style="width:451.3pt;height:.05pt;mso-width-percent:0;mso-height-percent:0;mso-width-percent:0;mso-height-percent:0" o:hralign="center" o:hrstd="t" o:hr="t" fillcolor="#a0a0a0" stroked="f"/>
-        </w:pict>
-      </w:r>
-    </w:p>
-    <w:p>
-      <w:pPr>
-        <w:spacing w:before="100" w:beforeAutospacing="1" w:after="100" w:afterAutospacing="1"/>
-        <w:outlineLvl w:val="1"/>
-        <w:rPr>
-          <w:rFonts w:ascii="Times New Roman" w:eastAsia="Times New Roman" w:hAnsi="Times New Roman" w:cs="Times New Roman"/>
-          <w:b/>
-          <w:bCs/>
-          <w:kern w:val="0"/>
-          <w:sz w:val="36"/>
-          <w:szCs w:val="36"/>
-          <w:lang w:eastAsia="en-GB"/>
-          <w14:ligatures w14:val="none"/>
-        </w:rPr>
-      </w:pPr>
-      <w:r>
-        <w:rPr>
-          <w:rFonts w:ascii="Times New Roman" w:eastAsia="Times New Roman" w:hAnsi="Times New Roman" w:cs="Times New Roman"/>
-          <w:b/>
-          <w:bCs/>
-          <w:kern w:val="0"/>
-          <w:sz w:val="36"/>
-          <w:szCs w:val="36"/>
-          <w:lang w:eastAsia="en-GB"/>
-          <w14:ligatures w14:val="none"/>
-        </w:rPr>
-        <w:t>7. Consumers (Auto-captured, no manual entry)</w:t>
-      </w:r>
-    </w:p>
-    <w:p>
-      <w:pPr>
-        <w:numPr>
-          <w:ilvl w:val="0"/>
-          <w:numId w:val="23"/>
-        </w:numPr>
-        <w:spacing w:before="100" w:beforeAutospacing="1" w:after="100" w:afterAutospacing="1"/>
-        <w:rPr>
-          <w:rFonts w:ascii="Times New Roman" w:eastAsia="Times New Roman" w:hAnsi="Times New Roman" w:cs="Times New Roman"/>
-          <w:kern w:val="0"/>
-          <w:lang w:eastAsia="en-GB"/>
-          <w14:ligatures w14:val="none"/>
-        </w:rPr>
-      </w:pPr>
-      <w:r>
-        <w:rPr>
-          <w:rFonts w:ascii="Times New Roman" w:eastAsia="Times New Roman" w:hAnsi="Times New Roman" w:cs="Times New Roman"/>
-          <w:kern w:val="0"/>
-          <w:lang w:eastAsia="en-GB"/>
-          <w14:ligatures w14:val="none"/>
-        </w:rPr>
-        <w:t>QR Code Scan ID (auto)</w:t>
-      </w:r>
-    </w:p>
-    <w:p>
-      <w:pPr>
-        <w:numPr>
-          <w:ilvl w:val="0"/>
-          <w:numId w:val="23"/>
-        </w:numPr>
-        <w:spacing w:before="100" w:beforeAutospacing="1" w:after="100" w:afterAutospacing="1"/>
-        <w:rPr>
-          <w:rFonts w:ascii="Times New Roman" w:eastAsia="Times New Roman" w:hAnsi="Times New Roman" w:cs="Times New Roman"/>
-          <w:kern w:val="0"/>
-          <w:lang w:eastAsia="en-GB"/>
-          <w14:ligatures w14:val="none"/>
-        </w:rPr>
-      </w:pPr>
-      <w:r>
-        <w:rPr>
-          <w:rFonts w:ascii="Times New Roman" w:eastAsia="Times New Roman" w:hAnsi="Times New Roman" w:cs="Times New Roman"/>
-          <w:kern w:val="0"/>
-          <w:lang w:eastAsia="en-GB"/>
-          <w14:ligatures w14:val="none"/>
-        </w:rPr>
-        <w:t>Product Batch ID (auto from QR)</w:t>
-      </w:r>
-    </w:p>
-    <w:p>
-      <w:pPr>
-        <w:numPr>
-          <w:ilvl w:val="0"/>
-          <w:numId w:val="23"/>
-        </w:numPr>
-        <w:spacing w:before="100" w:beforeAutospacing="1" w:after="100" w:afterAutospacing="1"/>
-        <w:rPr>
-          <w:rFonts w:ascii="Times New Roman" w:eastAsia="Times New Roman" w:hAnsi="Times New Roman" w:cs="Times New Roman"/>
-          <w:kern w:val="0"/>
-          <w:lang w:eastAsia="en-GB"/>
-          <w14:ligatures w14:val="none"/>
-        </w:rPr>
-      </w:pPr>
-      <w:r>
-        <w:rPr>
-          <w:rFonts w:ascii="Times New Roman" w:eastAsia="Times New Roman" w:hAnsi="Times New Roman" w:cs="Times New Roman"/>
-          <w:kern w:val="0"/>
-          <w:lang w:eastAsia="en-GB"/>
-          <w14:ligatures w14:val="none"/>
-        </w:rPr>
-        <w:t>Scan Timestamp (auto)</w:t>
-      </w:r>
-    </w:p>
-    <w:p>
-      <w:pPr>
-        <w:numPr>
-          <w:ilvl w:val="0"/>
-          <w:numId w:val="23"/>
-        </w:numPr>
-        <w:spacing w:before="100" w:beforeAutospacing="1" w:after="100" w:afterAutospacing="1"/>
-        <w:rPr>
-          <w:rFonts w:ascii="Times New Roman" w:eastAsia="Times New Roman" w:hAnsi="Times New Roman" w:cs="Times New Roman"/>
-          <w:kern w:val="0"/>
-          <w:lang w:eastAsia="en-GB"/>
-          <w14:ligatures w14:val="none"/>
-        </w:rPr>
-      </w:pPr>
-      <w:r>
-        <w:rPr>
-          <w:rFonts w:ascii="Times New Roman" w:eastAsia="Times New Roman" w:hAnsi="Times New Roman" w:cs="Times New Roman"/>
-          <w:kern w:val="0"/>
-          <w:lang w:eastAsia="en-GB"/>
-          <w14:ligatures w14:val="none"/>
-        </w:rPr>
-        <w:t>Scan Location (auto if user allows)</w:t>
-      </w:r>
-    </w:p>
-    <w:p>
-      <w:pPr>
-        <w:numPr>
-          <w:ilvl w:val="0"/>
-          <w:numId w:val="23"/>
-        </w:numPr>
-        <w:spacing w:before="100" w:beforeAutospacing="1" w:after="100" w:afterAutospacing="1"/>
-        <w:rPr>
-          <w:rFonts w:ascii="Times New Roman" w:eastAsia="Times New Roman" w:hAnsi="Times New Roman" w:cs="Times New Roman"/>
-          <w:kern w:val="0"/>
-          <w:lang w:eastAsia="en-GB"/>
-          <w14:ligatures w14:val="none"/>
-        </w:rPr>
-      </w:pPr>
-      <w:r>
-        <w:rPr>
-          <w:rFonts w:ascii="Times New Roman" w:eastAsia="Times New Roman" w:hAnsi="Times New Roman" w:cs="Times New Roman"/>
-          <w:kern w:val="0"/>
-          <w:lang w:eastAsia="en-GB"/>
-          <w14:ligatures w14:val="none"/>
-        </w:rPr>
-        <w:t>Feedback/Rating (optional input by user)</w:t>
-      </w:r>
-    </w:p>
-    <w:p>
-      <w:pPr>
-        <w:rPr>
-          <w:rFonts w:ascii="Times New Roman" w:eastAsia="Times New Roman" w:hAnsi="Times New Roman" w:cs="Times New Roman"/>
-          <w:kern w:val="0"/>
-          <w:lang w:eastAsia="en-GB"/>
-          <w14:ligatures w14:val="none"/>
-        </w:rPr>
-      </w:pPr>
-      <w:r>
-        <w:rPr>
-          <w:rFonts w:ascii="Times New Roman" w:eastAsia="Times New Roman" w:hAnsi="Times New Roman" w:cs="Times New Roman"/>
-          <w:noProof/>
-          <w:kern w:val="0"/>
-          <w:lang w:eastAsia="en-GB"/>
-        </w:rPr>
-        <w:pict w14:anchorId="49648C83">
-          <v:rect id="_x0000_i1025" alt="" style="width:451.3pt;height:.05pt;mso-width-percent:0;mso-height-percent:0;mso-width-percent:0;mso-height-percent:0" o:hralign="center" o:hrstd="t" o:hr="t" fillcolor="#a0a0a0" stroked="f"/>
-        </w:pict>
-      </w:r>
-    </w:p>
-    <w:p>
-      <w:pPr>
-        <w:spacing w:before="100" w:beforeAutospacing="1" w:after="100" w:afterAutospacing="1"/>
-        <w:outlineLvl w:val="2"/>
-        <w:rPr>
-          <w:rFonts w:ascii="Times New Roman" w:eastAsia="Times New Roman" w:hAnsi="Times New Roman" w:cs="Times New Roman"/>
-          <w:b/>
-          <w:bCs/>
-          <w:kern w:val="0"/>
-          <w:sz w:val="27"/>
-          <w:szCs w:val="27"/>
-          <w:lang w:eastAsia="en-GB"/>
-          <w14:ligatures w14:val="none"/>
-        </w:rPr>
-      </w:pPr>
-      <w:r>
-        <w:rPr>
-          <w:rFonts w:ascii="Apple Color Emoji" w:eastAsia="Times New Roman" w:hAnsi="Apple Color Emoji" w:cs="Apple Color Emoji"/>
-          <w:b/>
-          <w:bCs/>
-          <w:kern w:val="0"/>
-          <w:sz w:val="27"/>
-          <w:szCs w:val="27"/>
-          <w:lang w:eastAsia="en-GB"/>
-          <w14:ligatures w14:val="none"/>
-        </w:rPr>
-        <w:t>🔑</w:t>
-      </w:r>
-      <w:r>
-        <w:rPr>
-          <w:rFonts w:ascii="Times New Roman" w:eastAsia="Times New Roman" w:hAnsi="Times New Roman" w:cs="Times New Roman"/>
-          <w:b/>
-          <w:bCs/>
-          <w:kern w:val="0"/>
-          <w:sz w:val="27"/>
-          <w:szCs w:val="27"/>
-          <w:lang w:eastAsia="en-GB"/>
-          <w14:ligatures w14:val="none"/>
-        </w:rPr>
-        <w:t> </w:t>
-      </w:r>
-    </w:p>
-    <w:p>
-      <w:pPr>
-        <w:spacing w:before="100" w:beforeAutospacing="1" w:after="100" w:afterAutospacing="1"/>
-        <w:outlineLvl w:val="2"/>
-        <w:rPr>
-          <w:rFonts w:ascii="Times New Roman" w:eastAsia="Times New Roman" w:hAnsi="Times New Roman" w:cs="Times New Roman"/>
-          <w:b/>
-          <w:bCs/>
-          <w:kern w:val="0"/>
-          <w:sz w:val="27"/>
-          <w:szCs w:val="27"/>
-          <w:lang w:eastAsia="en-GB"/>
-          <w14:ligatures w14:val="none"/>
-        </w:rPr>
-      </w:pPr>
-      <w:r>
-        <w:rPr>
-          <w:rFonts w:ascii="Times New Roman" w:eastAsia="Times New Roman" w:hAnsi="Times New Roman" w:cs="Times New Roman"/>
-          <w:b/>
-          <w:bCs/>
-          <w:kern w:val="0"/>
-          <w:sz w:val="27"/>
-          <w:szCs w:val="27"/>
-          <w:lang w:eastAsia="en-GB"/>
-          <w14:ligatures w14:val="none"/>
-        </w:rPr>
-        <w:t>Key Principle</w:t>
-      </w:r>
-    </w:p>
-    <w:p>
-      <w:pPr>
-        <w:numPr>
-          <w:ilvl w:val="0"/>
-          <w:numId w:val="24"/>
-        </w:numPr>
-        <w:spacing w:before="100" w:beforeAutospacing="1" w:after="100" w:afterAutospacing="1"/>
-        <w:rPr>
-          <w:rFonts w:ascii="Times New Roman" w:eastAsia="Times New Roman" w:hAnsi="Times New Roman" w:cs="Times New Roman"/>
-          <w:kern w:val="0"/>
-          <w:lang w:eastAsia="en-GB"/>
-          <w14:ligatures w14:val="none"/>
-        </w:rPr>
-      </w:pPr>
-      <w:r>
-        <w:rPr>
-          <w:rFonts w:ascii="Times New Roman" w:eastAsia="Times New Roman" w:hAnsi="Times New Roman" w:cs="Times New Roman"/>
-          <w:b/>
-          <w:bCs/>
-          <w:kern w:val="0"/>
-          <w:lang w:eastAsia="en-GB"/>
-          <w14:ligatures w14:val="none"/>
-        </w:rPr>
-        <w:t>Data Providers (farmers, collectors, processors, labs, manufacturers, distributors) → submit data</w:t>
-      </w:r>
-    </w:p>
-    <w:p>
-      <w:pPr>
-        <w:numPr>
-          <w:ilvl w:val="0"/>
-          <w:numId w:val="24"/>
-        </w:numPr>
-        <w:spacing w:before="100" w:beforeAutospacing="1" w:after="100" w:afterAutospacing="1"/>
-        <w:rPr>
-          <w:rFonts w:ascii="Times New Roman" w:eastAsia="Times New Roman" w:hAnsi="Times New Roman" w:cs="Times New Roman"/>
-          <w:kern w:val="0"/>
-          <w:lang w:eastAsia="en-GB"/>
-          <w14:ligatures w14:val="none"/>
-        </w:rPr>
-      </w:pPr>
-      <w:r>
-        <w:rPr>
-          <w:rFonts w:ascii="Times New Roman" w:eastAsia="Times New Roman" w:hAnsi="Times New Roman" w:cs="Times New Roman"/>
-          <w:b/>
-          <w:bCs/>
-          <w:kern w:val="0"/>
-          <w:lang w:eastAsia="en-GB"/>
-          <w14:ligatures w14:val="none"/>
-        </w:rPr>
-        <w:t>Regional Admin → validates → commits final event to blockchain</w:t>
-      </w:r>
-    </w:p>
-    <w:p>
-      <w:pPr>
-        <w:numPr>
-          <w:ilvl w:val="0"/>
-          <w:numId w:val="24"/>
-        </w:numPr>
-        <w:spacing w:before="100" w:beforeAutospacing="1" w:after="100" w:afterAutospacing="1"/>
-        <w:rPr>
-          <w:rFonts w:ascii="Times New Roman" w:eastAsia="Times New Roman" w:hAnsi="Times New Roman" w:cs="Times New Roman"/>
-          <w:kern w:val="0"/>
-          <w:lang w:eastAsia="en-GB"/>
-          <w14:ligatures w14:val="none"/>
-        </w:rPr>
-      </w:pPr>
-      <w:r>
-        <w:rPr>
-          <w:rFonts w:ascii="Times New Roman" w:eastAsia="Times New Roman" w:hAnsi="Times New Roman" w:cs="Times New Roman"/>
-          <w:b/>
-          <w:bCs/>
-          <w:kern w:val="0"/>
-          <w:lang w:eastAsia="en-GB"/>
-          <w14:ligatures w14:val="none"/>
-        </w:rPr>
-        <w:t>Smart Contracts → enforce rules automatically after admin commits</w:t>
-      </w:r>
-    </w:p>
-    <w:p>
-      <w:pPr>
-        <w:spacing w:before="100" w:beforeAutospacing="1" w:after="100" w:afterAutospacing="1"/>
-        <w:rPr>
-          <w:rFonts w:ascii="Times New Roman" w:eastAsia="Times New Roman" w:hAnsi="Times New Roman" w:cs="Times New Roman"/>
-          <w:kern w:val="0"/>
-          <w:lang w:eastAsia="en-GB"/>
-          <w14:ligatures w14:val="none"/>
-        </w:rPr>
-      </w:pPr>
-    </w:p>
-    <w:p>
-      <w:pPr>
-        <w:spacing w:before="100" w:beforeAutospacing="1" w:after="100" w:afterAutospacing="1"/>
-        <w:outlineLvl w:val="2"/>
-        <w:rPr>
-          <w:rFonts w:ascii="Times New Roman" w:eastAsia="Times New Roman" w:hAnsi="Times New Roman" w:cs="Times New Roman"/>
-          <w:b/>
-          <w:bCs/>
-          <w:kern w:val="0"/>
-          <w:sz w:val="27"/>
-          <w:szCs w:val="27"/>
-          <w:lang w:eastAsia="en-GB"/>
-          <w14:ligatures w14:val="none"/>
-        </w:rPr>
-      </w:pPr>
+        <w:pStyle w:val="p1"/>
+      </w:pPr>
+      <w:r>
+        <w:t>•</w:t>
+      </w:r>
+      <w:r>
+        <w:rPr>
+          <w:rStyle w:val="apple-tab-span"/>
+          <w:rFonts w:eastAsiaTheme="majorEastAsia"/>
+        </w:rPr>
+        <w:t xml:space="preserve"> </w:t>
+      </w:r>
+      <w:r>
+        <w:t>LocationAccuracy</w:t>
+      </w:r>
+    </w:p>
+    <w:p>
+      <w:pPr>
+        <w:pStyle w:val="p1"/>
+      </w:pPr>
+      <w:r>
+        <w:t>•</w:t>
+      </w:r>
+      <w:r>
+        <w:rPr>
+          <w:rStyle w:val="apple-tab-span"/>
+          <w:rFonts w:eastAsiaTheme="majorEastAsia"/>
+        </w:rPr>
+        <w:t xml:space="preserve"> </w:t>
+      </w:r>
+      <w:r>
+        <w:t>District</w:t>
+      </w:r>
+    </w:p>
+    <w:p>
+      <w:pPr>
+        <w:pStyle w:val="p1"/>
+      </w:pPr>
+      <w:r>
+        <w:t>•</w:t>
+      </w:r>
+      <w:r>
+        <w:rPr>
+          <w:rStyle w:val="apple-tab-span"/>
+          <w:rFonts w:eastAsiaTheme="majorEastAsia"/>
+        </w:rPr>
+        <w:t xml:space="preserve"> </w:t>
+      </w:r>
+      <w:r>
+        <w:t>Timestamp</w:t>
+      </w:r>
+    </w:p>
+    <w:p>
+      <w:pPr>
+        <w:pStyle w:val="p2"/>
+      </w:pPr>
+    </w:p>
+    <w:p>
+      <w:pPr>
+        <w:pStyle w:val="p1"/>
+      </w:pPr>
+      <w:r>
+        <w:t>⸻</w:t>
+      </w:r>
+    </w:p>
+    <w:p>
+      <w:pPr>
+        <w:pStyle w:val="p2"/>
+      </w:pPr>
+    </w:p>
+    <w:p>
+      <w:pPr>
+        <w:pStyle w:val="p1"/>
+      </w:pPr>
+      <w:r>
+        <w:t>ManufacturerData_Collection</w:t>
+      </w:r>
+    </w:p>
+    <w:p>
+      <w:pPr>
+        <w:pStyle w:val="p1"/>
+      </w:pPr>
+      <w:r>
+        <w:t>•</w:t>
+      </w:r>
+      <w:r>
+        <w:rPr>
+          <w:rStyle w:val="apple-tab-span"/>
+          <w:rFonts w:eastAsiaTheme="majorEastAsia"/>
+        </w:rPr>
+        <w:t xml:space="preserve"> </w:t>
+      </w:r>
+      <w:r>
+        <w:t>MbatchID (Primary Key, auto)</w:t>
+      </w:r>
+    </w:p>
+    <w:p>
+      <w:pPr>
+        <w:pStyle w:val="p1"/>
+      </w:pPr>
+      <w:r>
+        <w:t>•</w:t>
+      </w:r>
+      <w:r>
+        <w:rPr>
+          <w:rStyle w:val="apple-tab-span"/>
+          <w:rFonts w:eastAsiaTheme="majorEastAsia"/>
+        </w:rPr>
+        <w:t xml:space="preserve"> </w:t>
+      </w:r>
+      <w:r>
+        <w:t>ManufacturerID (who manufactured)</w:t>
+      </w:r>
+    </w:p>
+    <w:p>
+      <w:pPr>
+        <w:pStyle w:val="p1"/>
+      </w:pPr>
+      <w:r>
+        <w:t>•</w:t>
+      </w:r>
+      <w:r>
+        <w:rPr>
+          <w:rStyle w:val="apple-tab-span"/>
+          <w:rFonts w:eastAsiaTheme="majorEastAsia"/>
+        </w:rPr>
+        <w:t xml:space="preserve"> </w:t>
+      </w:r>
+      <w:r>
+        <w:t>LinkedBatchIDs (lab tester)</w:t>
+      </w:r>
+    </w:p>
+    <w:p>
+      <w:pPr>
+        <w:pStyle w:val="p1"/>
+      </w:pPr>
+      <w:r>
+        <w:t>•</w:t>
+      </w:r>
+      <w:r>
+        <w:rPr>
+          <w:rStyle w:val="apple-tab-span"/>
+          <w:rFonts w:eastAsiaTheme="majorEastAsia"/>
+        </w:rPr>
+        <w:t xml:space="preserve"> </w:t>
+      </w:r>
+      <w:r>
+        <w:t>ProductName (e.g., Ashwagandha Capsule)</w:t>
+      </w:r>
+    </w:p>
+    <w:p>
+      <w:pPr>
+        <w:pStyle w:val="p1"/>
+      </w:pPr>
+      <w:r>
+        <w:t>•</w:t>
+      </w:r>
+      <w:r>
+        <w:rPr>
+          <w:rStyle w:val="apple-tab-span"/>
+          <w:rFonts w:eastAsiaTheme="majorEastAsia"/>
+        </w:rPr>
+        <w:t xml:space="preserve"> </w:t>
+      </w:r>
+      <w:r>
+        <w:t>ProductForm (tablet, powder, oil, etc.)</w:t>
+      </w:r>
+    </w:p>
+    <w:p>
+      <w:pPr>
+        <w:pStyle w:val="p1"/>
+      </w:pPr>
+      <w:r>
+        <w:t>•</w:t>
+      </w:r>
+      <w:r>
+        <w:rPr>
+          <w:rStyle w:val="apple-tab-span"/>
+          <w:rFonts w:eastAsiaTheme="majorEastAsia"/>
+        </w:rPr>
+        <w:t xml:space="preserve"> </w:t>
+      </w:r>
+      <w:r>
+        <w:t>Ingredients (TEXT → structured list with proportions)</w:t>
+      </w:r>
+    </w:p>
+    <w:p>
+      <w:pPr>
+        <w:pStyle w:val="p1"/>
+      </w:pPr>
+      <w:r>
+        <w:t>•</w:t>
+      </w:r>
+      <w:r>
+        <w:rPr>
+          <w:rStyle w:val="apple-tab-span"/>
+          <w:rFonts w:eastAsiaTheme="majorEastAsia"/>
+        </w:rPr>
+        <w:t xml:space="preserve"> </w:t>
+      </w:r>
+      <w:r>
+        <w:t>PackagingInfo (size, count, unit)</w:t>
+      </w:r>
+    </w:p>
+    <w:p>
+      <w:pPr>
+        <w:pStyle w:val="p1"/>
+      </w:pPr>
+      <w:r>
+        <w:t>•</w:t>
+      </w:r>
+      <w:r>
+        <w:rPr>
+          <w:rStyle w:val="apple-tab-span"/>
+          <w:rFonts w:eastAsiaTheme="majorEastAsia"/>
+        </w:rPr>
+        <w:t xml:space="preserve"> </w:t>
+      </w:r>
+      <w:r>
+        <w:t>WeightFinal (kg)</w:t>
+      </w:r>
+    </w:p>
+    <w:p>
+      <w:pPr>
+        <w:pStyle w:val="p1"/>
+      </w:pPr>
+      <w:r>
+        <w:t>•</w:t>
+      </w:r>
+      <w:r>
+        <w:rPr>
+          <w:rStyle w:val="apple-tab-span"/>
+          <w:rFonts w:eastAsiaTheme="majorEastAsia"/>
+        </w:rPr>
+        <w:t xml:space="preserve"> </w:t>
+      </w:r>
+      <w:r>
+        <w:t>QRCodeID (unique, auto-generated on-chain)</w:t>
+      </w:r>
+    </w:p>
+    <w:p>
+      <w:pPr>
+        <w:pStyle w:val="p1"/>
+      </w:pPr>
+      <w:r>
+        <w:t>•</w:t>
+      </w:r>
+      <w:r>
+        <w:rPr>
+          <w:rStyle w:val="apple-tab-span"/>
+          <w:rFonts w:eastAsiaTheme="majorEastAsia"/>
+        </w:rPr>
+        <w:t xml:space="preserve"> </w:t>
+      </w:r>
+      <w:r>
+        <w:t>Location (GPS optional)</w:t>
+      </w:r>
+    </w:p>
+    <w:p>
+      <w:pPr>
+        <w:pStyle w:val="p1"/>
+      </w:pPr>
+      <w:r>
+        <w:t>•</w:t>
+      </w:r>
+      <w:r>
+        <w:rPr>
+          <w:rStyle w:val="apple-tab-span"/>
+          <w:rFonts w:eastAsiaTheme="majorEastAsia"/>
+        </w:rPr>
+        <w:t xml:space="preserve"> </w:t>
+      </w:r>
+      <w:r>
+        <w:t>District</w:t>
+      </w:r>
+    </w:p>
+    <w:p>
+      <w:pPr>
+        <w:pStyle w:val="p1"/>
+      </w:pPr>
+      <w:r>
+        <w:t>•</w:t>
+      </w:r>
+      <w:r>
+        <w:rPr>
+          <w:rStyle w:val="apple-tab-span"/>
+          <w:rFonts w:eastAsiaTheme="majorEastAsia"/>
+        </w:rPr>
+        <w:t xml:space="preserve"> </w:t>
+      </w:r>
+      <w:r>
+        <w:t>Timestamp</w:t>
+      </w:r>
     </w:p>
     <w:p>
       <w:pPr>

</xml_diff>

<commit_message>
doc changed all backend workin no need to change anything
</commit_message>
<xml_diff>
--- a/25027doc.docx
+++ b/25027doc.docx
@@ -4,6 +4,1151 @@
   <w:body>
     <w:p>
       <w:pPr>
+        <w:spacing w:before="100" w:beforeAutospacing="1" w:after="100" w:afterAutospacing="1"/>
+        <w:outlineLvl w:val="2"/>
+        <w:rPr>
+          <w:rFonts w:ascii="Times New Roman" w:eastAsia="Times New Roman" w:hAnsi="Times New Roman" w:cs="Times New Roman"/>
+          <w:b/>
+          <w:bCs/>
+          <w:kern w:val="0"/>
+          <w:sz w:val="27"/>
+          <w:szCs w:val="27"/>
+          <w:lang w:eastAsia="en-GB"/>
+          <w14:ligatures w14:val="none"/>
+        </w:rPr>
+      </w:pPr>
+      <w:r>
+        <w:rPr>
+          <w:rFonts w:ascii="Times New Roman" w:eastAsia="Times New Roman" w:hAnsi="Times New Roman" w:cs="Times New Roman"/>
+          <w:b/>
+          <w:bCs/>
+          <w:kern w:val="0"/>
+          <w:sz w:val="27"/>
+          <w:szCs w:val="27"/>
+          <w:lang w:eastAsia="en-GB"/>
+          <w14:ligatures w14:val="none"/>
+        </w:rPr>
+        <w:t>1. </w:t>
+      </w:r>
+    </w:p>
+    <w:p>
+      <w:pPr>
+        <w:spacing w:before="100" w:beforeAutospacing="1" w:after="100" w:afterAutospacing="1"/>
+        <w:outlineLvl w:val="2"/>
+        <w:rPr>
+          <w:rFonts w:ascii="Times New Roman" w:eastAsia="Times New Roman" w:hAnsi="Times New Roman" w:cs="Times New Roman"/>
+          <w:b/>
+          <w:bCs/>
+          <w:kern w:val="0"/>
+          <w:sz w:val="27"/>
+          <w:szCs w:val="27"/>
+          <w:lang w:eastAsia="en-GB"/>
+          <w14:ligatures w14:val="none"/>
+        </w:rPr>
+      </w:pPr>
+      <w:r>
+        <w:rPr>
+          <w:rFonts w:ascii="Times New Roman" w:eastAsia="Times New Roman" w:hAnsi="Times New Roman" w:cs="Times New Roman"/>
+          <w:b/>
+          <w:bCs/>
+          <w:kern w:val="0"/>
+          <w:sz w:val="27"/>
+          <w:szCs w:val="27"/>
+          <w:lang w:eastAsia="en-GB"/>
+          <w14:ligatures w14:val="none"/>
+        </w:rPr>
+        <w:t>Automatic Tamper Alert + Recovery</w:t>
+      </w:r>
+    </w:p>
+    <w:p>
+      <w:pPr>
+        <w:numPr>
+          <w:ilvl w:val="0"/>
+          <w:numId w:val="31"/>
+        </w:numPr>
+        <w:spacing w:before="100" w:beforeAutospacing="1" w:after="100" w:afterAutospacing="1"/>
+        <w:rPr>
+          <w:rFonts w:ascii="Times New Roman" w:eastAsia="Times New Roman" w:hAnsi="Times New Roman" w:cs="Times New Roman"/>
+          <w:kern w:val="0"/>
+          <w:lang w:eastAsia="en-GB"/>
+          <w14:ligatures w14:val="none"/>
+        </w:rPr>
+      </w:pPr>
+      <w:r>
+        <w:rPr>
+          <w:rFonts w:ascii="Times New Roman" w:eastAsia="Times New Roman" w:hAnsi="Times New Roman" w:cs="Times New Roman"/>
+          <w:kern w:val="0"/>
+          <w:lang w:eastAsia="en-GB"/>
+          <w14:ligatures w14:val="none"/>
+        </w:rPr>
+        <w:t xml:space="preserve">The system doesn’t just fail silently; it </w:t>
+      </w:r>
+      <w:r>
+        <w:rPr>
+          <w:rFonts w:ascii="Times New Roman" w:eastAsia="Times New Roman" w:hAnsi="Times New Roman" w:cs="Times New Roman"/>
+          <w:b/>
+          <w:bCs/>
+          <w:kern w:val="0"/>
+          <w:lang w:eastAsia="en-GB"/>
+          <w14:ligatures w14:val="none"/>
+        </w:rPr>
+        <w:t>detects tampering every 5 seconds</w:t>
+      </w:r>
+      <w:r>
+        <w:rPr>
+          <w:rFonts w:ascii="Times New Roman" w:eastAsia="Times New Roman" w:hAnsi="Times New Roman" w:cs="Times New Roman"/>
+          <w:kern w:val="0"/>
+          <w:lang w:eastAsia="en-GB"/>
+          <w14:ligatures w14:val="none"/>
+        </w:rPr>
+        <w:t xml:space="preserve"> and restores the blockchain automatically.</w:t>
+      </w:r>
+    </w:p>
+    <w:p>
+      <w:pPr>
+        <w:numPr>
+          <w:ilvl w:val="0"/>
+          <w:numId w:val="31"/>
+        </w:numPr>
+        <w:spacing w:before="100" w:beforeAutospacing="1" w:after="100" w:afterAutospacing="1"/>
+        <w:rPr>
+          <w:rFonts w:ascii="Times New Roman" w:eastAsia="Times New Roman" w:hAnsi="Times New Roman" w:cs="Times New Roman"/>
+          <w:kern w:val="0"/>
+          <w:lang w:eastAsia="en-GB"/>
+          <w14:ligatures w14:val="none"/>
+        </w:rPr>
+      </w:pPr>
+      <w:r>
+        <w:rPr>
+          <w:rFonts w:ascii="Times New Roman" w:eastAsia="Times New Roman" w:hAnsi="Times New Roman" w:cs="Times New Roman"/>
+          <w:kern w:val="0"/>
+          <w:lang w:eastAsia="en-GB"/>
+          <w14:ligatures w14:val="none"/>
+        </w:rPr>
+        <w:t xml:space="preserve">Judges will notice: this </w:t>
+      </w:r>
+      <w:r>
+        <w:rPr>
+          <w:rFonts w:ascii="Times New Roman" w:eastAsia="Times New Roman" w:hAnsi="Times New Roman" w:cs="Times New Roman"/>
+          <w:b/>
+          <w:bCs/>
+          <w:kern w:val="0"/>
+          <w:lang w:eastAsia="en-GB"/>
+          <w14:ligatures w14:val="none"/>
+        </w:rPr>
+        <w:t>proactive safety mechanism</w:t>
+      </w:r>
+      <w:r>
+        <w:rPr>
+          <w:rFonts w:ascii="Times New Roman" w:eastAsia="Times New Roman" w:hAnsi="Times New Roman" w:cs="Times New Roman"/>
+          <w:kern w:val="0"/>
+          <w:lang w:eastAsia="en-GB"/>
+          <w14:ligatures w14:val="none"/>
+        </w:rPr>
+        <w:t xml:space="preserve"> is better than “just erase corrupted data.”</w:t>
+      </w:r>
+    </w:p>
+    <w:p>
+      <w:pPr>
+        <w:rPr>
+          <w:rFonts w:ascii="Times New Roman" w:eastAsia="Times New Roman" w:hAnsi="Times New Roman" w:cs="Times New Roman"/>
+          <w:kern w:val="0"/>
+          <w:lang w:eastAsia="en-GB"/>
+          <w14:ligatures w14:val="none"/>
+        </w:rPr>
+      </w:pPr>
+      <w:r>
+        <w:rPr>
+          <w:rFonts w:ascii="Times New Roman" w:eastAsia="Times New Roman" w:hAnsi="Times New Roman" w:cs="Times New Roman"/>
+          <w:noProof/>
+          <w:kern w:val="0"/>
+          <w:lang w:eastAsia="en-GB"/>
+        </w:rPr>
+        <w:pict w14:anchorId="2444BF05">
+          <v:rect id="_x0000_i1039" alt="" style="width:451.3pt;height:.05pt;mso-width-percent:0;mso-height-percent:0;mso-width-percent:0;mso-height-percent:0" o:hralign="center" o:hrstd="t" o:hr="t" fillcolor="#a0a0a0" stroked="f"/>
+        </w:pict>
+      </w:r>
+    </w:p>
+    <w:p>
+      <w:pPr>
+        <w:spacing w:before="100" w:beforeAutospacing="1" w:after="100" w:afterAutospacing="1"/>
+        <w:outlineLvl w:val="2"/>
+        <w:rPr>
+          <w:rFonts w:ascii="Times New Roman" w:eastAsia="Times New Roman" w:hAnsi="Times New Roman" w:cs="Times New Roman"/>
+          <w:b/>
+          <w:bCs/>
+          <w:kern w:val="0"/>
+          <w:sz w:val="27"/>
+          <w:szCs w:val="27"/>
+          <w:lang w:eastAsia="en-GB"/>
+          <w14:ligatures w14:val="none"/>
+        </w:rPr>
+      </w:pPr>
+      <w:r>
+        <w:rPr>
+          <w:rFonts w:ascii="Times New Roman" w:eastAsia="Times New Roman" w:hAnsi="Times New Roman" w:cs="Times New Roman"/>
+          <w:b/>
+          <w:bCs/>
+          <w:kern w:val="0"/>
+          <w:sz w:val="27"/>
+          <w:szCs w:val="27"/>
+          <w:lang w:eastAsia="en-GB"/>
+          <w14:ligatures w14:val="none"/>
+        </w:rPr>
+        <w:t>2. </w:t>
+      </w:r>
+    </w:p>
+    <w:p>
+      <w:pPr>
+        <w:spacing w:before="100" w:beforeAutospacing="1" w:after="100" w:afterAutospacing="1"/>
+        <w:outlineLvl w:val="2"/>
+        <w:rPr>
+          <w:rFonts w:ascii="Times New Roman" w:eastAsia="Times New Roman" w:hAnsi="Times New Roman" w:cs="Times New Roman"/>
+          <w:b/>
+          <w:bCs/>
+          <w:kern w:val="0"/>
+          <w:sz w:val="27"/>
+          <w:szCs w:val="27"/>
+          <w:lang w:eastAsia="en-GB"/>
+          <w14:ligatures w14:val="none"/>
+        </w:rPr>
+      </w:pPr>
+      <w:r>
+        <w:rPr>
+          <w:rFonts w:ascii="Times New Roman" w:eastAsia="Times New Roman" w:hAnsi="Times New Roman" w:cs="Times New Roman"/>
+          <w:b/>
+          <w:bCs/>
+          <w:kern w:val="0"/>
+          <w:sz w:val="27"/>
+          <w:szCs w:val="27"/>
+          <w:lang w:eastAsia="en-GB"/>
+          <w14:ligatures w14:val="none"/>
+        </w:rPr>
+        <w:t>Timestamped Backup for Forensics</w:t>
+      </w:r>
+    </w:p>
+    <w:p>
+      <w:pPr>
+        <w:numPr>
+          <w:ilvl w:val="0"/>
+          <w:numId w:val="32"/>
+        </w:numPr>
+        <w:spacing w:before="100" w:beforeAutospacing="1" w:after="100" w:afterAutospacing="1"/>
+        <w:rPr>
+          <w:rFonts w:ascii="Times New Roman" w:eastAsia="Times New Roman" w:hAnsi="Times New Roman" w:cs="Times New Roman"/>
+          <w:kern w:val="0"/>
+          <w:lang w:eastAsia="en-GB"/>
+          <w14:ligatures w14:val="none"/>
+        </w:rPr>
+      </w:pPr>
+      <w:r>
+        <w:rPr>
+          <w:rFonts w:ascii="Times New Roman" w:eastAsia="Times New Roman" w:hAnsi="Times New Roman" w:cs="Times New Roman"/>
+          <w:kern w:val="0"/>
+          <w:lang w:eastAsia="en-GB"/>
+          <w14:ligatures w14:val="none"/>
+        </w:rPr>
+        <w:t xml:space="preserve">Every backup has a </w:t>
+      </w:r>
+      <w:r>
+        <w:rPr>
+          <w:rFonts w:ascii="Times New Roman" w:eastAsia="Times New Roman" w:hAnsi="Times New Roman" w:cs="Times New Roman"/>
+          <w:b/>
+          <w:bCs/>
+          <w:kern w:val="0"/>
+          <w:lang w:eastAsia="en-GB"/>
+          <w14:ligatures w14:val="none"/>
+        </w:rPr>
+        <w:t>precise IST timestamp</w:t>
+      </w:r>
+      <w:r>
+        <w:rPr>
+          <w:rFonts w:ascii="Times New Roman" w:eastAsia="Times New Roman" w:hAnsi="Times New Roman" w:cs="Times New Roman"/>
+          <w:kern w:val="0"/>
+          <w:lang w:eastAsia="en-GB"/>
+          <w14:ligatures w14:val="none"/>
+        </w:rPr>
+        <w:t xml:space="preserve">, making it easy to </w:t>
+      </w:r>
+      <w:r>
+        <w:rPr>
+          <w:rFonts w:ascii="Times New Roman" w:eastAsia="Times New Roman" w:hAnsi="Times New Roman" w:cs="Times New Roman"/>
+          <w:b/>
+          <w:bCs/>
+          <w:kern w:val="0"/>
+          <w:lang w:eastAsia="en-GB"/>
+          <w14:ligatures w14:val="none"/>
+        </w:rPr>
+        <w:t>audit historical states</w:t>
+      </w:r>
+      <w:r>
+        <w:rPr>
+          <w:rFonts w:ascii="Times New Roman" w:eastAsia="Times New Roman" w:hAnsi="Times New Roman" w:cs="Times New Roman"/>
+          <w:kern w:val="0"/>
+          <w:lang w:eastAsia="en-GB"/>
+          <w14:ligatures w14:val="none"/>
+        </w:rPr>
+        <w:t>.</w:t>
+      </w:r>
+    </w:p>
+    <w:p>
+      <w:pPr>
+        <w:numPr>
+          <w:ilvl w:val="0"/>
+          <w:numId w:val="32"/>
+        </w:numPr>
+        <w:spacing w:before="100" w:beforeAutospacing="1" w:after="100" w:afterAutospacing="1"/>
+        <w:rPr>
+          <w:rFonts w:ascii="Times New Roman" w:eastAsia="Times New Roman" w:hAnsi="Times New Roman" w:cs="Times New Roman"/>
+          <w:kern w:val="0"/>
+          <w:lang w:eastAsia="en-GB"/>
+          <w14:ligatures w14:val="none"/>
+        </w:rPr>
+      </w:pPr>
+      <w:r>
+        <w:rPr>
+          <w:rFonts w:ascii="Times New Roman" w:eastAsia="Times New Roman" w:hAnsi="Times New Roman" w:cs="Times New Roman"/>
+          <w:kern w:val="0"/>
+          <w:lang w:eastAsia="en-GB"/>
+          <w14:ligatures w14:val="none"/>
+        </w:rPr>
+        <w:t xml:space="preserve">If a regulator or inspector asks “when was this batch approved?” you can </w:t>
+      </w:r>
+      <w:r>
+        <w:rPr>
+          <w:rFonts w:ascii="Times New Roman" w:eastAsia="Times New Roman" w:hAnsi="Times New Roman" w:cs="Times New Roman"/>
+          <w:b/>
+          <w:bCs/>
+          <w:kern w:val="0"/>
+          <w:lang w:eastAsia="en-GB"/>
+          <w14:ligatures w14:val="none"/>
+        </w:rPr>
+        <w:t>trace the exact time and state</w:t>
+      </w:r>
+      <w:r>
+        <w:rPr>
+          <w:rFonts w:ascii="Times New Roman" w:eastAsia="Times New Roman" w:hAnsi="Times New Roman" w:cs="Times New Roman"/>
+          <w:kern w:val="0"/>
+          <w:lang w:eastAsia="en-GB"/>
+          <w14:ligatures w14:val="none"/>
+        </w:rPr>
+        <w:t>.</w:t>
+      </w:r>
+    </w:p>
+    <w:p>
+      <w:pPr>
+        <w:rPr>
+          <w:rFonts w:ascii="Times New Roman" w:eastAsia="Times New Roman" w:hAnsi="Times New Roman" w:cs="Times New Roman"/>
+          <w:kern w:val="0"/>
+          <w:lang w:eastAsia="en-GB"/>
+          <w14:ligatures w14:val="none"/>
+        </w:rPr>
+      </w:pPr>
+      <w:r>
+        <w:rPr>
+          <w:rFonts w:ascii="Times New Roman" w:eastAsia="Times New Roman" w:hAnsi="Times New Roman" w:cs="Times New Roman"/>
+          <w:noProof/>
+          <w:kern w:val="0"/>
+          <w:lang w:eastAsia="en-GB"/>
+        </w:rPr>
+        <w:pict w14:anchorId="7C60F396">
+          <v:rect id="_x0000_i1038" alt="" style="width:451.3pt;height:.05pt;mso-width-percent:0;mso-height-percent:0;mso-width-percent:0;mso-height-percent:0" o:hralign="center" o:hrstd="t" o:hr="t" fillcolor="#a0a0a0" stroked="f"/>
+        </w:pict>
+      </w:r>
+    </w:p>
+    <w:p>
+      <w:pPr>
+        <w:spacing w:before="100" w:beforeAutospacing="1" w:after="100" w:afterAutospacing="1"/>
+        <w:outlineLvl w:val="2"/>
+        <w:rPr>
+          <w:rFonts w:ascii="Times New Roman" w:eastAsia="Times New Roman" w:hAnsi="Times New Roman" w:cs="Times New Roman"/>
+          <w:b/>
+          <w:bCs/>
+          <w:kern w:val="0"/>
+          <w:sz w:val="27"/>
+          <w:szCs w:val="27"/>
+          <w:lang w:eastAsia="en-GB"/>
+          <w14:ligatures w14:val="none"/>
+        </w:rPr>
+      </w:pPr>
+      <w:r>
+        <w:rPr>
+          <w:rFonts w:ascii="Times New Roman" w:eastAsia="Times New Roman" w:hAnsi="Times New Roman" w:cs="Times New Roman"/>
+          <w:b/>
+          <w:bCs/>
+          <w:kern w:val="0"/>
+          <w:sz w:val="27"/>
+          <w:szCs w:val="27"/>
+          <w:lang w:eastAsia="en-GB"/>
+          <w14:ligatures w14:val="none"/>
+        </w:rPr>
+        <w:t>3. </w:t>
+      </w:r>
+    </w:p>
+    <w:p>
+      <w:pPr>
+        <w:spacing w:before="100" w:beforeAutospacing="1" w:after="100" w:afterAutospacing="1"/>
+        <w:outlineLvl w:val="2"/>
+        <w:rPr>
+          <w:rFonts w:ascii="Times New Roman" w:eastAsia="Times New Roman" w:hAnsi="Times New Roman" w:cs="Times New Roman"/>
+          <w:b/>
+          <w:bCs/>
+          <w:kern w:val="0"/>
+          <w:sz w:val="27"/>
+          <w:szCs w:val="27"/>
+          <w:lang w:eastAsia="en-GB"/>
+          <w14:ligatures w14:val="none"/>
+        </w:rPr>
+      </w:pPr>
+      <w:r>
+        <w:rPr>
+          <w:rFonts w:ascii="Times New Roman" w:eastAsia="Times New Roman" w:hAnsi="Times New Roman" w:cs="Times New Roman"/>
+          <w:b/>
+          <w:bCs/>
+          <w:kern w:val="0"/>
+          <w:sz w:val="27"/>
+          <w:szCs w:val="27"/>
+          <w:lang w:eastAsia="en-GB"/>
+          <w14:ligatures w14:val="none"/>
+        </w:rPr>
+        <w:t>Minimal Data Exposure</w:t>
+      </w:r>
+    </w:p>
+    <w:p>
+      <w:pPr>
+        <w:numPr>
+          <w:ilvl w:val="0"/>
+          <w:numId w:val="33"/>
+        </w:numPr>
+        <w:spacing w:before="100" w:beforeAutospacing="1" w:after="100" w:afterAutospacing="1"/>
+        <w:rPr>
+          <w:rFonts w:ascii="Times New Roman" w:eastAsia="Times New Roman" w:hAnsi="Times New Roman" w:cs="Times New Roman"/>
+          <w:kern w:val="0"/>
+          <w:lang w:eastAsia="en-GB"/>
+          <w14:ligatures w14:val="none"/>
+        </w:rPr>
+      </w:pPr>
+      <w:r>
+        <w:rPr>
+          <w:rFonts w:ascii="Times New Roman" w:eastAsia="Times New Roman" w:hAnsi="Times New Roman" w:cs="Times New Roman"/>
+          <w:kern w:val="0"/>
+          <w:lang w:eastAsia="en-GB"/>
+          <w14:ligatures w14:val="none"/>
+        </w:rPr>
+        <w:t xml:space="preserve">Only essential data like </w:t>
+      </w:r>
+      <w:r>
+        <w:rPr>
+          <w:rFonts w:ascii="Times New Roman" w:eastAsia="Times New Roman" w:hAnsi="Times New Roman" w:cs="Times New Roman"/>
+          <w:b/>
+          <w:bCs/>
+          <w:kern w:val="0"/>
+          <w:lang w:eastAsia="en-GB"/>
+          <w14:ligatures w14:val="none"/>
+        </w:rPr>
+        <w:t>herbs, batch ID, or medicine info</w:t>
+      </w:r>
+      <w:r>
+        <w:rPr>
+          <w:rFonts w:ascii="Times New Roman" w:eastAsia="Times New Roman" w:hAnsi="Times New Roman" w:cs="Times New Roman"/>
+          <w:kern w:val="0"/>
+          <w:lang w:eastAsia="en-GB"/>
+          <w14:ligatures w14:val="none"/>
+        </w:rPr>
+        <w:t xml:space="preserve"> is stored in the blockchain.</w:t>
+      </w:r>
+    </w:p>
+    <w:p>
+      <w:pPr>
+        <w:numPr>
+          <w:ilvl w:val="0"/>
+          <w:numId w:val="33"/>
+        </w:numPr>
+        <w:spacing w:before="100" w:beforeAutospacing="1" w:after="100" w:afterAutospacing="1"/>
+        <w:rPr>
+          <w:rFonts w:ascii="Times New Roman" w:eastAsia="Times New Roman" w:hAnsi="Times New Roman" w:cs="Times New Roman"/>
+          <w:kern w:val="0"/>
+          <w:lang w:eastAsia="en-GB"/>
+          <w14:ligatures w14:val="none"/>
+        </w:rPr>
+      </w:pPr>
+      <w:r>
+        <w:rPr>
+          <w:rFonts w:ascii="Times New Roman" w:eastAsia="Times New Roman" w:hAnsi="Times New Roman" w:cs="Times New Roman"/>
+          <w:kern w:val="0"/>
+          <w:lang w:eastAsia="en-GB"/>
+          <w14:ligatures w14:val="none"/>
+        </w:rPr>
+        <w:t xml:space="preserve">Sensitive details (e.g., farmer contact info) remain </w:t>
+      </w:r>
+      <w:r>
+        <w:rPr>
+          <w:rFonts w:ascii="Times New Roman" w:eastAsia="Times New Roman" w:hAnsi="Times New Roman" w:cs="Times New Roman"/>
+          <w:b/>
+          <w:bCs/>
+          <w:kern w:val="0"/>
+          <w:lang w:eastAsia="en-GB"/>
+          <w14:ligatures w14:val="none"/>
+        </w:rPr>
+        <w:t>off-chain</w:t>
+      </w:r>
+      <w:r>
+        <w:rPr>
+          <w:rFonts w:ascii="Times New Roman" w:eastAsia="Times New Roman" w:hAnsi="Times New Roman" w:cs="Times New Roman"/>
+          <w:kern w:val="0"/>
+          <w:lang w:eastAsia="en-GB"/>
+          <w14:ligatures w14:val="none"/>
+        </w:rPr>
+        <w:t xml:space="preserve">, reducing risk while maintaining </w:t>
+      </w:r>
+      <w:r>
+        <w:rPr>
+          <w:rFonts w:ascii="Times New Roman" w:eastAsia="Times New Roman" w:hAnsi="Times New Roman" w:cs="Times New Roman"/>
+          <w:b/>
+          <w:bCs/>
+          <w:kern w:val="0"/>
+          <w:lang w:eastAsia="en-GB"/>
+          <w14:ligatures w14:val="none"/>
+        </w:rPr>
+        <w:t>traceability</w:t>
+      </w:r>
+      <w:r>
+        <w:rPr>
+          <w:rFonts w:ascii="Times New Roman" w:eastAsia="Times New Roman" w:hAnsi="Times New Roman" w:cs="Times New Roman"/>
+          <w:kern w:val="0"/>
+          <w:lang w:eastAsia="en-GB"/>
+          <w14:ligatures w14:val="none"/>
+        </w:rPr>
+        <w:t>.</w:t>
+      </w:r>
+    </w:p>
+    <w:p>
+      <w:pPr>
+        <w:rPr>
+          <w:rFonts w:ascii="Times New Roman" w:eastAsia="Times New Roman" w:hAnsi="Times New Roman" w:cs="Times New Roman"/>
+          <w:kern w:val="0"/>
+          <w:lang w:eastAsia="en-GB"/>
+          <w14:ligatures w14:val="none"/>
+        </w:rPr>
+      </w:pPr>
+      <w:r>
+        <w:rPr>
+          <w:rFonts w:ascii="Times New Roman" w:eastAsia="Times New Roman" w:hAnsi="Times New Roman" w:cs="Times New Roman"/>
+          <w:noProof/>
+          <w:kern w:val="0"/>
+          <w:lang w:eastAsia="en-GB"/>
+        </w:rPr>
+        <w:pict w14:anchorId="2E6DBA5A">
+          <v:rect id="_x0000_i1037" alt="" style="width:451.3pt;height:.05pt;mso-width-percent:0;mso-height-percent:0;mso-width-percent:0;mso-height-percent:0" o:hralign="center" o:hrstd="t" o:hr="t" fillcolor="#a0a0a0" stroked="f"/>
+        </w:pict>
+      </w:r>
+    </w:p>
+    <w:p>
+      <w:pPr>
+        <w:spacing w:before="100" w:beforeAutospacing="1" w:after="100" w:afterAutospacing="1"/>
+        <w:outlineLvl w:val="2"/>
+        <w:rPr>
+          <w:rFonts w:ascii="Times New Roman" w:eastAsia="Times New Roman" w:hAnsi="Times New Roman" w:cs="Times New Roman"/>
+          <w:b/>
+          <w:bCs/>
+          <w:kern w:val="0"/>
+          <w:sz w:val="27"/>
+          <w:szCs w:val="27"/>
+          <w:lang w:eastAsia="en-GB"/>
+          <w14:ligatures w14:val="none"/>
+        </w:rPr>
+      </w:pPr>
+      <w:r>
+        <w:rPr>
+          <w:rFonts w:ascii="Times New Roman" w:eastAsia="Times New Roman" w:hAnsi="Times New Roman" w:cs="Times New Roman"/>
+          <w:b/>
+          <w:bCs/>
+          <w:kern w:val="0"/>
+          <w:sz w:val="27"/>
+          <w:szCs w:val="27"/>
+          <w:lang w:eastAsia="en-GB"/>
+          <w14:ligatures w14:val="none"/>
+        </w:rPr>
+        <w:t>4. </w:t>
+      </w:r>
+    </w:p>
+    <w:p>
+      <w:pPr>
+        <w:spacing w:before="100" w:beforeAutospacing="1" w:after="100" w:afterAutospacing="1"/>
+        <w:outlineLvl w:val="2"/>
+        <w:rPr>
+          <w:rFonts w:ascii="Times New Roman" w:eastAsia="Times New Roman" w:hAnsi="Times New Roman" w:cs="Times New Roman"/>
+          <w:b/>
+          <w:bCs/>
+          <w:kern w:val="0"/>
+          <w:sz w:val="27"/>
+          <w:szCs w:val="27"/>
+          <w:lang w:eastAsia="en-GB"/>
+          <w14:ligatures w14:val="none"/>
+        </w:rPr>
+      </w:pPr>
+      <w:r>
+        <w:rPr>
+          <w:rFonts w:ascii="Times New Roman" w:eastAsia="Times New Roman" w:hAnsi="Times New Roman" w:cs="Times New Roman"/>
+          <w:b/>
+          <w:bCs/>
+          <w:kern w:val="0"/>
+          <w:sz w:val="27"/>
+          <w:szCs w:val="27"/>
+          <w:lang w:eastAsia="en-GB"/>
+          <w14:ligatures w14:val="none"/>
+        </w:rPr>
+        <w:t>Granular Tamper Detection</w:t>
+      </w:r>
+    </w:p>
+    <w:p>
+      <w:pPr>
+        <w:numPr>
+          <w:ilvl w:val="0"/>
+          <w:numId w:val="34"/>
+        </w:numPr>
+        <w:spacing w:before="100" w:beforeAutospacing="1" w:after="100" w:afterAutospacing="1"/>
+        <w:rPr>
+          <w:rFonts w:ascii="Times New Roman" w:eastAsia="Times New Roman" w:hAnsi="Times New Roman" w:cs="Times New Roman"/>
+          <w:kern w:val="0"/>
+          <w:lang w:eastAsia="en-GB"/>
+          <w14:ligatures w14:val="none"/>
+        </w:rPr>
+      </w:pPr>
+      <w:r>
+        <w:rPr>
+          <w:rFonts w:ascii="Times New Roman" w:eastAsia="Times New Roman" w:hAnsi="Times New Roman" w:cs="Times New Roman"/>
+          <w:kern w:val="0"/>
+          <w:lang w:eastAsia="en-GB"/>
+          <w14:ligatures w14:val="none"/>
+        </w:rPr>
+        <w:t xml:space="preserve">The system doesn’t just flag “chain invalid.” It can pinpoint </w:t>
+      </w:r>
+      <w:r>
+        <w:rPr>
+          <w:rFonts w:ascii="Times New Roman" w:eastAsia="Times New Roman" w:hAnsi="Times New Roman" w:cs="Times New Roman"/>
+          <w:b/>
+          <w:bCs/>
+          <w:kern w:val="0"/>
+          <w:lang w:eastAsia="en-GB"/>
+          <w14:ligatures w14:val="none"/>
+        </w:rPr>
+        <w:t>exactly which block is altered</w:t>
+      </w:r>
+      <w:r>
+        <w:rPr>
+          <w:rFonts w:ascii="Times New Roman" w:eastAsia="Times New Roman" w:hAnsi="Times New Roman" w:cs="Times New Roman"/>
+          <w:kern w:val="0"/>
+          <w:lang w:eastAsia="en-GB"/>
+          <w14:ligatures w14:val="none"/>
+        </w:rPr>
+        <w:t>, making debugging and recovery faster.</w:t>
+      </w:r>
+    </w:p>
+    <w:p>
+      <w:pPr>
+        <w:rPr>
+          <w:rFonts w:ascii="Times New Roman" w:eastAsia="Times New Roman" w:hAnsi="Times New Roman" w:cs="Times New Roman"/>
+          <w:kern w:val="0"/>
+          <w:lang w:eastAsia="en-GB"/>
+          <w14:ligatures w14:val="none"/>
+        </w:rPr>
+      </w:pPr>
+      <w:r>
+        <w:rPr>
+          <w:rFonts w:ascii="Times New Roman" w:eastAsia="Times New Roman" w:hAnsi="Times New Roman" w:cs="Times New Roman"/>
+          <w:noProof/>
+          <w:kern w:val="0"/>
+          <w:lang w:eastAsia="en-GB"/>
+        </w:rPr>
+        <w:pict w14:anchorId="4292E816">
+          <v:rect id="_x0000_i1036" alt="" style="width:451.3pt;height:.05pt;mso-width-percent:0;mso-height-percent:0;mso-width-percent:0;mso-height-percent:0" o:hralign="center" o:hrstd="t" o:hr="t" fillcolor="#a0a0a0" stroked="f"/>
+        </w:pict>
+      </w:r>
+    </w:p>
+    <w:p>
+      <w:pPr>
+        <w:spacing w:before="100" w:beforeAutospacing="1" w:after="100" w:afterAutospacing="1"/>
+        <w:outlineLvl w:val="2"/>
+        <w:rPr>
+          <w:rFonts w:ascii="Times New Roman" w:eastAsia="Times New Roman" w:hAnsi="Times New Roman" w:cs="Times New Roman"/>
+          <w:b/>
+          <w:bCs/>
+          <w:kern w:val="0"/>
+          <w:sz w:val="27"/>
+          <w:szCs w:val="27"/>
+          <w:lang w:eastAsia="en-GB"/>
+          <w14:ligatures w14:val="none"/>
+        </w:rPr>
+      </w:pPr>
+      <w:r>
+        <w:rPr>
+          <w:rFonts w:ascii="Times New Roman" w:eastAsia="Times New Roman" w:hAnsi="Times New Roman" w:cs="Times New Roman"/>
+          <w:b/>
+          <w:bCs/>
+          <w:kern w:val="0"/>
+          <w:sz w:val="27"/>
+          <w:szCs w:val="27"/>
+          <w:lang w:eastAsia="en-GB"/>
+          <w14:ligatures w14:val="none"/>
+        </w:rPr>
+        <w:t>5. </w:t>
+      </w:r>
+    </w:p>
+    <w:p>
+      <w:pPr>
+        <w:spacing w:before="100" w:beforeAutospacing="1" w:after="100" w:afterAutospacing="1"/>
+        <w:outlineLvl w:val="2"/>
+        <w:rPr>
+          <w:rFonts w:ascii="Times New Roman" w:eastAsia="Times New Roman" w:hAnsi="Times New Roman" w:cs="Times New Roman"/>
+          <w:b/>
+          <w:bCs/>
+          <w:kern w:val="0"/>
+          <w:sz w:val="27"/>
+          <w:szCs w:val="27"/>
+          <w:lang w:eastAsia="en-GB"/>
+          <w14:ligatures w14:val="none"/>
+        </w:rPr>
+      </w:pPr>
+      <w:r>
+        <w:rPr>
+          <w:rFonts w:ascii="Times New Roman" w:eastAsia="Times New Roman" w:hAnsi="Times New Roman" w:cs="Times New Roman"/>
+          <w:b/>
+          <w:bCs/>
+          <w:kern w:val="0"/>
+          <w:sz w:val="27"/>
+          <w:szCs w:val="27"/>
+          <w:lang w:eastAsia="en-GB"/>
+          <w14:ligatures w14:val="none"/>
+        </w:rPr>
+        <w:t>Prototype-to-Production Ready</w:t>
+      </w:r>
+    </w:p>
+    <w:p>
+      <w:pPr>
+        <w:numPr>
+          <w:ilvl w:val="0"/>
+          <w:numId w:val="35"/>
+        </w:numPr>
+        <w:spacing w:before="100" w:beforeAutospacing="1" w:after="100" w:afterAutospacing="1"/>
+        <w:rPr>
+          <w:rFonts w:ascii="Times New Roman" w:eastAsia="Times New Roman" w:hAnsi="Times New Roman" w:cs="Times New Roman"/>
+          <w:kern w:val="0"/>
+          <w:lang w:eastAsia="en-GB"/>
+          <w14:ligatures w14:val="none"/>
+        </w:rPr>
+      </w:pPr>
+      <w:r>
+        <w:rPr>
+          <w:rFonts w:ascii="Times New Roman" w:eastAsia="Times New Roman" w:hAnsi="Times New Roman" w:cs="Times New Roman"/>
+          <w:kern w:val="0"/>
+          <w:lang w:eastAsia="en-GB"/>
+          <w14:ligatures w14:val="none"/>
+        </w:rPr>
+        <w:t xml:space="preserve">Judges love seeing </w:t>
+      </w:r>
+      <w:r>
+        <w:rPr>
+          <w:rFonts w:ascii="Times New Roman" w:eastAsia="Times New Roman" w:hAnsi="Times New Roman" w:cs="Times New Roman"/>
+          <w:b/>
+          <w:bCs/>
+          <w:kern w:val="0"/>
+          <w:lang w:eastAsia="en-GB"/>
+          <w14:ligatures w14:val="none"/>
+        </w:rPr>
+        <w:t>future-proof thinking</w:t>
+      </w:r>
+      <w:r>
+        <w:rPr>
+          <w:rFonts w:ascii="Times New Roman" w:eastAsia="Times New Roman" w:hAnsi="Times New Roman" w:cs="Times New Roman"/>
+          <w:kern w:val="0"/>
+          <w:lang w:eastAsia="en-GB"/>
+          <w14:ligatures w14:val="none"/>
+        </w:rPr>
+        <w:t>.</w:t>
+      </w:r>
+    </w:p>
+    <w:p>
+      <w:pPr>
+        <w:numPr>
+          <w:ilvl w:val="0"/>
+          <w:numId w:val="35"/>
+        </w:numPr>
+        <w:spacing w:before="100" w:beforeAutospacing="1" w:after="100" w:afterAutospacing="1"/>
+        <w:rPr>
+          <w:rFonts w:ascii="Times New Roman" w:eastAsia="Times New Roman" w:hAnsi="Times New Roman" w:cs="Times New Roman"/>
+          <w:kern w:val="0"/>
+          <w:lang w:eastAsia="en-GB"/>
+          <w14:ligatures w14:val="none"/>
+        </w:rPr>
+      </w:pPr>
+      <w:r>
+        <w:rPr>
+          <w:rFonts w:ascii="Times New Roman" w:eastAsia="Times New Roman" w:hAnsi="Times New Roman" w:cs="Times New Roman"/>
+          <w:kern w:val="0"/>
+          <w:lang w:eastAsia="en-GB"/>
+          <w14:ligatures w14:val="none"/>
+        </w:rPr>
+        <w:lastRenderedPageBreak/>
+        <w:t xml:space="preserve">You can explain: “This is a prototype. In production, we can add </w:t>
+      </w:r>
+      <w:r>
+        <w:rPr>
+          <w:rFonts w:ascii="Times New Roman" w:eastAsia="Times New Roman" w:hAnsi="Times New Roman" w:cs="Times New Roman"/>
+          <w:b/>
+          <w:bCs/>
+          <w:kern w:val="0"/>
+          <w:lang w:eastAsia="en-GB"/>
+          <w14:ligatures w14:val="none"/>
+        </w:rPr>
+        <w:t>multi-admin approvals, role-based access, and cryptographic signatures</w:t>
+      </w:r>
+      <w:r>
+        <w:rPr>
+          <w:rFonts w:ascii="Times New Roman" w:eastAsia="Times New Roman" w:hAnsi="Times New Roman" w:cs="Times New Roman"/>
+          <w:kern w:val="0"/>
+          <w:lang w:eastAsia="en-GB"/>
+          <w14:ligatures w14:val="none"/>
+        </w:rPr>
+        <w:t xml:space="preserve"> without changing the core logic.”</w:t>
+      </w:r>
+    </w:p>
+    <w:p>
+      <w:pPr>
+        <w:rPr>
+          <w:rFonts w:ascii="Times New Roman" w:eastAsia="Times New Roman" w:hAnsi="Times New Roman" w:cs="Times New Roman"/>
+          <w:kern w:val="0"/>
+          <w:lang w:eastAsia="en-GB"/>
+          <w14:ligatures w14:val="none"/>
+        </w:rPr>
+      </w:pPr>
+      <w:r>
+        <w:rPr>
+          <w:rFonts w:ascii="Times New Roman" w:eastAsia="Times New Roman" w:hAnsi="Times New Roman" w:cs="Times New Roman"/>
+          <w:noProof/>
+          <w:kern w:val="0"/>
+          <w:lang w:eastAsia="en-GB"/>
+        </w:rPr>
+        <w:pict w14:anchorId="18DE6238">
+          <v:rect id="_x0000_i1035" alt="" style="width:451.3pt;height:.05pt;mso-width-percent:0;mso-height-percent:0;mso-width-percent:0;mso-height-percent:0" o:hralign="center" o:hrstd="t" o:hr="t" fillcolor="#a0a0a0" stroked="f"/>
+        </w:pict>
+      </w:r>
+    </w:p>
+    <w:p>
+      <w:pPr>
+        <w:spacing w:before="100" w:beforeAutospacing="1" w:after="100" w:afterAutospacing="1"/>
+        <w:outlineLvl w:val="2"/>
+        <w:rPr>
+          <w:rFonts w:ascii="Times New Roman" w:eastAsia="Times New Roman" w:hAnsi="Times New Roman" w:cs="Times New Roman"/>
+          <w:b/>
+          <w:bCs/>
+          <w:kern w:val="0"/>
+          <w:sz w:val="27"/>
+          <w:szCs w:val="27"/>
+          <w:lang w:eastAsia="en-GB"/>
+          <w14:ligatures w14:val="none"/>
+        </w:rPr>
+      </w:pPr>
+      <w:r>
+        <w:rPr>
+          <w:rFonts w:ascii="Times New Roman" w:eastAsia="Times New Roman" w:hAnsi="Times New Roman" w:cs="Times New Roman"/>
+          <w:b/>
+          <w:bCs/>
+          <w:kern w:val="0"/>
+          <w:sz w:val="27"/>
+          <w:szCs w:val="27"/>
+          <w:lang w:eastAsia="en-GB"/>
+          <w14:ligatures w14:val="none"/>
+        </w:rPr>
+        <w:t>6. </w:t>
+      </w:r>
+    </w:p>
+    <w:p>
+      <w:pPr>
+        <w:spacing w:before="100" w:beforeAutospacing="1" w:after="100" w:afterAutospacing="1"/>
+        <w:outlineLvl w:val="2"/>
+        <w:rPr>
+          <w:rFonts w:ascii="Times New Roman" w:eastAsia="Times New Roman" w:hAnsi="Times New Roman" w:cs="Times New Roman"/>
+          <w:b/>
+          <w:bCs/>
+          <w:kern w:val="0"/>
+          <w:sz w:val="27"/>
+          <w:szCs w:val="27"/>
+          <w:lang w:eastAsia="en-GB"/>
+          <w14:ligatures w14:val="none"/>
+        </w:rPr>
+      </w:pPr>
+      <w:r>
+        <w:rPr>
+          <w:rFonts w:ascii="Times New Roman" w:eastAsia="Times New Roman" w:hAnsi="Times New Roman" w:cs="Times New Roman"/>
+          <w:b/>
+          <w:bCs/>
+          <w:kern w:val="0"/>
+          <w:sz w:val="27"/>
+          <w:szCs w:val="27"/>
+          <w:lang w:eastAsia="en-GB"/>
+          <w14:ligatures w14:val="none"/>
+        </w:rPr>
+        <w:t>Indian Standard Time (IST) Awareness</w:t>
+      </w:r>
+    </w:p>
+    <w:p>
+      <w:pPr>
+        <w:numPr>
+          <w:ilvl w:val="0"/>
+          <w:numId w:val="36"/>
+        </w:numPr>
+        <w:spacing w:before="100" w:beforeAutospacing="1" w:after="100" w:afterAutospacing="1"/>
+        <w:rPr>
+          <w:rFonts w:ascii="Times New Roman" w:eastAsia="Times New Roman" w:hAnsi="Times New Roman" w:cs="Times New Roman"/>
+          <w:kern w:val="0"/>
+          <w:lang w:eastAsia="en-GB"/>
+          <w14:ligatures w14:val="none"/>
+        </w:rPr>
+      </w:pPr>
+      <w:r>
+        <w:rPr>
+          <w:rFonts w:ascii="Times New Roman" w:eastAsia="Times New Roman" w:hAnsi="Times New Roman" w:cs="Times New Roman"/>
+          <w:kern w:val="0"/>
+          <w:lang w:eastAsia="en-GB"/>
+          <w14:ligatures w14:val="none"/>
+        </w:rPr>
+        <w:t xml:space="preserve">All logs, backups, and alerts use </w:t>
+      </w:r>
+      <w:r>
+        <w:rPr>
+          <w:rFonts w:ascii="Times New Roman" w:eastAsia="Times New Roman" w:hAnsi="Times New Roman" w:cs="Times New Roman"/>
+          <w:b/>
+          <w:bCs/>
+          <w:kern w:val="0"/>
+          <w:lang w:eastAsia="en-GB"/>
+          <w14:ligatures w14:val="none"/>
+        </w:rPr>
+        <w:t>IST</w:t>
+      </w:r>
+      <w:r>
+        <w:rPr>
+          <w:rFonts w:ascii="Times New Roman" w:eastAsia="Times New Roman" w:hAnsi="Times New Roman" w:cs="Times New Roman"/>
+          <w:kern w:val="0"/>
+          <w:lang w:eastAsia="en-GB"/>
+          <w14:ligatures w14:val="none"/>
+        </w:rPr>
+        <w:t>, aligning with local regulatory timelines.</w:t>
+      </w:r>
+    </w:p>
+    <w:p>
+      <w:pPr>
+        <w:numPr>
+          <w:ilvl w:val="0"/>
+          <w:numId w:val="36"/>
+        </w:numPr>
+        <w:spacing w:before="100" w:beforeAutospacing="1" w:after="100" w:afterAutospacing="1"/>
+        <w:rPr>
+          <w:rFonts w:ascii="Times New Roman" w:eastAsia="Times New Roman" w:hAnsi="Times New Roman" w:cs="Times New Roman"/>
+          <w:kern w:val="0"/>
+          <w:lang w:eastAsia="en-GB"/>
+          <w14:ligatures w14:val="none"/>
+        </w:rPr>
+      </w:pPr>
+      <w:r>
+        <w:rPr>
+          <w:rFonts w:ascii="Times New Roman" w:eastAsia="Times New Roman" w:hAnsi="Times New Roman" w:cs="Times New Roman"/>
+          <w:kern w:val="0"/>
+          <w:lang w:eastAsia="en-GB"/>
+          <w14:ligatures w14:val="none"/>
+        </w:rPr>
+        <w:t xml:space="preserve">Small detail, but it </w:t>
+      </w:r>
+      <w:r>
+        <w:rPr>
+          <w:rFonts w:ascii="Times New Roman" w:eastAsia="Times New Roman" w:hAnsi="Times New Roman" w:cs="Times New Roman"/>
+          <w:b/>
+          <w:bCs/>
+          <w:kern w:val="0"/>
+          <w:lang w:eastAsia="en-GB"/>
+          <w14:ligatures w14:val="none"/>
+        </w:rPr>
+        <w:t>shows attention to real-world deployment issues</w:t>
+      </w:r>
+      <w:r>
+        <w:rPr>
+          <w:rFonts w:ascii="Times New Roman" w:eastAsia="Times New Roman" w:hAnsi="Times New Roman" w:cs="Times New Roman"/>
+          <w:kern w:val="0"/>
+          <w:lang w:eastAsia="en-GB"/>
+          <w14:ligatures w14:val="none"/>
+        </w:rPr>
+        <w:t>.</w:t>
+      </w:r>
+    </w:p>
+    <w:p>
+      <w:pPr>
+        <w:rPr>
+          <w:rFonts w:ascii="Times New Roman" w:eastAsia="Times New Roman" w:hAnsi="Times New Roman" w:cs="Times New Roman"/>
+          <w:kern w:val="0"/>
+          <w:lang w:eastAsia="en-GB"/>
+          <w14:ligatures w14:val="none"/>
+        </w:rPr>
+      </w:pPr>
+      <w:r>
+        <w:rPr>
+          <w:rFonts w:ascii="Times New Roman" w:eastAsia="Times New Roman" w:hAnsi="Times New Roman" w:cs="Times New Roman"/>
+          <w:noProof/>
+          <w:kern w:val="0"/>
+          <w:lang w:eastAsia="en-GB"/>
+        </w:rPr>
+        <w:pict w14:anchorId="266ACA19">
+          <v:rect id="_x0000_i1034" alt="" style="width:451.3pt;height:.05pt;mso-width-percent:0;mso-height-percent:0;mso-width-percent:0;mso-height-percent:0" o:hralign="center" o:hrstd="t" o:hr="t" fillcolor="#a0a0a0" stroked="f"/>
+        </w:pict>
+      </w:r>
+    </w:p>
+    <w:p>
+      <w:pPr>
+        <w:spacing w:before="100" w:beforeAutospacing="1" w:after="100" w:afterAutospacing="1"/>
+        <w:outlineLvl w:val="2"/>
+        <w:rPr>
+          <w:rFonts w:ascii="Times New Roman" w:eastAsia="Times New Roman" w:hAnsi="Times New Roman" w:cs="Times New Roman"/>
+          <w:b/>
+          <w:bCs/>
+          <w:kern w:val="0"/>
+          <w:sz w:val="27"/>
+          <w:szCs w:val="27"/>
+          <w:lang w:eastAsia="en-GB"/>
+          <w14:ligatures w14:val="none"/>
+        </w:rPr>
+      </w:pPr>
+      <w:r>
+        <w:rPr>
+          <w:rFonts w:ascii="Times New Roman" w:eastAsia="Times New Roman" w:hAnsi="Times New Roman" w:cs="Times New Roman"/>
+          <w:b/>
+          <w:bCs/>
+          <w:kern w:val="0"/>
+          <w:sz w:val="27"/>
+          <w:szCs w:val="27"/>
+          <w:lang w:eastAsia="en-GB"/>
+          <w14:ligatures w14:val="none"/>
+        </w:rPr>
+        <w:t>7. </w:t>
+      </w:r>
+    </w:p>
+    <w:p>
+      <w:pPr>
+        <w:spacing w:before="100" w:beforeAutospacing="1" w:after="100" w:afterAutospacing="1"/>
+        <w:outlineLvl w:val="2"/>
+        <w:rPr>
+          <w:rFonts w:ascii="Times New Roman" w:eastAsia="Times New Roman" w:hAnsi="Times New Roman" w:cs="Times New Roman"/>
+          <w:b/>
+          <w:bCs/>
+          <w:kern w:val="0"/>
+          <w:sz w:val="27"/>
+          <w:szCs w:val="27"/>
+          <w:lang w:eastAsia="en-GB"/>
+          <w14:ligatures w14:val="none"/>
+        </w:rPr>
+      </w:pPr>
+      <w:r>
+        <w:rPr>
+          <w:rFonts w:ascii="Times New Roman" w:eastAsia="Times New Roman" w:hAnsi="Times New Roman" w:cs="Times New Roman"/>
+          <w:b/>
+          <w:bCs/>
+          <w:kern w:val="0"/>
+          <w:sz w:val="27"/>
+          <w:szCs w:val="27"/>
+          <w:lang w:eastAsia="en-GB"/>
+          <w14:ligatures w14:val="none"/>
+        </w:rPr>
+        <w:t>Audit Trail for Compliance</w:t>
+      </w:r>
+    </w:p>
+    <w:p>
+      <w:pPr>
+        <w:numPr>
+          <w:ilvl w:val="0"/>
+          <w:numId w:val="37"/>
+        </w:numPr>
+        <w:spacing w:before="100" w:beforeAutospacing="1" w:after="100" w:afterAutospacing="1"/>
+        <w:rPr>
+          <w:rFonts w:ascii="Times New Roman" w:eastAsia="Times New Roman" w:hAnsi="Times New Roman" w:cs="Times New Roman"/>
+          <w:kern w:val="0"/>
+          <w:lang w:eastAsia="en-GB"/>
+          <w14:ligatures w14:val="none"/>
+        </w:rPr>
+      </w:pPr>
+      <w:r>
+        <w:rPr>
+          <w:rFonts w:ascii="Times New Roman" w:eastAsia="Times New Roman" w:hAnsi="Times New Roman" w:cs="Times New Roman"/>
+          <w:kern w:val="0"/>
+          <w:lang w:eastAsia="en-GB"/>
+          <w14:ligatures w14:val="none"/>
+        </w:rPr>
+        <w:t xml:space="preserve">Every block + backup combination creates a </w:t>
+      </w:r>
+      <w:r>
+        <w:rPr>
+          <w:rFonts w:ascii="Times New Roman" w:eastAsia="Times New Roman" w:hAnsi="Times New Roman" w:cs="Times New Roman"/>
+          <w:b/>
+          <w:bCs/>
+          <w:kern w:val="0"/>
+          <w:lang w:eastAsia="en-GB"/>
+          <w14:ligatures w14:val="none"/>
+        </w:rPr>
+        <w:t>complete, verifiable audit trail</w:t>
+      </w:r>
+      <w:r>
+        <w:rPr>
+          <w:rFonts w:ascii="Times New Roman" w:eastAsia="Times New Roman" w:hAnsi="Times New Roman" w:cs="Times New Roman"/>
+          <w:kern w:val="0"/>
+          <w:lang w:eastAsia="en-GB"/>
+          <w14:ligatures w14:val="none"/>
+        </w:rPr>
+        <w:t>.</w:t>
+      </w:r>
+    </w:p>
+    <w:p>
+      <w:pPr>
+        <w:numPr>
+          <w:ilvl w:val="0"/>
+          <w:numId w:val="37"/>
+        </w:numPr>
+        <w:spacing w:before="100" w:beforeAutospacing="1" w:after="100" w:afterAutospacing="1"/>
+        <w:rPr>
+          <w:rFonts w:ascii="Times New Roman" w:eastAsia="Times New Roman" w:hAnsi="Times New Roman" w:cs="Times New Roman"/>
+          <w:kern w:val="0"/>
+          <w:lang w:eastAsia="en-GB"/>
+          <w14:ligatures w14:val="none"/>
+        </w:rPr>
+      </w:pPr>
+      <w:r>
+        <w:rPr>
+          <w:rFonts w:ascii="Times New Roman" w:eastAsia="Times New Roman" w:hAnsi="Times New Roman" w:cs="Times New Roman"/>
+          <w:kern w:val="0"/>
+          <w:lang w:eastAsia="en-GB"/>
+          <w14:ligatures w14:val="none"/>
+        </w:rPr>
+        <w:t xml:space="preserve">This is </w:t>
+      </w:r>
+      <w:r>
+        <w:rPr>
+          <w:rFonts w:ascii="Times New Roman" w:eastAsia="Times New Roman" w:hAnsi="Times New Roman" w:cs="Times New Roman"/>
+          <w:b/>
+          <w:bCs/>
+          <w:kern w:val="0"/>
+          <w:lang w:eastAsia="en-GB"/>
+          <w14:ligatures w14:val="none"/>
+        </w:rPr>
+        <w:t>critical in pharma / healthcare applications</w:t>
+      </w:r>
+      <w:r>
+        <w:rPr>
+          <w:rFonts w:ascii="Times New Roman" w:eastAsia="Times New Roman" w:hAnsi="Times New Roman" w:cs="Times New Roman"/>
+          <w:kern w:val="0"/>
+          <w:lang w:eastAsia="en-GB"/>
+          <w14:ligatures w14:val="none"/>
+        </w:rPr>
+        <w:t xml:space="preserve"> where tamper-proof record keeping is mandated.</w:t>
+      </w:r>
+    </w:p>
+    <w:p>
+      <w:pPr>
         <w:pStyle w:val="p1"/>
         <w:jc w:val="center"/>
         <w:rPr>
@@ -11,6 +1156,44 @@
           <w:bCs/>
         </w:rPr>
       </w:pPr>
+    </w:p>
+    <w:p>
+      <w:pPr>
+        <w:pStyle w:val="p1"/>
+        <w:jc w:val="center"/>
+        <w:rPr>
+          <w:b/>
+          <w:bCs/>
+        </w:rPr>
+      </w:pPr>
+      <w:r>
+        <w:rPr>
+          <w:b/>
+          <w:bCs/>
+        </w:rPr>
+        <w:br/>
+      </w:r>
+      <w:r>
+        <w:rPr>
+          <w:b/>
+          <w:bCs/>
+        </w:rPr>
+        <w:br/>
+      </w:r>
+      <w:r>
+        <w:rPr>
+          <w:b/>
+          <w:bCs/>
+        </w:rPr>
+        <w:br/>
+      </w:r>
+      <w:r>
+        <w:rPr>
+          <w:b/>
+          <w:bCs/>
+        </w:rPr>
+        <w:br/>
+      </w:r>
       <w:r>
         <w:rPr>
           <w:b/>
@@ -188,6 +1371,7 @@
           <w:sz w:val="20"/>
           <w:szCs w:val="20"/>
         </w:rPr>
+        <w:lastRenderedPageBreak/>
         <w:t xml:space="preserve">A blockchain-based traceability system, augmented with </w:t>
       </w:r>
       <w:r>
@@ -260,7 +1444,67 @@
           <w:sz w:val="20"/>
           <w:szCs w:val="20"/>
         </w:rPr>
-        <w:t>(e.g., "CollectionEvent," "QualityTest," "ProcessingStep") and QR-code scanning at aggregation nodes, stakeholders gain end-to-end visibility, enabling rapid verification of provenance, streamlined certification for export and robust audit trails to support both biodiversity conservation and supply-chain efficiency. When herbs are formulated into finished products, unique, serialised QR codes generated by the blockchain platform could be affixed to each package. End customers scan these codes with a mobile app or web portal—powered</w:t>
+        <w:t>(e.g., "</w:t>
+      </w:r>
+      <w:proofErr w:type="spellStart"/>
+      <w:r>
+        <w:rPr>
+          <w:rFonts w:ascii="montserratregular" w:hAnsi="montserratregular"/>
+          <w:color w:val="212529"/>
+          <w:sz w:val="20"/>
+          <w:szCs w:val="20"/>
+        </w:rPr>
+        <w:t>CollectionEvent</w:t>
+      </w:r>
+      <w:proofErr w:type="spellEnd"/>
+      <w:r>
+        <w:rPr>
+          <w:rFonts w:ascii="montserratregular" w:hAnsi="montserratregular"/>
+          <w:color w:val="212529"/>
+          <w:sz w:val="20"/>
+          <w:szCs w:val="20"/>
+        </w:rPr>
+        <w:t>," "</w:t>
+      </w:r>
+      <w:proofErr w:type="spellStart"/>
+      <w:r>
+        <w:rPr>
+          <w:rFonts w:ascii="montserratregular" w:hAnsi="montserratregular"/>
+          <w:color w:val="212529"/>
+          <w:sz w:val="20"/>
+          <w:szCs w:val="20"/>
+        </w:rPr>
+        <w:t>QualityTest</w:t>
+      </w:r>
+      <w:proofErr w:type="spellEnd"/>
+      <w:r>
+        <w:rPr>
+          <w:rFonts w:ascii="montserratregular" w:hAnsi="montserratregular"/>
+          <w:color w:val="212529"/>
+          <w:sz w:val="20"/>
+          <w:szCs w:val="20"/>
+        </w:rPr>
+        <w:t>," "</w:t>
+      </w:r>
+      <w:proofErr w:type="spellStart"/>
+      <w:r>
+        <w:rPr>
+          <w:rFonts w:ascii="montserratregular" w:hAnsi="montserratregular"/>
+          <w:color w:val="212529"/>
+          <w:sz w:val="20"/>
+          <w:szCs w:val="20"/>
+        </w:rPr>
+        <w:t>ProcessingStep</w:t>
+      </w:r>
+      <w:proofErr w:type="spellEnd"/>
+      <w:r>
+        <w:rPr>
+          <w:rFonts w:ascii="montserratregular" w:hAnsi="montserratregular"/>
+          <w:color w:val="212529"/>
+          <w:sz w:val="20"/>
+          <w:szCs w:val="20"/>
+        </w:rPr>
+        <w:t>") and QR-code scanning at aggregation nodes, stakeholders gain end-to-end visibility, enabling rapid verification of provenance, streamlined certification for export and robust audit trails to support both biodiversity conservation and supply-chain efficiency. When herbs are formulated into finished products, unique, serialised QR codes generated by the blockchain platform could be affixed to each package. End customers scan these codes with a mobile app or web portal—powered</w:t>
       </w:r>
       <w:r>
         <w:rPr>
@@ -349,17 +1593,7 @@
           <w:szCs w:val="20"/>
         </w:rPr>
         <w:br/>
-        <w:t xml:space="preserve">When formulation is complete, unique QR codes generated on-chain are affixed to product packaging. End customers scan these codes via a lightweight web or mobile portal (no specialised app required) to retrieve the full provenance record: farm coordinates and harvest conditions; chain-of-custody handoffs; lab certificates for moisture, pesticide and DNA-barcode tests; and sustainability and fair-trade compliance proofs. This consumer-facing transparency assures authenticity and safety, enables rapid recall notifications for affected batches and tells the story of each product—complete with interactive </w:t>
-      </w:r>
-      <w:r>
-        <w:rPr>
-          <w:rFonts w:ascii="montserratregular" w:hAnsi="montserratregular"/>
-          <w:color w:val="212529"/>
-          <w:sz w:val="20"/>
-          <w:szCs w:val="20"/>
-        </w:rPr>
-        <w:lastRenderedPageBreak/>
-        <w:t>maps and farmer or community profiles. By combining tamper-proof audit trails, geo-tagged traceability and automated compliance enforcement, the system delivers a replicable model for ethical, sustainable and trust-driven Ayurvedic herb sourcing.</w:t>
+        <w:t>When formulation is complete, unique QR codes generated on-chain are affixed to product packaging. End customers scan these codes via a lightweight web or mobile portal (no specialised app required) to retrieve the full provenance record: farm coordinates and harvest conditions; chain-of-custody handoffs; lab certificates for moisture, pesticide and DNA-barcode tests; and sustainability and fair-trade compliance proofs. This consumer-facing transparency assures authenticity and safety, enables rapid recall notifications for affected batches and tells the story of each product—complete with interactive maps and farmer or community profiles. By combining tamper-proof audit trails, geo-tagged traceability and automated compliance enforcement, the system delivers a replicable model for ethical, sustainable and trust-driven Ayurvedic herb sourcing.</w:t>
       </w:r>
     </w:p>
     <w:p>
@@ -559,8 +1793,9 @@
           <w:szCs w:val="20"/>
         </w:rPr>
         <w:br/>
-        <w:t>• IoT/GPS-enabled mobile DApp (or SMS-over-blockchain gateway) for collectors to record "CollectionEvent" metadata: latitude/longitude, timestamp, collector ID, species and initial quality metrics.</w:t>
-      </w:r>
+        <w:t xml:space="preserve">• IoT/GPS-enabled mobile </w:t>
+      </w:r>
+      <w:proofErr w:type="spellStart"/>
       <w:r>
         <w:rPr>
           <w:rFonts w:ascii="montserratregular" w:hAnsi="montserratregular"/>
@@ -568,8 +1803,97 @@
           <w:sz w:val="20"/>
           <w:szCs w:val="20"/>
         </w:rPr>
+        <w:t>DApp</w:t>
+      </w:r>
+      <w:proofErr w:type="spellEnd"/>
+      <w:r>
+        <w:rPr>
+          <w:rFonts w:ascii="montserratregular" w:hAnsi="montserratregular"/>
+          <w:color w:val="212529"/>
+          <w:sz w:val="20"/>
+          <w:szCs w:val="20"/>
+        </w:rPr>
+        <w:t xml:space="preserve"> (or SMS-over-blockchain gateway) for collectors to record </w:t>
+      </w:r>
+      <w:r>
+        <w:rPr>
+          <w:rFonts w:ascii="montserratregular" w:hAnsi="montserratregular"/>
+          <w:color w:val="212529"/>
+          <w:sz w:val="20"/>
+          <w:szCs w:val="20"/>
+        </w:rPr>
+        <w:lastRenderedPageBreak/>
+        <w:t>"</w:t>
+      </w:r>
+      <w:proofErr w:type="spellStart"/>
+      <w:r>
+        <w:rPr>
+          <w:rFonts w:ascii="montserratregular" w:hAnsi="montserratregular"/>
+          <w:color w:val="212529"/>
+          <w:sz w:val="20"/>
+          <w:szCs w:val="20"/>
+        </w:rPr>
+        <w:t>CollectionEvent</w:t>
+      </w:r>
+      <w:proofErr w:type="spellEnd"/>
+      <w:r>
+        <w:rPr>
+          <w:rFonts w:ascii="montserratregular" w:hAnsi="montserratregular"/>
+          <w:color w:val="212529"/>
+          <w:sz w:val="20"/>
+          <w:szCs w:val="20"/>
+        </w:rPr>
+        <w:t>" metadata: latitude/longitude, timestamp, collector ID, species and initial quality metrics.</w:t>
+      </w:r>
+      <w:r>
+        <w:rPr>
+          <w:rFonts w:ascii="montserratregular" w:hAnsi="montserratregular"/>
+          <w:color w:val="212529"/>
+          <w:sz w:val="20"/>
+          <w:szCs w:val="20"/>
+        </w:rPr>
         <w:br/>
-        <w:t>• Sensor integrations or manual interfaces for "QualityTest" events (lab results) and "ProcessingStep" events (drying, grinding, storage conditions).</w:t>
+        <w:t>• Sensor integrations or manual interfaces for "</w:t>
+      </w:r>
+      <w:proofErr w:type="spellStart"/>
+      <w:r>
+        <w:rPr>
+          <w:rFonts w:ascii="montserratregular" w:hAnsi="montserratregular"/>
+          <w:color w:val="212529"/>
+          <w:sz w:val="20"/>
+          <w:szCs w:val="20"/>
+        </w:rPr>
+        <w:t>QualityTest</w:t>
+      </w:r>
+      <w:proofErr w:type="spellEnd"/>
+      <w:r>
+        <w:rPr>
+          <w:rFonts w:ascii="montserratregular" w:hAnsi="montserratregular"/>
+          <w:color w:val="212529"/>
+          <w:sz w:val="20"/>
+          <w:szCs w:val="20"/>
+        </w:rPr>
+        <w:t>" events (lab results) and "</w:t>
+      </w:r>
+      <w:proofErr w:type="spellStart"/>
+      <w:r>
+        <w:rPr>
+          <w:rFonts w:ascii="montserratregular" w:hAnsi="montserratregular"/>
+          <w:color w:val="212529"/>
+          <w:sz w:val="20"/>
+          <w:szCs w:val="20"/>
+        </w:rPr>
+        <w:t>ProcessingStep</w:t>
+      </w:r>
+      <w:proofErr w:type="spellEnd"/>
+      <w:r>
+        <w:rPr>
+          <w:rFonts w:ascii="montserratregular" w:hAnsi="montserratregular"/>
+          <w:color w:val="212529"/>
+          <w:sz w:val="20"/>
+          <w:szCs w:val="20"/>
+        </w:rPr>
+        <w:t>" events (drying, grinding, storage conditions).</w:t>
       </w:r>
       <w:r>
         <w:rPr>
@@ -598,96 +1922,9 @@
           <w:sz w:val="20"/>
           <w:szCs w:val="20"/>
         </w:rPr>
-        <w:t>3. Smart Labeling &amp; Consumer Portal</w:t>
-      </w:r>
-      <w:r>
-        <w:rPr>
-          <w:rFonts w:ascii="montserratregular" w:hAnsi="montserratregular"/>
-          <w:color w:val="212529"/>
-          <w:sz w:val="20"/>
-          <w:szCs w:val="20"/>
-        </w:rPr>
-        <w:br/>
-        <w:t>• On-chain generation of unique QR codes for each finished product batch.</w:t>
-      </w:r>
-      <w:r>
-        <w:rPr>
-          <w:rFonts w:ascii="montserratregular" w:hAnsi="montserratregular"/>
-          <w:color w:val="212529"/>
-          <w:sz w:val="20"/>
-          <w:szCs w:val="20"/>
-        </w:rPr>
-        <w:br/>
-        <w:t>• A lightweight web/mobile portal (no specialised install required) allowing end customers to scan QR codes and retrieve a complete FHIR-style provenance bundle:</w:t>
-      </w:r>
-      <w:r>
-        <w:rPr>
-          <w:rFonts w:ascii="montserratregular" w:hAnsi="montserratregular"/>
-          <w:color w:val="212529"/>
-          <w:sz w:val="20"/>
-          <w:szCs w:val="20"/>
-        </w:rPr>
-        <w:br/>
-        <w:t>- Collection location map and harvest details</w:t>
-      </w:r>
-      <w:r>
-        <w:rPr>
-          <w:rFonts w:ascii="montserratregular" w:hAnsi="montserratregular"/>
-          <w:color w:val="212529"/>
-          <w:sz w:val="20"/>
-          <w:szCs w:val="20"/>
-        </w:rPr>
-        <w:br/>
-        <w:t>- Chain-of-custody handoffs through each supply-chain node</w:t>
-      </w:r>
-      <w:r>
-        <w:rPr>
-          <w:rFonts w:ascii="montserratregular" w:hAnsi="montserratregular"/>
-          <w:color w:val="212529"/>
-          <w:sz w:val="20"/>
-          <w:szCs w:val="20"/>
-        </w:rPr>
-        <w:br/>
-        <w:t>- Laboratory certificates for moisture, pesticide analysis, DNA authentication</w:t>
-      </w:r>
-      <w:r>
-        <w:rPr>
-          <w:rFonts w:ascii="montserratregular" w:hAnsi="montserratregular"/>
-          <w:color w:val="212529"/>
-          <w:sz w:val="20"/>
-          <w:szCs w:val="20"/>
-        </w:rPr>
-        <w:br/>
-        <w:t>- Sustainability compliance proofs and fair-trade verifications</w:t>
-      </w:r>
-      <w:r>
-        <w:rPr>
-          <w:rFonts w:ascii="montserratregular" w:hAnsi="montserratregular"/>
-          <w:color w:val="212529"/>
-          <w:sz w:val="20"/>
-          <w:szCs w:val="20"/>
-        </w:rPr>
-        <w:br/>
-        <w:t>- Interactive farmer/community profiles and conservation credentials</w:t>
-      </w:r>
-      <w:r>
-        <w:rPr>
-          <w:rFonts w:ascii="montserratregular" w:hAnsi="montserratregular"/>
-          <w:color w:val="212529"/>
-          <w:sz w:val="20"/>
-          <w:szCs w:val="20"/>
-        </w:rPr>
-        <w:br/>
-      </w:r>
-      <w:r>
-        <w:rPr>
-          <w:rFonts w:ascii="montserratregular" w:hAnsi="montserratregular"/>
-          <w:color w:val="212529"/>
-          <w:sz w:val="20"/>
-          <w:szCs w:val="20"/>
-        </w:rPr>
-        <w:br/>
-      </w:r>
+        <w:t xml:space="preserve">3. Smart </w:t>
+      </w:r>
+      <w:proofErr w:type="spellStart"/>
       <w:r>
         <w:rPr>
           <w:rFonts w:ascii="montserratregular" w:hAnsi="montserratregular"/>
@@ -697,56 +1934,9 @@
           <w:sz w:val="20"/>
           <w:szCs w:val="20"/>
         </w:rPr>
-        <w:t>4. Integration &amp; Interoperability</w:t>
-      </w:r>
-      <w:r>
-        <w:rPr>
-          <w:rFonts w:ascii="montserratregular" w:hAnsi="montserratregular"/>
-          <w:color w:val="212529"/>
-          <w:sz w:val="20"/>
-          <w:szCs w:val="20"/>
-        </w:rPr>
-        <w:br/>
-        <w:t>• RESTful APIs for supply-chain managers to query real-time dashboards of harvest volumes, batch statuses, QA results and sustainability metrics.</w:t>
-      </w:r>
-      <w:r>
-        <w:rPr>
-          <w:rFonts w:ascii="montserratregular" w:hAnsi="montserratregular"/>
-          <w:color w:val="212529"/>
-          <w:sz w:val="20"/>
-          <w:szCs w:val="20"/>
-        </w:rPr>
-        <w:br/>
-        <w:t>• Plugins or connectors to existing ERP/quality-management systems for seamless data exchange.</w:t>
-      </w:r>
-      <w:r>
-        <w:rPr>
-          <w:rFonts w:ascii="montserratregular" w:hAnsi="montserratregular"/>
-          <w:color w:val="212529"/>
-          <w:sz w:val="20"/>
-          <w:szCs w:val="20"/>
-        </w:rPr>
-        <w:br/>
-        <w:t>• Use of FHIR-style resource models (CollectionEvent, QualityTest, ProcessingStep, Provenance) for standardized metadata exchange.</w:t>
-      </w:r>
-      <w:r>
-        <w:rPr>
-          <w:rFonts w:ascii="montserratregular" w:hAnsi="montserratregular"/>
-          <w:color w:val="212529"/>
-          <w:sz w:val="20"/>
-          <w:szCs w:val="20"/>
-        </w:rPr>
-        <w:br/>
-      </w:r>
-      <w:r>
-        <w:rPr>
-          <w:rFonts w:ascii="montserratregular" w:hAnsi="montserratregular"/>
-          <w:color w:val="212529"/>
-          <w:sz w:val="20"/>
-          <w:szCs w:val="20"/>
-        </w:rPr>
-        <w:br/>
-      </w:r>
+        <w:t>Labeling</w:t>
+      </w:r>
+      <w:proofErr w:type="spellEnd"/>
       <w:r>
         <w:rPr>
           <w:rFonts w:ascii="montserratregular" w:hAnsi="montserratregular"/>
@@ -756,7 +1946,7 @@
           <w:sz w:val="20"/>
           <w:szCs w:val="20"/>
         </w:rPr>
-        <w:t>5. User Interfaces &amp; Reporting</w:t>
+        <w:t xml:space="preserve"> &amp; Consumer Portal</w:t>
       </w:r>
       <w:r>
         <w:rPr>
@@ -766,7 +1956,7 @@
           <w:szCs w:val="20"/>
         </w:rPr>
         <w:br/>
-        <w:t>• A mobile DApp interface optimized for low-bandwidth rural environments, with offline data capture and SMS synchronization.</w:t>
+        <w:t>• On-chain generation of unique QR codes for each finished product batch.</w:t>
       </w:r>
       <w:r>
         <w:rPr>
@@ -776,7 +1966,7 @@
           <w:szCs w:val="20"/>
         </w:rPr>
         <w:br/>
-        <w:t>• A web dashboard for stakeholders to monitor network health, query provenance records and generate compliance reports aligned with AYUSH Ministry export and sustainability requirements.</w:t>
+        <w:t>• A lightweight web/mobile portal (no specialised install required) allowing end customers to scan QR codes and retrieve a complete FHIR-style provenance bundle:</w:t>
       </w:r>
       <w:r>
         <w:rPr>
@@ -786,7 +1976,47 @@
           <w:szCs w:val="20"/>
         </w:rPr>
         <w:br/>
-        <w:t>• Automated reporting modules that compile environmental-impact metrics and conservation compliance data for certification bodies.</w:t>
+        <w:t>- Collection location map and harvest details</w:t>
+      </w:r>
+      <w:r>
+        <w:rPr>
+          <w:rFonts w:ascii="montserratregular" w:hAnsi="montserratregular"/>
+          <w:color w:val="212529"/>
+          <w:sz w:val="20"/>
+          <w:szCs w:val="20"/>
+        </w:rPr>
+        <w:br/>
+        <w:t>- Chain-of-custody handoffs through each supply-chain node</w:t>
+      </w:r>
+      <w:r>
+        <w:rPr>
+          <w:rFonts w:ascii="montserratregular" w:hAnsi="montserratregular"/>
+          <w:color w:val="212529"/>
+          <w:sz w:val="20"/>
+          <w:szCs w:val="20"/>
+        </w:rPr>
+        <w:br/>
+        <w:t>- Laboratory certificates for moisture, pesticide analysis, DNA authentication</w:t>
+      </w:r>
+      <w:r>
+        <w:rPr>
+          <w:rFonts w:ascii="montserratregular" w:hAnsi="montserratregular"/>
+          <w:color w:val="212529"/>
+          <w:sz w:val="20"/>
+          <w:szCs w:val="20"/>
+        </w:rPr>
+        <w:br/>
+        <w:t>- Sustainability compliance proofs and fair-trade verifications</w:t>
+      </w:r>
+      <w:r>
+        <w:rPr>
+          <w:rFonts w:ascii="montserratregular" w:hAnsi="montserratregular"/>
+          <w:color w:val="212529"/>
+          <w:sz w:val="20"/>
+          <w:szCs w:val="20"/>
+        </w:rPr>
+        <w:br/>
+        <w:t>- Interactive farmer/community profiles and conservation credentials</w:t>
       </w:r>
       <w:r>
         <w:rPr>
@@ -815,7 +2045,7 @@
           <w:sz w:val="20"/>
           <w:szCs w:val="20"/>
         </w:rPr>
-        <w:t>6. Demonstration &amp; Evaluation</w:t>
+        <w:t>4. Integration &amp; Interoperability</w:t>
       </w:r>
       <w:r>
         <w:rPr>
@@ -825,7 +2055,7 @@
           <w:szCs w:val="20"/>
         </w:rPr>
         <w:br/>
-        <w:t>• A live pilot using one botanical species (e.g., Ashwagandha) across a small farming cooperative and a collaborating processor.</w:t>
+        <w:t>• RESTful APIs for supply-chain managers to query real-time dashboards of harvest volumes, batch statuses, QA results and sustainability metrics.</w:t>
       </w:r>
       <w:r>
         <w:rPr>
@@ -835,7 +2065,7 @@
           <w:szCs w:val="20"/>
         </w:rPr>
         <w:br/>
-        <w:t>• End-to-end demonstration: geo-tagging harvest, adding lab results, processing events, QR code scanning by simulated consumers and recall simulation.</w:t>
+        <w:t>• Plugins or connectors to existing ERP/quality-management systems for seamless data exchange.</w:t>
       </w:r>
       <w:r>
         <w:rPr>
@@ -845,8 +2075,9 @@
           <w:szCs w:val="20"/>
         </w:rPr>
         <w:br/>
-        <w:t>• Metrics collection on data-capture latency, transaction throughput, offline sync reliability and consumer-</w:t>
-      </w:r>
+        <w:t>• Use of FHIR-style resource models (</w:t>
+      </w:r>
+      <w:proofErr w:type="spellStart"/>
       <w:r>
         <w:rPr>
           <w:rFonts w:ascii="montserratregular" w:hAnsi="montserratregular"/>
@@ -854,8 +2085,195 @@
           <w:sz w:val="20"/>
           <w:szCs w:val="20"/>
         </w:rPr>
-        <w:lastRenderedPageBreak/>
-        <w:t>scan engagement.</w:t>
+        <w:t>CollectionEvent</w:t>
+      </w:r>
+      <w:proofErr w:type="spellEnd"/>
+      <w:r>
+        <w:rPr>
+          <w:rFonts w:ascii="montserratregular" w:hAnsi="montserratregular"/>
+          <w:color w:val="212529"/>
+          <w:sz w:val="20"/>
+          <w:szCs w:val="20"/>
+        </w:rPr>
+        <w:t xml:space="preserve">, </w:t>
+      </w:r>
+      <w:proofErr w:type="spellStart"/>
+      <w:r>
+        <w:rPr>
+          <w:rFonts w:ascii="montserratregular" w:hAnsi="montserratregular"/>
+          <w:color w:val="212529"/>
+          <w:sz w:val="20"/>
+          <w:szCs w:val="20"/>
+        </w:rPr>
+        <w:t>QualityTest</w:t>
+      </w:r>
+      <w:proofErr w:type="spellEnd"/>
+      <w:r>
+        <w:rPr>
+          <w:rFonts w:ascii="montserratregular" w:hAnsi="montserratregular"/>
+          <w:color w:val="212529"/>
+          <w:sz w:val="20"/>
+          <w:szCs w:val="20"/>
+        </w:rPr>
+        <w:t xml:space="preserve">, </w:t>
+      </w:r>
+      <w:proofErr w:type="spellStart"/>
+      <w:r>
+        <w:rPr>
+          <w:rFonts w:ascii="montserratregular" w:hAnsi="montserratregular"/>
+          <w:color w:val="212529"/>
+          <w:sz w:val="20"/>
+          <w:szCs w:val="20"/>
+        </w:rPr>
+        <w:t>ProcessingStep</w:t>
+      </w:r>
+      <w:proofErr w:type="spellEnd"/>
+      <w:r>
+        <w:rPr>
+          <w:rFonts w:ascii="montserratregular" w:hAnsi="montserratregular"/>
+          <w:color w:val="212529"/>
+          <w:sz w:val="20"/>
+          <w:szCs w:val="20"/>
+        </w:rPr>
+        <w:t>, Provenance) for standardized metadata exchange.</w:t>
+      </w:r>
+      <w:r>
+        <w:rPr>
+          <w:rFonts w:ascii="montserratregular" w:hAnsi="montserratregular"/>
+          <w:color w:val="212529"/>
+          <w:sz w:val="20"/>
+          <w:szCs w:val="20"/>
+        </w:rPr>
+        <w:br/>
+      </w:r>
+      <w:r>
+        <w:rPr>
+          <w:rFonts w:ascii="montserratregular" w:hAnsi="montserratregular"/>
+          <w:color w:val="212529"/>
+          <w:sz w:val="20"/>
+          <w:szCs w:val="20"/>
+        </w:rPr>
+        <w:br/>
+      </w:r>
+      <w:r>
+        <w:rPr>
+          <w:rFonts w:ascii="montserratregular" w:hAnsi="montserratregular"/>
+          <w:b/>
+          <w:bCs/>
+          <w:color w:val="212529"/>
+          <w:sz w:val="20"/>
+          <w:szCs w:val="20"/>
+        </w:rPr>
+        <w:t>5. User Interfaces &amp; Reporting</w:t>
+      </w:r>
+      <w:r>
+        <w:rPr>
+          <w:rFonts w:ascii="montserratregular" w:hAnsi="montserratregular"/>
+          <w:color w:val="212529"/>
+          <w:sz w:val="20"/>
+          <w:szCs w:val="20"/>
+        </w:rPr>
+        <w:br/>
+        <w:t xml:space="preserve">• A mobile </w:t>
+      </w:r>
+      <w:proofErr w:type="spellStart"/>
+      <w:r>
+        <w:rPr>
+          <w:rFonts w:ascii="montserratregular" w:hAnsi="montserratregular"/>
+          <w:color w:val="212529"/>
+          <w:sz w:val="20"/>
+          <w:szCs w:val="20"/>
+        </w:rPr>
+        <w:t>DApp</w:t>
+      </w:r>
+      <w:proofErr w:type="spellEnd"/>
+      <w:r>
+        <w:rPr>
+          <w:rFonts w:ascii="montserratregular" w:hAnsi="montserratregular"/>
+          <w:color w:val="212529"/>
+          <w:sz w:val="20"/>
+          <w:szCs w:val="20"/>
+        </w:rPr>
+        <w:t xml:space="preserve"> interface optimized for low-bandwidth rural environments, with offline data capture and SMS synchronization.</w:t>
+      </w:r>
+      <w:r>
+        <w:rPr>
+          <w:rFonts w:ascii="montserratregular" w:hAnsi="montserratregular"/>
+          <w:color w:val="212529"/>
+          <w:sz w:val="20"/>
+          <w:szCs w:val="20"/>
+        </w:rPr>
+        <w:br/>
+        <w:t>• A web dashboard for stakeholders to monitor network health, query provenance records and generate compliance reports aligned with AYUSH Ministry export and sustainability requirements.</w:t>
+      </w:r>
+      <w:r>
+        <w:rPr>
+          <w:rFonts w:ascii="montserratregular" w:hAnsi="montserratregular"/>
+          <w:color w:val="212529"/>
+          <w:sz w:val="20"/>
+          <w:szCs w:val="20"/>
+        </w:rPr>
+        <w:br/>
+        <w:t>• Automated reporting modules that compile environmental-impact metrics and conservation compliance data for certification bodies.</w:t>
+      </w:r>
+      <w:r>
+        <w:rPr>
+          <w:rFonts w:ascii="montserratregular" w:hAnsi="montserratregular"/>
+          <w:color w:val="212529"/>
+          <w:sz w:val="20"/>
+          <w:szCs w:val="20"/>
+        </w:rPr>
+        <w:br/>
+      </w:r>
+      <w:r>
+        <w:rPr>
+          <w:rFonts w:ascii="montserratregular" w:hAnsi="montserratregular"/>
+          <w:color w:val="212529"/>
+          <w:sz w:val="20"/>
+          <w:szCs w:val="20"/>
+        </w:rPr>
+        <w:br/>
+      </w:r>
+      <w:r>
+        <w:rPr>
+          <w:rFonts w:ascii="montserratregular" w:hAnsi="montserratregular"/>
+          <w:b/>
+          <w:bCs/>
+          <w:color w:val="212529"/>
+          <w:sz w:val="20"/>
+          <w:szCs w:val="20"/>
+        </w:rPr>
+        <w:t>6. Demonstration &amp; Evaluation</w:t>
+      </w:r>
+      <w:r>
+        <w:rPr>
+          <w:rFonts w:ascii="montserratregular" w:hAnsi="montserratregular"/>
+          <w:color w:val="212529"/>
+          <w:sz w:val="20"/>
+          <w:szCs w:val="20"/>
+        </w:rPr>
+        <w:br/>
+        <w:t>• A live pilot using one botanical species (e.g., Ashwagandha) across a small farming cooperative and a collaborating processor.</w:t>
+      </w:r>
+      <w:r>
+        <w:rPr>
+          <w:rFonts w:ascii="montserratregular" w:hAnsi="montserratregular"/>
+          <w:color w:val="212529"/>
+          <w:sz w:val="20"/>
+          <w:szCs w:val="20"/>
+        </w:rPr>
+        <w:br/>
+        <w:t>• End-to-end demonstration: geo-tagging harvest, adding lab results, processing events, QR code scanning by simulated consumers and recall simulation.</w:t>
+      </w:r>
+      <w:r>
+        <w:rPr>
+          <w:rFonts w:ascii="montserratregular" w:hAnsi="montserratregular"/>
+          <w:color w:val="212529"/>
+          <w:sz w:val="20"/>
+          <w:szCs w:val="20"/>
+        </w:rPr>
+        <w:br/>
+        <w:t>• Metrics collection on data-capture latency, transaction throughput, offline sync reliability and consumer-scan engagement.</w:t>
       </w:r>
       <w:r>
         <w:rPr>
@@ -1272,7 +2690,27 @@
           <w:lang w:eastAsia="en-GB"/>
           <w14:ligatures w14:val="none"/>
         </w:rPr>
-        <w:t>Mobile DApp (offline capture possible)</w:t>
+        <w:t xml:space="preserve">Mobile </w:t>
+      </w:r>
+      <w:proofErr w:type="spellStart"/>
+      <w:r>
+        <w:rPr>
+          <w:rFonts w:ascii="Times New Roman" w:eastAsia="Times New Roman" w:hAnsi="Times New Roman" w:cs="Times New Roman"/>
+          <w:kern w:val="0"/>
+          <w:lang w:eastAsia="en-GB"/>
+          <w14:ligatures w14:val="none"/>
+        </w:rPr>
+        <w:t>DApp</w:t>
+      </w:r>
+      <w:proofErr w:type="spellEnd"/>
+      <w:r>
+        <w:rPr>
+          <w:rFonts w:ascii="Times New Roman" w:eastAsia="Times New Roman" w:hAnsi="Times New Roman" w:cs="Times New Roman"/>
+          <w:kern w:val="0"/>
+          <w:lang w:eastAsia="en-GB"/>
+          <w14:ligatures w14:val="none"/>
+        </w:rPr>
+        <w:t xml:space="preserve"> (offline capture possible)</w:t>
       </w:r>
     </w:p>
     <w:p>
@@ -1610,7 +3048,6 @@
           <w:lang w:eastAsia="en-GB"/>
           <w14:ligatures w14:val="none"/>
         </w:rPr>
-        <w:lastRenderedPageBreak/>
         <w:t>Moisture content test results</w:t>
       </w:r>
     </w:p>
@@ -2019,6 +3456,7 @@
           <w:lang w:eastAsia="en-GB"/>
           <w14:ligatures w14:val="none"/>
         </w:rPr>
+        <w:lastRenderedPageBreak/>
         <w:t>On-chain smart contract triggers QR code creation</w:t>
       </w:r>
     </w:p>
@@ -2520,7 +3958,6 @@
           <w:lang w:eastAsia="en-GB"/>
           <w14:ligatures w14:val="none"/>
         </w:rPr>
-        <w:lastRenderedPageBreak/>
         <w:t>Helps analytics (demand forecasting, consumer trust metrics)</w:t>
       </w:r>
     </w:p>
@@ -2884,7 +4321,15 @@
         <w:br/>
       </w:r>
       <w:r>
-        <w:t>for the table for data collection i have made two</w:t>
+        <w:t xml:space="preserve">for the table for data collection </w:t>
+      </w:r>
+      <w:proofErr w:type="spellStart"/>
+      <w:r>
+        <w:t>i</w:t>
+      </w:r>
+      <w:proofErr w:type="spellEnd"/>
+      <w:r>
+        <w:t xml:space="preserve"> have made two</w:t>
       </w:r>
       <w:r>
         <w:rPr>
@@ -2899,15 +4344,65 @@
         <w:pStyle w:val="p1"/>
       </w:pPr>
       <w:r>
-        <w:t>farmer data_collection = FbatchID,fid,typeofherb,harvestedby , quantity,location,locationaccuracy,timestamp,district,photos</w:t>
-      </w:r>
+        <w:t xml:space="preserve">farmer </w:t>
+      </w:r>
+      <w:proofErr w:type="spellStart"/>
+      <w:r>
+        <w:t>data_collection</w:t>
+      </w:r>
+      <w:proofErr w:type="spellEnd"/>
+      <w:r>
+        <w:t xml:space="preserve"> = </w:t>
+      </w:r>
+      <w:proofErr w:type="spellStart"/>
+      <w:r>
+        <w:t>FbatchID,fid,typeofherb,harvestedby</w:t>
+      </w:r>
+      <w:proofErr w:type="spellEnd"/>
+      <w:r>
+        <w:t xml:space="preserve"> , </w:t>
+      </w:r>
+      <w:proofErr w:type="spellStart"/>
+      <w:r>
+        <w:t>quantity,location,locationaccuracy,timestamp,district,photos</w:t>
+      </w:r>
+      <w:proofErr w:type="spellEnd"/>
     </w:p>
     <w:p>
       <w:pPr>
         <w:pStyle w:val="p1"/>
       </w:pPr>
-      <w:r>
-        <w:t>processordata_collection = PbatchID,Pid , linked farmerBatchID,processing step,weightgivenby farmer,weightbeforeproc,weightafterprocessing,parameter,location,location accuracy , district , timestamp</w:t>
+      <w:proofErr w:type="spellStart"/>
+      <w:r>
+        <w:t>processordata_collection</w:t>
+      </w:r>
+      <w:proofErr w:type="spellEnd"/>
+      <w:r>
+        <w:t xml:space="preserve"> = </w:t>
+      </w:r>
+      <w:proofErr w:type="spellStart"/>
+      <w:r>
+        <w:t>PbatchID,Pid</w:t>
+      </w:r>
+      <w:proofErr w:type="spellEnd"/>
+      <w:r>
+        <w:t xml:space="preserve"> , linked </w:t>
+      </w:r>
+      <w:proofErr w:type="spellStart"/>
+      <w:r>
+        <w:t>farmerBatchID,processing</w:t>
+      </w:r>
+      <w:proofErr w:type="spellEnd"/>
+      <w:r>
+        <w:t xml:space="preserve"> </w:t>
+      </w:r>
+      <w:proofErr w:type="spellStart"/>
+      <w:r>
+        <w:t>step,weightgivenby</w:t>
+      </w:r>
+      <w:proofErr w:type="spellEnd"/>
+      <w:r>
+        <w:t xml:space="preserve"> farmer,weightbeforeproc,weightafterprocessing,parameter,location,location accuracy , district , timestamp</w:t>
       </w:r>
       <w:r>
         <w:rPr>
@@ -2926,9 +4421,11 @@
       <w:pPr>
         <w:pStyle w:val="p1"/>
       </w:pPr>
+      <w:proofErr w:type="spellStart"/>
       <w:r>
         <w:t>LabTesterData_Collection</w:t>
       </w:r>
+      <w:proofErr w:type="spellEnd"/>
     </w:p>
     <w:p>
       <w:pPr>
@@ -2944,8 +4441,13 @@
         </w:rPr>
         <w:t xml:space="preserve"> </w:t>
       </w:r>
-      <w:r>
-        <w:t>LbatchID (Primary Key, auto)</w:t>
+      <w:proofErr w:type="spellStart"/>
+      <w:r>
+        <w:t>LbatchID</w:t>
+      </w:r>
+      <w:proofErr w:type="spellEnd"/>
+      <w:r>
+        <w:t xml:space="preserve"> (Primary Key, auto)</w:t>
       </w:r>
     </w:p>
     <w:p>
@@ -2980,8 +4482,13 @@
         </w:rPr>
         <w:t xml:space="preserve"> </w:t>
       </w:r>
-      <w:r>
-        <w:t>LinkedBatchID ( processor)</w:t>
+      <w:proofErr w:type="spellStart"/>
+      <w:r>
+        <w:t>LinkedBatchID</w:t>
+      </w:r>
+      <w:proofErr w:type="spellEnd"/>
+      <w:r>
+        <w:t xml:space="preserve"> ( processor)</w:t>
       </w:r>
     </w:p>
     <w:p>
@@ -2989,7 +4496,6 @@
         <w:pStyle w:val="p1"/>
       </w:pPr>
       <w:r>
-        <w:lastRenderedPageBreak/>
         <w:t>•</w:t>
       </w:r>
       <w:r>
@@ -2999,8 +4505,13 @@
         </w:rPr>
         <w:t xml:space="preserve"> </w:t>
       </w:r>
-      <w:r>
-        <w:t>TestType (Moisture, Pesticide, DNA, etc.)</w:t>
+      <w:proofErr w:type="spellStart"/>
+      <w:r>
+        <w:t>TestType</w:t>
+      </w:r>
+      <w:proofErr w:type="spellEnd"/>
+      <w:r>
+        <w:t xml:space="preserve"> (Moisture, Pesticide, DNA, etc.)</w:t>
       </w:r>
     </w:p>
     <w:p>
@@ -3017,8 +4528,13 @@
         </w:rPr>
         <w:t xml:space="preserve"> </w:t>
       </w:r>
-      <w:r>
-        <w:t>TestResults (TEXT → JSON or plain text report)</w:t>
+      <w:proofErr w:type="spellStart"/>
+      <w:r>
+        <w:t>TestResults</w:t>
+      </w:r>
+      <w:proofErr w:type="spellEnd"/>
+      <w:r>
+        <w:t xml:space="preserve"> (TEXT → JSON or plain text report)</w:t>
       </w:r>
     </w:p>
     <w:p>
@@ -3035,8 +4551,21 @@
         </w:rPr>
         <w:t xml:space="preserve"> </w:t>
       </w:r>
-      <w:r>
-        <w:t>PassFailStatus (enum: Pass / Fail / Pending)</w:t>
+      <w:proofErr w:type="spellStart"/>
+      <w:r>
+        <w:t>PassFailStatus</w:t>
+      </w:r>
+      <w:proofErr w:type="spellEnd"/>
+      <w:r>
+        <w:t xml:space="preserve"> (</w:t>
+      </w:r>
+      <w:proofErr w:type="spellStart"/>
+      <w:r>
+        <w:t>enum</w:t>
+      </w:r>
+      <w:proofErr w:type="spellEnd"/>
+      <w:r>
+        <w:t>: Pass / Fail / Pending)</w:t>
       </w:r>
     </w:p>
     <w:p>
@@ -3053,8 +4582,13 @@
         </w:rPr>
         <w:t xml:space="preserve"> </w:t>
       </w:r>
-      <w:r>
-        <w:t>CertificateFile (path or link to PDF/image)</w:t>
+      <w:proofErr w:type="spellStart"/>
+      <w:r>
+        <w:t>CertificateFile</w:t>
+      </w:r>
+      <w:proofErr w:type="spellEnd"/>
+      <w:r>
+        <w:t xml:space="preserve"> (path or link to PDF/image)</w:t>
       </w:r>
     </w:p>
     <w:p>
@@ -3089,9 +4623,11 @@
         </w:rPr>
         <w:t xml:space="preserve"> </w:t>
       </w:r>
+      <w:proofErr w:type="spellStart"/>
       <w:r>
         <w:t>LocationAccuracy</w:t>
       </w:r>
+      <w:proofErr w:type="spellEnd"/>
     </w:p>
     <w:p>
       <w:pPr>
@@ -3151,9 +4687,11 @@
       <w:pPr>
         <w:pStyle w:val="p1"/>
       </w:pPr>
+      <w:proofErr w:type="spellStart"/>
       <w:r>
         <w:t>ManufacturerData_Collection</w:t>
       </w:r>
+      <w:proofErr w:type="spellEnd"/>
     </w:p>
     <w:p>
       <w:pPr>
@@ -3169,8 +4707,13 @@
         </w:rPr>
         <w:t xml:space="preserve"> </w:t>
       </w:r>
-      <w:r>
-        <w:t>MbatchID (Primary Key, auto)</w:t>
+      <w:proofErr w:type="spellStart"/>
+      <w:r>
+        <w:t>MbatchID</w:t>
+      </w:r>
+      <w:proofErr w:type="spellEnd"/>
+      <w:r>
+        <w:t xml:space="preserve"> (Primary Key, auto)</w:t>
       </w:r>
     </w:p>
     <w:p>
@@ -3187,8 +4730,13 @@
         </w:rPr>
         <w:t xml:space="preserve"> </w:t>
       </w:r>
-      <w:r>
-        <w:t>ManufacturerID (who manufactured)</w:t>
+      <w:proofErr w:type="spellStart"/>
+      <w:r>
+        <w:t>ManufacturerID</w:t>
+      </w:r>
+      <w:proofErr w:type="spellEnd"/>
+      <w:r>
+        <w:t xml:space="preserve"> (who manufactured)</w:t>
       </w:r>
     </w:p>
     <w:p>
@@ -3205,8 +4753,13 @@
         </w:rPr>
         <w:t xml:space="preserve"> </w:t>
       </w:r>
-      <w:r>
-        <w:t>LinkedBatchIDs (lab tester)</w:t>
+      <w:proofErr w:type="spellStart"/>
+      <w:r>
+        <w:t>LinkedBatchIDs</w:t>
+      </w:r>
+      <w:proofErr w:type="spellEnd"/>
+      <w:r>
+        <w:t xml:space="preserve"> (lab tester)</w:t>
       </w:r>
     </w:p>
     <w:p>
@@ -3241,8 +4794,13 @@
         </w:rPr>
         <w:t xml:space="preserve"> </w:t>
       </w:r>
-      <w:r>
-        <w:t>ProductForm (tablet, powder, oil, etc.)</w:t>
+      <w:proofErr w:type="spellStart"/>
+      <w:r>
+        <w:t>ProductForm</w:t>
+      </w:r>
+      <w:proofErr w:type="spellEnd"/>
+      <w:r>
+        <w:t xml:space="preserve"> (tablet, powder, oil, etc.)</w:t>
       </w:r>
     </w:p>
     <w:p>
@@ -3277,8 +4835,13 @@
         </w:rPr>
         <w:t xml:space="preserve"> </w:t>
       </w:r>
-      <w:r>
-        <w:t>PackagingInfo (size, count, unit)</w:t>
+      <w:proofErr w:type="spellStart"/>
+      <w:r>
+        <w:t>PackagingInfo</w:t>
+      </w:r>
+      <w:proofErr w:type="spellEnd"/>
+      <w:r>
+        <w:t xml:space="preserve"> (size, count, unit)</w:t>
       </w:r>
     </w:p>
     <w:p>
@@ -3295,8 +4858,13 @@
         </w:rPr>
         <w:t xml:space="preserve"> </w:t>
       </w:r>
-      <w:r>
-        <w:t>WeightFinal (kg)</w:t>
+      <w:proofErr w:type="spellStart"/>
+      <w:r>
+        <w:t>WeightFinal</w:t>
+      </w:r>
+      <w:proofErr w:type="spellEnd"/>
+      <w:r>
+        <w:t xml:space="preserve"> (kg)</w:t>
       </w:r>
     </w:p>
     <w:p>
@@ -3313,8 +4881,13 @@
         </w:rPr>
         <w:t xml:space="preserve"> </w:t>
       </w:r>
-      <w:r>
-        <w:t>QRCodeID (unique, auto-generated on-chain)</w:t>
+      <w:proofErr w:type="spellStart"/>
+      <w:r>
+        <w:t>QRCodeID</w:t>
+      </w:r>
+      <w:proofErr w:type="spellEnd"/>
+      <w:r>
+        <w:t xml:space="preserve"> (unique, auto-generated on-chain)</w:t>
       </w:r>
     </w:p>
     <w:p>
@@ -3730,6 +5303,304 @@
     </w:lvl>
   </w:abstractNum>
   <w:abstractNum w:abstractNumId="2" w15:restartNumberingAfterBreak="0">
+    <w:nsid w:val="0B2A6D7E"/>
+    <w:multiLevelType w:val="multilevel"/>
+    <w:tmpl w:val="79122D1E"/>
+    <w:lvl w:ilvl="0">
+      <w:start w:val="1"/>
+      <w:numFmt w:val="bullet"/>
+      <w:lvlText w:val=""/>
+      <w:lvlJc w:val="left"/>
+      <w:pPr>
+        <w:tabs>
+          <w:tab w:val="num" w:pos="720"/>
+        </w:tabs>
+        <w:ind w:left="720" w:hanging="360"/>
+      </w:pPr>
+      <w:rPr>
+        <w:rFonts w:ascii="Symbol" w:hAnsi="Symbol" w:hint="default"/>
+        <w:sz w:val="20"/>
+      </w:rPr>
+    </w:lvl>
+    <w:lvl w:ilvl="1" w:tentative="1">
+      <w:start w:val="1"/>
+      <w:numFmt w:val="bullet"/>
+      <w:lvlText w:val="o"/>
+      <w:lvlJc w:val="left"/>
+      <w:pPr>
+        <w:tabs>
+          <w:tab w:val="num" w:pos="1440"/>
+        </w:tabs>
+        <w:ind w:left="1440" w:hanging="360"/>
+      </w:pPr>
+      <w:rPr>
+        <w:rFonts w:ascii="Courier New" w:hAnsi="Courier New" w:hint="default"/>
+        <w:sz w:val="20"/>
+      </w:rPr>
+    </w:lvl>
+    <w:lvl w:ilvl="2" w:tentative="1">
+      <w:start w:val="1"/>
+      <w:numFmt w:val="bullet"/>
+      <w:lvlText w:val=""/>
+      <w:lvlJc w:val="left"/>
+      <w:pPr>
+        <w:tabs>
+          <w:tab w:val="num" w:pos="2160"/>
+        </w:tabs>
+        <w:ind w:left="2160" w:hanging="360"/>
+      </w:pPr>
+      <w:rPr>
+        <w:rFonts w:ascii="Wingdings" w:hAnsi="Wingdings" w:hint="default"/>
+        <w:sz w:val="20"/>
+      </w:rPr>
+    </w:lvl>
+    <w:lvl w:ilvl="3" w:tentative="1">
+      <w:start w:val="1"/>
+      <w:numFmt w:val="bullet"/>
+      <w:lvlText w:val=""/>
+      <w:lvlJc w:val="left"/>
+      <w:pPr>
+        <w:tabs>
+          <w:tab w:val="num" w:pos="2880"/>
+        </w:tabs>
+        <w:ind w:left="2880" w:hanging="360"/>
+      </w:pPr>
+      <w:rPr>
+        <w:rFonts w:ascii="Wingdings" w:hAnsi="Wingdings" w:hint="default"/>
+        <w:sz w:val="20"/>
+      </w:rPr>
+    </w:lvl>
+    <w:lvl w:ilvl="4" w:tentative="1">
+      <w:start w:val="1"/>
+      <w:numFmt w:val="bullet"/>
+      <w:lvlText w:val=""/>
+      <w:lvlJc w:val="left"/>
+      <w:pPr>
+        <w:tabs>
+          <w:tab w:val="num" w:pos="3600"/>
+        </w:tabs>
+        <w:ind w:left="3600" w:hanging="360"/>
+      </w:pPr>
+      <w:rPr>
+        <w:rFonts w:ascii="Wingdings" w:hAnsi="Wingdings" w:hint="default"/>
+        <w:sz w:val="20"/>
+      </w:rPr>
+    </w:lvl>
+    <w:lvl w:ilvl="5" w:tentative="1">
+      <w:start w:val="1"/>
+      <w:numFmt w:val="bullet"/>
+      <w:lvlText w:val=""/>
+      <w:lvlJc w:val="left"/>
+      <w:pPr>
+        <w:tabs>
+          <w:tab w:val="num" w:pos="4320"/>
+        </w:tabs>
+        <w:ind w:left="4320" w:hanging="360"/>
+      </w:pPr>
+      <w:rPr>
+        <w:rFonts w:ascii="Wingdings" w:hAnsi="Wingdings" w:hint="default"/>
+        <w:sz w:val="20"/>
+      </w:rPr>
+    </w:lvl>
+    <w:lvl w:ilvl="6" w:tentative="1">
+      <w:start w:val="1"/>
+      <w:numFmt w:val="bullet"/>
+      <w:lvlText w:val=""/>
+      <w:lvlJc w:val="left"/>
+      <w:pPr>
+        <w:tabs>
+          <w:tab w:val="num" w:pos="5040"/>
+        </w:tabs>
+        <w:ind w:left="5040" w:hanging="360"/>
+      </w:pPr>
+      <w:rPr>
+        <w:rFonts w:ascii="Wingdings" w:hAnsi="Wingdings" w:hint="default"/>
+        <w:sz w:val="20"/>
+      </w:rPr>
+    </w:lvl>
+    <w:lvl w:ilvl="7" w:tentative="1">
+      <w:start w:val="1"/>
+      <w:numFmt w:val="bullet"/>
+      <w:lvlText w:val=""/>
+      <w:lvlJc w:val="left"/>
+      <w:pPr>
+        <w:tabs>
+          <w:tab w:val="num" w:pos="5760"/>
+        </w:tabs>
+        <w:ind w:left="5760" w:hanging="360"/>
+      </w:pPr>
+      <w:rPr>
+        <w:rFonts w:ascii="Wingdings" w:hAnsi="Wingdings" w:hint="default"/>
+        <w:sz w:val="20"/>
+      </w:rPr>
+    </w:lvl>
+    <w:lvl w:ilvl="8" w:tentative="1">
+      <w:start w:val="1"/>
+      <w:numFmt w:val="bullet"/>
+      <w:lvlText w:val=""/>
+      <w:lvlJc w:val="left"/>
+      <w:pPr>
+        <w:tabs>
+          <w:tab w:val="num" w:pos="6480"/>
+        </w:tabs>
+        <w:ind w:left="6480" w:hanging="360"/>
+      </w:pPr>
+      <w:rPr>
+        <w:rFonts w:ascii="Wingdings" w:hAnsi="Wingdings" w:hint="default"/>
+        <w:sz w:val="20"/>
+      </w:rPr>
+    </w:lvl>
+  </w:abstractNum>
+  <w:abstractNum w:abstractNumId="3" w15:restartNumberingAfterBreak="0">
+    <w:nsid w:val="0BF86495"/>
+    <w:multiLevelType w:val="multilevel"/>
+    <w:tmpl w:val="D48ED348"/>
+    <w:lvl w:ilvl="0">
+      <w:start w:val="1"/>
+      <w:numFmt w:val="bullet"/>
+      <w:lvlText w:val=""/>
+      <w:lvlJc w:val="left"/>
+      <w:pPr>
+        <w:tabs>
+          <w:tab w:val="num" w:pos="720"/>
+        </w:tabs>
+        <w:ind w:left="720" w:hanging="360"/>
+      </w:pPr>
+      <w:rPr>
+        <w:rFonts w:ascii="Symbol" w:hAnsi="Symbol" w:hint="default"/>
+        <w:sz w:val="20"/>
+      </w:rPr>
+    </w:lvl>
+    <w:lvl w:ilvl="1" w:tentative="1">
+      <w:start w:val="1"/>
+      <w:numFmt w:val="bullet"/>
+      <w:lvlText w:val="o"/>
+      <w:lvlJc w:val="left"/>
+      <w:pPr>
+        <w:tabs>
+          <w:tab w:val="num" w:pos="1440"/>
+        </w:tabs>
+        <w:ind w:left="1440" w:hanging="360"/>
+      </w:pPr>
+      <w:rPr>
+        <w:rFonts w:ascii="Courier New" w:hAnsi="Courier New" w:hint="default"/>
+        <w:sz w:val="20"/>
+      </w:rPr>
+    </w:lvl>
+    <w:lvl w:ilvl="2" w:tentative="1">
+      <w:start w:val="1"/>
+      <w:numFmt w:val="bullet"/>
+      <w:lvlText w:val=""/>
+      <w:lvlJc w:val="left"/>
+      <w:pPr>
+        <w:tabs>
+          <w:tab w:val="num" w:pos="2160"/>
+        </w:tabs>
+        <w:ind w:left="2160" w:hanging="360"/>
+      </w:pPr>
+      <w:rPr>
+        <w:rFonts w:ascii="Wingdings" w:hAnsi="Wingdings" w:hint="default"/>
+        <w:sz w:val="20"/>
+      </w:rPr>
+    </w:lvl>
+    <w:lvl w:ilvl="3" w:tentative="1">
+      <w:start w:val="1"/>
+      <w:numFmt w:val="bullet"/>
+      <w:lvlText w:val=""/>
+      <w:lvlJc w:val="left"/>
+      <w:pPr>
+        <w:tabs>
+          <w:tab w:val="num" w:pos="2880"/>
+        </w:tabs>
+        <w:ind w:left="2880" w:hanging="360"/>
+      </w:pPr>
+      <w:rPr>
+        <w:rFonts w:ascii="Wingdings" w:hAnsi="Wingdings" w:hint="default"/>
+        <w:sz w:val="20"/>
+      </w:rPr>
+    </w:lvl>
+    <w:lvl w:ilvl="4" w:tentative="1">
+      <w:start w:val="1"/>
+      <w:numFmt w:val="bullet"/>
+      <w:lvlText w:val=""/>
+      <w:lvlJc w:val="left"/>
+      <w:pPr>
+        <w:tabs>
+          <w:tab w:val="num" w:pos="3600"/>
+        </w:tabs>
+        <w:ind w:left="3600" w:hanging="360"/>
+      </w:pPr>
+      <w:rPr>
+        <w:rFonts w:ascii="Wingdings" w:hAnsi="Wingdings" w:hint="default"/>
+        <w:sz w:val="20"/>
+      </w:rPr>
+    </w:lvl>
+    <w:lvl w:ilvl="5" w:tentative="1">
+      <w:start w:val="1"/>
+      <w:numFmt w:val="bullet"/>
+      <w:lvlText w:val=""/>
+      <w:lvlJc w:val="left"/>
+      <w:pPr>
+        <w:tabs>
+          <w:tab w:val="num" w:pos="4320"/>
+        </w:tabs>
+        <w:ind w:left="4320" w:hanging="360"/>
+      </w:pPr>
+      <w:rPr>
+        <w:rFonts w:ascii="Wingdings" w:hAnsi="Wingdings" w:hint="default"/>
+        <w:sz w:val="20"/>
+      </w:rPr>
+    </w:lvl>
+    <w:lvl w:ilvl="6" w:tentative="1">
+      <w:start w:val="1"/>
+      <w:numFmt w:val="bullet"/>
+      <w:lvlText w:val=""/>
+      <w:lvlJc w:val="left"/>
+      <w:pPr>
+        <w:tabs>
+          <w:tab w:val="num" w:pos="5040"/>
+        </w:tabs>
+        <w:ind w:left="5040" w:hanging="360"/>
+      </w:pPr>
+      <w:rPr>
+        <w:rFonts w:ascii="Wingdings" w:hAnsi="Wingdings" w:hint="default"/>
+        <w:sz w:val="20"/>
+      </w:rPr>
+    </w:lvl>
+    <w:lvl w:ilvl="7" w:tentative="1">
+      <w:start w:val="1"/>
+      <w:numFmt w:val="bullet"/>
+      <w:lvlText w:val=""/>
+      <w:lvlJc w:val="left"/>
+      <w:pPr>
+        <w:tabs>
+          <w:tab w:val="num" w:pos="5760"/>
+        </w:tabs>
+        <w:ind w:left="5760" w:hanging="360"/>
+      </w:pPr>
+      <w:rPr>
+        <w:rFonts w:ascii="Wingdings" w:hAnsi="Wingdings" w:hint="default"/>
+        <w:sz w:val="20"/>
+      </w:rPr>
+    </w:lvl>
+    <w:lvl w:ilvl="8" w:tentative="1">
+      <w:start w:val="1"/>
+      <w:numFmt w:val="bullet"/>
+      <w:lvlText w:val=""/>
+      <w:lvlJc w:val="left"/>
+      <w:pPr>
+        <w:tabs>
+          <w:tab w:val="num" w:pos="6480"/>
+        </w:tabs>
+        <w:ind w:left="6480" w:hanging="360"/>
+      </w:pPr>
+      <w:rPr>
+        <w:rFonts w:ascii="Wingdings" w:hAnsi="Wingdings" w:hint="default"/>
+        <w:sz w:val="20"/>
+      </w:rPr>
+    </w:lvl>
+  </w:abstractNum>
+  <w:abstractNum w:abstractNumId="4" w15:restartNumberingAfterBreak="0">
     <w:nsid w:val="0D300F55"/>
     <w:multiLevelType w:val="multilevel"/>
     <w:tmpl w:val="CA7C86F6"/>
@@ -3878,7 +5749,7 @@
       </w:rPr>
     </w:lvl>
   </w:abstractNum>
-  <w:abstractNum w:abstractNumId="3" w15:restartNumberingAfterBreak="0">
+  <w:abstractNum w:abstractNumId="5" w15:restartNumberingAfterBreak="0">
     <w:nsid w:val="0E35327B"/>
     <w:multiLevelType w:val="multilevel"/>
     <w:tmpl w:val="85F23AAE"/>
@@ -4027,7 +5898,7 @@
       </w:rPr>
     </w:lvl>
   </w:abstractNum>
-  <w:abstractNum w:abstractNumId="4" w15:restartNumberingAfterBreak="0">
+  <w:abstractNum w:abstractNumId="6" w15:restartNumberingAfterBreak="0">
     <w:nsid w:val="11744DF2"/>
     <w:multiLevelType w:val="multilevel"/>
     <w:tmpl w:val="1A6E61F6"/>
@@ -4176,7 +6047,156 @@
       </w:rPr>
     </w:lvl>
   </w:abstractNum>
-  <w:abstractNum w:abstractNumId="5" w15:restartNumberingAfterBreak="0">
+  <w:abstractNum w:abstractNumId="7" w15:restartNumberingAfterBreak="0">
+    <w:nsid w:val="13A0199B"/>
+    <w:multiLevelType w:val="multilevel"/>
+    <w:tmpl w:val="118A5BB8"/>
+    <w:lvl w:ilvl="0">
+      <w:start w:val="1"/>
+      <w:numFmt w:val="bullet"/>
+      <w:lvlText w:val=""/>
+      <w:lvlJc w:val="left"/>
+      <w:pPr>
+        <w:tabs>
+          <w:tab w:val="num" w:pos="720"/>
+        </w:tabs>
+        <w:ind w:left="720" w:hanging="360"/>
+      </w:pPr>
+      <w:rPr>
+        <w:rFonts w:ascii="Symbol" w:hAnsi="Symbol" w:hint="default"/>
+        <w:sz w:val="20"/>
+      </w:rPr>
+    </w:lvl>
+    <w:lvl w:ilvl="1" w:tentative="1">
+      <w:start w:val="1"/>
+      <w:numFmt w:val="bullet"/>
+      <w:lvlText w:val="o"/>
+      <w:lvlJc w:val="left"/>
+      <w:pPr>
+        <w:tabs>
+          <w:tab w:val="num" w:pos="1440"/>
+        </w:tabs>
+        <w:ind w:left="1440" w:hanging="360"/>
+      </w:pPr>
+      <w:rPr>
+        <w:rFonts w:ascii="Courier New" w:hAnsi="Courier New" w:hint="default"/>
+        <w:sz w:val="20"/>
+      </w:rPr>
+    </w:lvl>
+    <w:lvl w:ilvl="2" w:tentative="1">
+      <w:start w:val="1"/>
+      <w:numFmt w:val="bullet"/>
+      <w:lvlText w:val=""/>
+      <w:lvlJc w:val="left"/>
+      <w:pPr>
+        <w:tabs>
+          <w:tab w:val="num" w:pos="2160"/>
+        </w:tabs>
+        <w:ind w:left="2160" w:hanging="360"/>
+      </w:pPr>
+      <w:rPr>
+        <w:rFonts w:ascii="Wingdings" w:hAnsi="Wingdings" w:hint="default"/>
+        <w:sz w:val="20"/>
+      </w:rPr>
+    </w:lvl>
+    <w:lvl w:ilvl="3" w:tentative="1">
+      <w:start w:val="1"/>
+      <w:numFmt w:val="bullet"/>
+      <w:lvlText w:val=""/>
+      <w:lvlJc w:val="left"/>
+      <w:pPr>
+        <w:tabs>
+          <w:tab w:val="num" w:pos="2880"/>
+        </w:tabs>
+        <w:ind w:left="2880" w:hanging="360"/>
+      </w:pPr>
+      <w:rPr>
+        <w:rFonts w:ascii="Wingdings" w:hAnsi="Wingdings" w:hint="default"/>
+        <w:sz w:val="20"/>
+      </w:rPr>
+    </w:lvl>
+    <w:lvl w:ilvl="4" w:tentative="1">
+      <w:start w:val="1"/>
+      <w:numFmt w:val="bullet"/>
+      <w:lvlText w:val=""/>
+      <w:lvlJc w:val="left"/>
+      <w:pPr>
+        <w:tabs>
+          <w:tab w:val="num" w:pos="3600"/>
+        </w:tabs>
+        <w:ind w:left="3600" w:hanging="360"/>
+      </w:pPr>
+      <w:rPr>
+        <w:rFonts w:ascii="Wingdings" w:hAnsi="Wingdings" w:hint="default"/>
+        <w:sz w:val="20"/>
+      </w:rPr>
+    </w:lvl>
+    <w:lvl w:ilvl="5" w:tentative="1">
+      <w:start w:val="1"/>
+      <w:numFmt w:val="bullet"/>
+      <w:lvlText w:val=""/>
+      <w:lvlJc w:val="left"/>
+      <w:pPr>
+        <w:tabs>
+          <w:tab w:val="num" w:pos="4320"/>
+        </w:tabs>
+        <w:ind w:left="4320" w:hanging="360"/>
+      </w:pPr>
+      <w:rPr>
+        <w:rFonts w:ascii="Wingdings" w:hAnsi="Wingdings" w:hint="default"/>
+        <w:sz w:val="20"/>
+      </w:rPr>
+    </w:lvl>
+    <w:lvl w:ilvl="6" w:tentative="1">
+      <w:start w:val="1"/>
+      <w:numFmt w:val="bullet"/>
+      <w:lvlText w:val=""/>
+      <w:lvlJc w:val="left"/>
+      <w:pPr>
+        <w:tabs>
+          <w:tab w:val="num" w:pos="5040"/>
+        </w:tabs>
+        <w:ind w:left="5040" w:hanging="360"/>
+      </w:pPr>
+      <w:rPr>
+        <w:rFonts w:ascii="Wingdings" w:hAnsi="Wingdings" w:hint="default"/>
+        <w:sz w:val="20"/>
+      </w:rPr>
+    </w:lvl>
+    <w:lvl w:ilvl="7" w:tentative="1">
+      <w:start w:val="1"/>
+      <w:numFmt w:val="bullet"/>
+      <w:lvlText w:val=""/>
+      <w:lvlJc w:val="left"/>
+      <w:pPr>
+        <w:tabs>
+          <w:tab w:val="num" w:pos="5760"/>
+        </w:tabs>
+        <w:ind w:left="5760" w:hanging="360"/>
+      </w:pPr>
+      <w:rPr>
+        <w:rFonts w:ascii="Wingdings" w:hAnsi="Wingdings" w:hint="default"/>
+        <w:sz w:val="20"/>
+      </w:rPr>
+    </w:lvl>
+    <w:lvl w:ilvl="8" w:tentative="1">
+      <w:start w:val="1"/>
+      <w:numFmt w:val="bullet"/>
+      <w:lvlText w:val=""/>
+      <w:lvlJc w:val="left"/>
+      <w:pPr>
+        <w:tabs>
+          <w:tab w:val="num" w:pos="6480"/>
+        </w:tabs>
+        <w:ind w:left="6480" w:hanging="360"/>
+      </w:pPr>
+      <w:rPr>
+        <w:rFonts w:ascii="Wingdings" w:hAnsi="Wingdings" w:hint="default"/>
+        <w:sz w:val="20"/>
+      </w:rPr>
+    </w:lvl>
+  </w:abstractNum>
+  <w:abstractNum w:abstractNumId="8" w15:restartNumberingAfterBreak="0">
     <w:nsid w:val="184F50CF"/>
     <w:multiLevelType w:val="multilevel"/>
     <w:tmpl w:val="BD2A97C2"/>
@@ -4325,7 +6345,7 @@
       </w:rPr>
     </w:lvl>
   </w:abstractNum>
-  <w:abstractNum w:abstractNumId="6" w15:restartNumberingAfterBreak="0">
+  <w:abstractNum w:abstractNumId="9" w15:restartNumberingAfterBreak="0">
     <w:nsid w:val="18F945A2"/>
     <w:multiLevelType w:val="multilevel"/>
     <w:tmpl w:val="168EA96A"/>
@@ -4474,7 +6494,7 @@
       </w:rPr>
     </w:lvl>
   </w:abstractNum>
-  <w:abstractNum w:abstractNumId="7" w15:restartNumberingAfterBreak="0">
+  <w:abstractNum w:abstractNumId="10" w15:restartNumberingAfterBreak="0">
     <w:nsid w:val="21475185"/>
     <w:multiLevelType w:val="multilevel"/>
     <w:tmpl w:val="62AE1FA8"/>
@@ -4623,7 +6643,156 @@
       </w:rPr>
     </w:lvl>
   </w:abstractNum>
-  <w:abstractNum w:abstractNumId="8" w15:restartNumberingAfterBreak="0">
+  <w:abstractNum w:abstractNumId="11" w15:restartNumberingAfterBreak="0">
+    <w:nsid w:val="21810D44"/>
+    <w:multiLevelType w:val="multilevel"/>
+    <w:tmpl w:val="32E263B4"/>
+    <w:lvl w:ilvl="0">
+      <w:start w:val="1"/>
+      <w:numFmt w:val="bullet"/>
+      <w:lvlText w:val=""/>
+      <w:lvlJc w:val="left"/>
+      <w:pPr>
+        <w:tabs>
+          <w:tab w:val="num" w:pos="720"/>
+        </w:tabs>
+        <w:ind w:left="720" w:hanging="360"/>
+      </w:pPr>
+      <w:rPr>
+        <w:rFonts w:ascii="Symbol" w:hAnsi="Symbol" w:hint="default"/>
+        <w:sz w:val="20"/>
+      </w:rPr>
+    </w:lvl>
+    <w:lvl w:ilvl="1" w:tentative="1">
+      <w:start w:val="1"/>
+      <w:numFmt w:val="bullet"/>
+      <w:lvlText w:val="o"/>
+      <w:lvlJc w:val="left"/>
+      <w:pPr>
+        <w:tabs>
+          <w:tab w:val="num" w:pos="1440"/>
+        </w:tabs>
+        <w:ind w:left="1440" w:hanging="360"/>
+      </w:pPr>
+      <w:rPr>
+        <w:rFonts w:ascii="Courier New" w:hAnsi="Courier New" w:hint="default"/>
+        <w:sz w:val="20"/>
+      </w:rPr>
+    </w:lvl>
+    <w:lvl w:ilvl="2" w:tentative="1">
+      <w:start w:val="1"/>
+      <w:numFmt w:val="bullet"/>
+      <w:lvlText w:val=""/>
+      <w:lvlJc w:val="left"/>
+      <w:pPr>
+        <w:tabs>
+          <w:tab w:val="num" w:pos="2160"/>
+        </w:tabs>
+        <w:ind w:left="2160" w:hanging="360"/>
+      </w:pPr>
+      <w:rPr>
+        <w:rFonts w:ascii="Wingdings" w:hAnsi="Wingdings" w:hint="default"/>
+        <w:sz w:val="20"/>
+      </w:rPr>
+    </w:lvl>
+    <w:lvl w:ilvl="3" w:tentative="1">
+      <w:start w:val="1"/>
+      <w:numFmt w:val="bullet"/>
+      <w:lvlText w:val=""/>
+      <w:lvlJc w:val="left"/>
+      <w:pPr>
+        <w:tabs>
+          <w:tab w:val="num" w:pos="2880"/>
+        </w:tabs>
+        <w:ind w:left="2880" w:hanging="360"/>
+      </w:pPr>
+      <w:rPr>
+        <w:rFonts w:ascii="Wingdings" w:hAnsi="Wingdings" w:hint="default"/>
+        <w:sz w:val="20"/>
+      </w:rPr>
+    </w:lvl>
+    <w:lvl w:ilvl="4" w:tentative="1">
+      <w:start w:val="1"/>
+      <w:numFmt w:val="bullet"/>
+      <w:lvlText w:val=""/>
+      <w:lvlJc w:val="left"/>
+      <w:pPr>
+        <w:tabs>
+          <w:tab w:val="num" w:pos="3600"/>
+        </w:tabs>
+        <w:ind w:left="3600" w:hanging="360"/>
+      </w:pPr>
+      <w:rPr>
+        <w:rFonts w:ascii="Wingdings" w:hAnsi="Wingdings" w:hint="default"/>
+        <w:sz w:val="20"/>
+      </w:rPr>
+    </w:lvl>
+    <w:lvl w:ilvl="5" w:tentative="1">
+      <w:start w:val="1"/>
+      <w:numFmt w:val="bullet"/>
+      <w:lvlText w:val=""/>
+      <w:lvlJc w:val="left"/>
+      <w:pPr>
+        <w:tabs>
+          <w:tab w:val="num" w:pos="4320"/>
+        </w:tabs>
+        <w:ind w:left="4320" w:hanging="360"/>
+      </w:pPr>
+      <w:rPr>
+        <w:rFonts w:ascii="Wingdings" w:hAnsi="Wingdings" w:hint="default"/>
+        <w:sz w:val="20"/>
+      </w:rPr>
+    </w:lvl>
+    <w:lvl w:ilvl="6" w:tentative="1">
+      <w:start w:val="1"/>
+      <w:numFmt w:val="bullet"/>
+      <w:lvlText w:val=""/>
+      <w:lvlJc w:val="left"/>
+      <w:pPr>
+        <w:tabs>
+          <w:tab w:val="num" w:pos="5040"/>
+        </w:tabs>
+        <w:ind w:left="5040" w:hanging="360"/>
+      </w:pPr>
+      <w:rPr>
+        <w:rFonts w:ascii="Wingdings" w:hAnsi="Wingdings" w:hint="default"/>
+        <w:sz w:val="20"/>
+      </w:rPr>
+    </w:lvl>
+    <w:lvl w:ilvl="7" w:tentative="1">
+      <w:start w:val="1"/>
+      <w:numFmt w:val="bullet"/>
+      <w:lvlText w:val=""/>
+      <w:lvlJc w:val="left"/>
+      <w:pPr>
+        <w:tabs>
+          <w:tab w:val="num" w:pos="5760"/>
+        </w:tabs>
+        <w:ind w:left="5760" w:hanging="360"/>
+      </w:pPr>
+      <w:rPr>
+        <w:rFonts w:ascii="Wingdings" w:hAnsi="Wingdings" w:hint="default"/>
+        <w:sz w:val="20"/>
+      </w:rPr>
+    </w:lvl>
+    <w:lvl w:ilvl="8" w:tentative="1">
+      <w:start w:val="1"/>
+      <w:numFmt w:val="bullet"/>
+      <w:lvlText w:val=""/>
+      <w:lvlJc w:val="left"/>
+      <w:pPr>
+        <w:tabs>
+          <w:tab w:val="num" w:pos="6480"/>
+        </w:tabs>
+        <w:ind w:left="6480" w:hanging="360"/>
+      </w:pPr>
+      <w:rPr>
+        <w:rFonts w:ascii="Wingdings" w:hAnsi="Wingdings" w:hint="default"/>
+        <w:sz w:val="20"/>
+      </w:rPr>
+    </w:lvl>
+  </w:abstractNum>
+  <w:abstractNum w:abstractNumId="12" w15:restartNumberingAfterBreak="0">
     <w:nsid w:val="2961249D"/>
     <w:multiLevelType w:val="multilevel"/>
     <w:tmpl w:val="AA109816"/>
@@ -4772,7 +6941,752 @@
       </w:rPr>
     </w:lvl>
   </w:abstractNum>
-  <w:abstractNum w:abstractNumId="9" w15:restartNumberingAfterBreak="0">
+  <w:abstractNum w:abstractNumId="13" w15:restartNumberingAfterBreak="0">
+    <w:nsid w:val="330325C3"/>
+    <w:multiLevelType w:val="multilevel"/>
+    <w:tmpl w:val="D4100614"/>
+    <w:lvl w:ilvl="0">
+      <w:start w:val="1"/>
+      <w:numFmt w:val="bullet"/>
+      <w:lvlText w:val=""/>
+      <w:lvlJc w:val="left"/>
+      <w:pPr>
+        <w:tabs>
+          <w:tab w:val="num" w:pos="720"/>
+        </w:tabs>
+        <w:ind w:left="720" w:hanging="360"/>
+      </w:pPr>
+      <w:rPr>
+        <w:rFonts w:ascii="Symbol" w:hAnsi="Symbol" w:hint="default"/>
+        <w:sz w:val="20"/>
+      </w:rPr>
+    </w:lvl>
+    <w:lvl w:ilvl="1" w:tentative="1">
+      <w:start w:val="1"/>
+      <w:numFmt w:val="bullet"/>
+      <w:lvlText w:val="o"/>
+      <w:lvlJc w:val="left"/>
+      <w:pPr>
+        <w:tabs>
+          <w:tab w:val="num" w:pos="1440"/>
+        </w:tabs>
+        <w:ind w:left="1440" w:hanging="360"/>
+      </w:pPr>
+      <w:rPr>
+        <w:rFonts w:ascii="Courier New" w:hAnsi="Courier New" w:hint="default"/>
+        <w:sz w:val="20"/>
+      </w:rPr>
+    </w:lvl>
+    <w:lvl w:ilvl="2" w:tentative="1">
+      <w:start w:val="1"/>
+      <w:numFmt w:val="bullet"/>
+      <w:lvlText w:val=""/>
+      <w:lvlJc w:val="left"/>
+      <w:pPr>
+        <w:tabs>
+          <w:tab w:val="num" w:pos="2160"/>
+        </w:tabs>
+        <w:ind w:left="2160" w:hanging="360"/>
+      </w:pPr>
+      <w:rPr>
+        <w:rFonts w:ascii="Wingdings" w:hAnsi="Wingdings" w:hint="default"/>
+        <w:sz w:val="20"/>
+      </w:rPr>
+    </w:lvl>
+    <w:lvl w:ilvl="3" w:tentative="1">
+      <w:start w:val="1"/>
+      <w:numFmt w:val="bullet"/>
+      <w:lvlText w:val=""/>
+      <w:lvlJc w:val="left"/>
+      <w:pPr>
+        <w:tabs>
+          <w:tab w:val="num" w:pos="2880"/>
+        </w:tabs>
+        <w:ind w:left="2880" w:hanging="360"/>
+      </w:pPr>
+      <w:rPr>
+        <w:rFonts w:ascii="Wingdings" w:hAnsi="Wingdings" w:hint="default"/>
+        <w:sz w:val="20"/>
+      </w:rPr>
+    </w:lvl>
+    <w:lvl w:ilvl="4" w:tentative="1">
+      <w:start w:val="1"/>
+      <w:numFmt w:val="bullet"/>
+      <w:lvlText w:val=""/>
+      <w:lvlJc w:val="left"/>
+      <w:pPr>
+        <w:tabs>
+          <w:tab w:val="num" w:pos="3600"/>
+        </w:tabs>
+        <w:ind w:left="3600" w:hanging="360"/>
+      </w:pPr>
+      <w:rPr>
+        <w:rFonts w:ascii="Wingdings" w:hAnsi="Wingdings" w:hint="default"/>
+        <w:sz w:val="20"/>
+      </w:rPr>
+    </w:lvl>
+    <w:lvl w:ilvl="5" w:tentative="1">
+      <w:start w:val="1"/>
+      <w:numFmt w:val="bullet"/>
+      <w:lvlText w:val=""/>
+      <w:lvlJc w:val="left"/>
+      <w:pPr>
+        <w:tabs>
+          <w:tab w:val="num" w:pos="4320"/>
+        </w:tabs>
+        <w:ind w:left="4320" w:hanging="360"/>
+      </w:pPr>
+      <w:rPr>
+        <w:rFonts w:ascii="Wingdings" w:hAnsi="Wingdings" w:hint="default"/>
+        <w:sz w:val="20"/>
+      </w:rPr>
+    </w:lvl>
+    <w:lvl w:ilvl="6" w:tentative="1">
+      <w:start w:val="1"/>
+      <w:numFmt w:val="bullet"/>
+      <w:lvlText w:val=""/>
+      <w:lvlJc w:val="left"/>
+      <w:pPr>
+        <w:tabs>
+          <w:tab w:val="num" w:pos="5040"/>
+        </w:tabs>
+        <w:ind w:left="5040" w:hanging="360"/>
+      </w:pPr>
+      <w:rPr>
+        <w:rFonts w:ascii="Wingdings" w:hAnsi="Wingdings" w:hint="default"/>
+        <w:sz w:val="20"/>
+      </w:rPr>
+    </w:lvl>
+    <w:lvl w:ilvl="7" w:tentative="1">
+      <w:start w:val="1"/>
+      <w:numFmt w:val="bullet"/>
+      <w:lvlText w:val=""/>
+      <w:lvlJc w:val="left"/>
+      <w:pPr>
+        <w:tabs>
+          <w:tab w:val="num" w:pos="5760"/>
+        </w:tabs>
+        <w:ind w:left="5760" w:hanging="360"/>
+      </w:pPr>
+      <w:rPr>
+        <w:rFonts w:ascii="Wingdings" w:hAnsi="Wingdings" w:hint="default"/>
+        <w:sz w:val="20"/>
+      </w:rPr>
+    </w:lvl>
+    <w:lvl w:ilvl="8" w:tentative="1">
+      <w:start w:val="1"/>
+      <w:numFmt w:val="bullet"/>
+      <w:lvlText w:val=""/>
+      <w:lvlJc w:val="left"/>
+      <w:pPr>
+        <w:tabs>
+          <w:tab w:val="num" w:pos="6480"/>
+        </w:tabs>
+        <w:ind w:left="6480" w:hanging="360"/>
+      </w:pPr>
+      <w:rPr>
+        <w:rFonts w:ascii="Wingdings" w:hAnsi="Wingdings" w:hint="default"/>
+        <w:sz w:val="20"/>
+      </w:rPr>
+    </w:lvl>
+  </w:abstractNum>
+  <w:abstractNum w:abstractNumId="14" w15:restartNumberingAfterBreak="0">
+    <w:nsid w:val="35234025"/>
+    <w:multiLevelType w:val="multilevel"/>
+    <w:tmpl w:val="137E36B0"/>
+    <w:lvl w:ilvl="0">
+      <w:start w:val="1"/>
+      <w:numFmt w:val="bullet"/>
+      <w:lvlText w:val=""/>
+      <w:lvlJc w:val="left"/>
+      <w:pPr>
+        <w:tabs>
+          <w:tab w:val="num" w:pos="720"/>
+        </w:tabs>
+        <w:ind w:left="720" w:hanging="360"/>
+      </w:pPr>
+      <w:rPr>
+        <w:rFonts w:ascii="Symbol" w:hAnsi="Symbol" w:hint="default"/>
+        <w:sz w:val="20"/>
+      </w:rPr>
+    </w:lvl>
+    <w:lvl w:ilvl="1" w:tentative="1">
+      <w:start w:val="1"/>
+      <w:numFmt w:val="bullet"/>
+      <w:lvlText w:val="o"/>
+      <w:lvlJc w:val="left"/>
+      <w:pPr>
+        <w:tabs>
+          <w:tab w:val="num" w:pos="1440"/>
+        </w:tabs>
+        <w:ind w:left="1440" w:hanging="360"/>
+      </w:pPr>
+      <w:rPr>
+        <w:rFonts w:ascii="Courier New" w:hAnsi="Courier New" w:hint="default"/>
+        <w:sz w:val="20"/>
+      </w:rPr>
+    </w:lvl>
+    <w:lvl w:ilvl="2" w:tentative="1">
+      <w:start w:val="1"/>
+      <w:numFmt w:val="bullet"/>
+      <w:lvlText w:val=""/>
+      <w:lvlJc w:val="left"/>
+      <w:pPr>
+        <w:tabs>
+          <w:tab w:val="num" w:pos="2160"/>
+        </w:tabs>
+        <w:ind w:left="2160" w:hanging="360"/>
+      </w:pPr>
+      <w:rPr>
+        <w:rFonts w:ascii="Wingdings" w:hAnsi="Wingdings" w:hint="default"/>
+        <w:sz w:val="20"/>
+      </w:rPr>
+    </w:lvl>
+    <w:lvl w:ilvl="3" w:tentative="1">
+      <w:start w:val="1"/>
+      <w:numFmt w:val="bullet"/>
+      <w:lvlText w:val=""/>
+      <w:lvlJc w:val="left"/>
+      <w:pPr>
+        <w:tabs>
+          <w:tab w:val="num" w:pos="2880"/>
+        </w:tabs>
+        <w:ind w:left="2880" w:hanging="360"/>
+      </w:pPr>
+      <w:rPr>
+        <w:rFonts w:ascii="Wingdings" w:hAnsi="Wingdings" w:hint="default"/>
+        <w:sz w:val="20"/>
+      </w:rPr>
+    </w:lvl>
+    <w:lvl w:ilvl="4" w:tentative="1">
+      <w:start w:val="1"/>
+      <w:numFmt w:val="bullet"/>
+      <w:lvlText w:val=""/>
+      <w:lvlJc w:val="left"/>
+      <w:pPr>
+        <w:tabs>
+          <w:tab w:val="num" w:pos="3600"/>
+        </w:tabs>
+        <w:ind w:left="3600" w:hanging="360"/>
+      </w:pPr>
+      <w:rPr>
+        <w:rFonts w:ascii="Wingdings" w:hAnsi="Wingdings" w:hint="default"/>
+        <w:sz w:val="20"/>
+      </w:rPr>
+    </w:lvl>
+    <w:lvl w:ilvl="5" w:tentative="1">
+      <w:start w:val="1"/>
+      <w:numFmt w:val="bullet"/>
+      <w:lvlText w:val=""/>
+      <w:lvlJc w:val="left"/>
+      <w:pPr>
+        <w:tabs>
+          <w:tab w:val="num" w:pos="4320"/>
+        </w:tabs>
+        <w:ind w:left="4320" w:hanging="360"/>
+      </w:pPr>
+      <w:rPr>
+        <w:rFonts w:ascii="Wingdings" w:hAnsi="Wingdings" w:hint="default"/>
+        <w:sz w:val="20"/>
+      </w:rPr>
+    </w:lvl>
+    <w:lvl w:ilvl="6" w:tentative="1">
+      <w:start w:val="1"/>
+      <w:numFmt w:val="bullet"/>
+      <w:lvlText w:val=""/>
+      <w:lvlJc w:val="left"/>
+      <w:pPr>
+        <w:tabs>
+          <w:tab w:val="num" w:pos="5040"/>
+        </w:tabs>
+        <w:ind w:left="5040" w:hanging="360"/>
+      </w:pPr>
+      <w:rPr>
+        <w:rFonts w:ascii="Wingdings" w:hAnsi="Wingdings" w:hint="default"/>
+        <w:sz w:val="20"/>
+      </w:rPr>
+    </w:lvl>
+    <w:lvl w:ilvl="7" w:tentative="1">
+      <w:start w:val="1"/>
+      <w:numFmt w:val="bullet"/>
+      <w:lvlText w:val=""/>
+      <w:lvlJc w:val="left"/>
+      <w:pPr>
+        <w:tabs>
+          <w:tab w:val="num" w:pos="5760"/>
+        </w:tabs>
+        <w:ind w:left="5760" w:hanging="360"/>
+      </w:pPr>
+      <w:rPr>
+        <w:rFonts w:ascii="Wingdings" w:hAnsi="Wingdings" w:hint="default"/>
+        <w:sz w:val="20"/>
+      </w:rPr>
+    </w:lvl>
+    <w:lvl w:ilvl="8" w:tentative="1">
+      <w:start w:val="1"/>
+      <w:numFmt w:val="bullet"/>
+      <w:lvlText w:val=""/>
+      <w:lvlJc w:val="left"/>
+      <w:pPr>
+        <w:tabs>
+          <w:tab w:val="num" w:pos="6480"/>
+        </w:tabs>
+        <w:ind w:left="6480" w:hanging="360"/>
+      </w:pPr>
+      <w:rPr>
+        <w:rFonts w:ascii="Wingdings" w:hAnsi="Wingdings" w:hint="default"/>
+        <w:sz w:val="20"/>
+      </w:rPr>
+    </w:lvl>
+  </w:abstractNum>
+  <w:abstractNum w:abstractNumId="15" w15:restartNumberingAfterBreak="0">
+    <w:nsid w:val="3CC46900"/>
+    <w:multiLevelType w:val="multilevel"/>
+    <w:tmpl w:val="096497BC"/>
+    <w:lvl w:ilvl="0">
+      <w:start w:val="1"/>
+      <w:numFmt w:val="bullet"/>
+      <w:lvlText w:val=""/>
+      <w:lvlJc w:val="left"/>
+      <w:pPr>
+        <w:tabs>
+          <w:tab w:val="num" w:pos="720"/>
+        </w:tabs>
+        <w:ind w:left="720" w:hanging="360"/>
+      </w:pPr>
+      <w:rPr>
+        <w:rFonts w:ascii="Symbol" w:hAnsi="Symbol" w:hint="default"/>
+        <w:sz w:val="20"/>
+      </w:rPr>
+    </w:lvl>
+    <w:lvl w:ilvl="1" w:tentative="1">
+      <w:start w:val="1"/>
+      <w:numFmt w:val="bullet"/>
+      <w:lvlText w:val="o"/>
+      <w:lvlJc w:val="left"/>
+      <w:pPr>
+        <w:tabs>
+          <w:tab w:val="num" w:pos="1440"/>
+        </w:tabs>
+        <w:ind w:left="1440" w:hanging="360"/>
+      </w:pPr>
+      <w:rPr>
+        <w:rFonts w:ascii="Courier New" w:hAnsi="Courier New" w:hint="default"/>
+        <w:sz w:val="20"/>
+      </w:rPr>
+    </w:lvl>
+    <w:lvl w:ilvl="2" w:tentative="1">
+      <w:start w:val="1"/>
+      <w:numFmt w:val="bullet"/>
+      <w:lvlText w:val=""/>
+      <w:lvlJc w:val="left"/>
+      <w:pPr>
+        <w:tabs>
+          <w:tab w:val="num" w:pos="2160"/>
+        </w:tabs>
+        <w:ind w:left="2160" w:hanging="360"/>
+      </w:pPr>
+      <w:rPr>
+        <w:rFonts w:ascii="Wingdings" w:hAnsi="Wingdings" w:hint="default"/>
+        <w:sz w:val="20"/>
+      </w:rPr>
+    </w:lvl>
+    <w:lvl w:ilvl="3" w:tentative="1">
+      <w:start w:val="1"/>
+      <w:numFmt w:val="bullet"/>
+      <w:lvlText w:val=""/>
+      <w:lvlJc w:val="left"/>
+      <w:pPr>
+        <w:tabs>
+          <w:tab w:val="num" w:pos="2880"/>
+        </w:tabs>
+        <w:ind w:left="2880" w:hanging="360"/>
+      </w:pPr>
+      <w:rPr>
+        <w:rFonts w:ascii="Wingdings" w:hAnsi="Wingdings" w:hint="default"/>
+        <w:sz w:val="20"/>
+      </w:rPr>
+    </w:lvl>
+    <w:lvl w:ilvl="4" w:tentative="1">
+      <w:start w:val="1"/>
+      <w:numFmt w:val="bullet"/>
+      <w:lvlText w:val=""/>
+      <w:lvlJc w:val="left"/>
+      <w:pPr>
+        <w:tabs>
+          <w:tab w:val="num" w:pos="3600"/>
+        </w:tabs>
+        <w:ind w:left="3600" w:hanging="360"/>
+      </w:pPr>
+      <w:rPr>
+        <w:rFonts w:ascii="Wingdings" w:hAnsi="Wingdings" w:hint="default"/>
+        <w:sz w:val="20"/>
+      </w:rPr>
+    </w:lvl>
+    <w:lvl w:ilvl="5" w:tentative="1">
+      <w:start w:val="1"/>
+      <w:numFmt w:val="bullet"/>
+      <w:lvlText w:val=""/>
+      <w:lvlJc w:val="left"/>
+      <w:pPr>
+        <w:tabs>
+          <w:tab w:val="num" w:pos="4320"/>
+        </w:tabs>
+        <w:ind w:left="4320" w:hanging="360"/>
+      </w:pPr>
+      <w:rPr>
+        <w:rFonts w:ascii="Wingdings" w:hAnsi="Wingdings" w:hint="default"/>
+        <w:sz w:val="20"/>
+      </w:rPr>
+    </w:lvl>
+    <w:lvl w:ilvl="6" w:tentative="1">
+      <w:start w:val="1"/>
+      <w:numFmt w:val="bullet"/>
+      <w:lvlText w:val=""/>
+      <w:lvlJc w:val="left"/>
+      <w:pPr>
+        <w:tabs>
+          <w:tab w:val="num" w:pos="5040"/>
+        </w:tabs>
+        <w:ind w:left="5040" w:hanging="360"/>
+      </w:pPr>
+      <w:rPr>
+        <w:rFonts w:ascii="Wingdings" w:hAnsi="Wingdings" w:hint="default"/>
+        <w:sz w:val="20"/>
+      </w:rPr>
+    </w:lvl>
+    <w:lvl w:ilvl="7" w:tentative="1">
+      <w:start w:val="1"/>
+      <w:numFmt w:val="bullet"/>
+      <w:lvlText w:val=""/>
+      <w:lvlJc w:val="left"/>
+      <w:pPr>
+        <w:tabs>
+          <w:tab w:val="num" w:pos="5760"/>
+        </w:tabs>
+        <w:ind w:left="5760" w:hanging="360"/>
+      </w:pPr>
+      <w:rPr>
+        <w:rFonts w:ascii="Wingdings" w:hAnsi="Wingdings" w:hint="default"/>
+        <w:sz w:val="20"/>
+      </w:rPr>
+    </w:lvl>
+    <w:lvl w:ilvl="8" w:tentative="1">
+      <w:start w:val="1"/>
+      <w:numFmt w:val="bullet"/>
+      <w:lvlText w:val=""/>
+      <w:lvlJc w:val="left"/>
+      <w:pPr>
+        <w:tabs>
+          <w:tab w:val="num" w:pos="6480"/>
+        </w:tabs>
+        <w:ind w:left="6480" w:hanging="360"/>
+      </w:pPr>
+      <w:rPr>
+        <w:rFonts w:ascii="Wingdings" w:hAnsi="Wingdings" w:hint="default"/>
+        <w:sz w:val="20"/>
+      </w:rPr>
+    </w:lvl>
+  </w:abstractNum>
+  <w:abstractNum w:abstractNumId="16" w15:restartNumberingAfterBreak="0">
+    <w:nsid w:val="410C22EA"/>
+    <w:multiLevelType w:val="multilevel"/>
+    <w:tmpl w:val="60BEC1E2"/>
+    <w:lvl w:ilvl="0">
+      <w:start w:val="1"/>
+      <w:numFmt w:val="bullet"/>
+      <w:lvlText w:val=""/>
+      <w:lvlJc w:val="left"/>
+      <w:pPr>
+        <w:tabs>
+          <w:tab w:val="num" w:pos="720"/>
+        </w:tabs>
+        <w:ind w:left="720" w:hanging="360"/>
+      </w:pPr>
+      <w:rPr>
+        <w:rFonts w:ascii="Symbol" w:hAnsi="Symbol" w:hint="default"/>
+        <w:sz w:val="20"/>
+      </w:rPr>
+    </w:lvl>
+    <w:lvl w:ilvl="1" w:tentative="1">
+      <w:start w:val="1"/>
+      <w:numFmt w:val="bullet"/>
+      <w:lvlText w:val="o"/>
+      <w:lvlJc w:val="left"/>
+      <w:pPr>
+        <w:tabs>
+          <w:tab w:val="num" w:pos="1440"/>
+        </w:tabs>
+        <w:ind w:left="1440" w:hanging="360"/>
+      </w:pPr>
+      <w:rPr>
+        <w:rFonts w:ascii="Courier New" w:hAnsi="Courier New" w:hint="default"/>
+        <w:sz w:val="20"/>
+      </w:rPr>
+    </w:lvl>
+    <w:lvl w:ilvl="2" w:tentative="1">
+      <w:start w:val="1"/>
+      <w:numFmt w:val="bullet"/>
+      <w:lvlText w:val=""/>
+      <w:lvlJc w:val="left"/>
+      <w:pPr>
+        <w:tabs>
+          <w:tab w:val="num" w:pos="2160"/>
+        </w:tabs>
+        <w:ind w:left="2160" w:hanging="360"/>
+      </w:pPr>
+      <w:rPr>
+        <w:rFonts w:ascii="Wingdings" w:hAnsi="Wingdings" w:hint="default"/>
+        <w:sz w:val="20"/>
+      </w:rPr>
+    </w:lvl>
+    <w:lvl w:ilvl="3" w:tentative="1">
+      <w:start w:val="1"/>
+      <w:numFmt w:val="bullet"/>
+      <w:lvlText w:val=""/>
+      <w:lvlJc w:val="left"/>
+      <w:pPr>
+        <w:tabs>
+          <w:tab w:val="num" w:pos="2880"/>
+        </w:tabs>
+        <w:ind w:left="2880" w:hanging="360"/>
+      </w:pPr>
+      <w:rPr>
+        <w:rFonts w:ascii="Wingdings" w:hAnsi="Wingdings" w:hint="default"/>
+        <w:sz w:val="20"/>
+      </w:rPr>
+    </w:lvl>
+    <w:lvl w:ilvl="4" w:tentative="1">
+      <w:start w:val="1"/>
+      <w:numFmt w:val="bullet"/>
+      <w:lvlText w:val=""/>
+      <w:lvlJc w:val="left"/>
+      <w:pPr>
+        <w:tabs>
+          <w:tab w:val="num" w:pos="3600"/>
+        </w:tabs>
+        <w:ind w:left="3600" w:hanging="360"/>
+      </w:pPr>
+      <w:rPr>
+        <w:rFonts w:ascii="Wingdings" w:hAnsi="Wingdings" w:hint="default"/>
+        <w:sz w:val="20"/>
+      </w:rPr>
+    </w:lvl>
+    <w:lvl w:ilvl="5" w:tentative="1">
+      <w:start w:val="1"/>
+      <w:numFmt w:val="bullet"/>
+      <w:lvlText w:val=""/>
+      <w:lvlJc w:val="left"/>
+      <w:pPr>
+        <w:tabs>
+          <w:tab w:val="num" w:pos="4320"/>
+        </w:tabs>
+        <w:ind w:left="4320" w:hanging="360"/>
+      </w:pPr>
+      <w:rPr>
+        <w:rFonts w:ascii="Wingdings" w:hAnsi="Wingdings" w:hint="default"/>
+        <w:sz w:val="20"/>
+      </w:rPr>
+    </w:lvl>
+    <w:lvl w:ilvl="6" w:tentative="1">
+      <w:start w:val="1"/>
+      <w:numFmt w:val="bullet"/>
+      <w:lvlText w:val=""/>
+      <w:lvlJc w:val="left"/>
+      <w:pPr>
+        <w:tabs>
+          <w:tab w:val="num" w:pos="5040"/>
+        </w:tabs>
+        <w:ind w:left="5040" w:hanging="360"/>
+      </w:pPr>
+      <w:rPr>
+        <w:rFonts w:ascii="Wingdings" w:hAnsi="Wingdings" w:hint="default"/>
+        <w:sz w:val="20"/>
+      </w:rPr>
+    </w:lvl>
+    <w:lvl w:ilvl="7" w:tentative="1">
+      <w:start w:val="1"/>
+      <w:numFmt w:val="bullet"/>
+      <w:lvlText w:val=""/>
+      <w:lvlJc w:val="left"/>
+      <w:pPr>
+        <w:tabs>
+          <w:tab w:val="num" w:pos="5760"/>
+        </w:tabs>
+        <w:ind w:left="5760" w:hanging="360"/>
+      </w:pPr>
+      <w:rPr>
+        <w:rFonts w:ascii="Wingdings" w:hAnsi="Wingdings" w:hint="default"/>
+        <w:sz w:val="20"/>
+      </w:rPr>
+    </w:lvl>
+    <w:lvl w:ilvl="8" w:tentative="1">
+      <w:start w:val="1"/>
+      <w:numFmt w:val="bullet"/>
+      <w:lvlText w:val=""/>
+      <w:lvlJc w:val="left"/>
+      <w:pPr>
+        <w:tabs>
+          <w:tab w:val="num" w:pos="6480"/>
+        </w:tabs>
+        <w:ind w:left="6480" w:hanging="360"/>
+      </w:pPr>
+      <w:rPr>
+        <w:rFonts w:ascii="Wingdings" w:hAnsi="Wingdings" w:hint="default"/>
+        <w:sz w:val="20"/>
+      </w:rPr>
+    </w:lvl>
+  </w:abstractNum>
+  <w:abstractNum w:abstractNumId="17" w15:restartNumberingAfterBreak="0">
+    <w:nsid w:val="457611D8"/>
+    <w:multiLevelType w:val="multilevel"/>
+    <w:tmpl w:val="830CCD72"/>
+    <w:lvl w:ilvl="0">
+      <w:start w:val="1"/>
+      <w:numFmt w:val="bullet"/>
+      <w:lvlText w:val=""/>
+      <w:lvlJc w:val="left"/>
+      <w:pPr>
+        <w:tabs>
+          <w:tab w:val="num" w:pos="720"/>
+        </w:tabs>
+        <w:ind w:left="720" w:hanging="360"/>
+      </w:pPr>
+      <w:rPr>
+        <w:rFonts w:ascii="Symbol" w:hAnsi="Symbol" w:hint="default"/>
+        <w:sz w:val="20"/>
+      </w:rPr>
+    </w:lvl>
+    <w:lvl w:ilvl="1" w:tentative="1">
+      <w:start w:val="1"/>
+      <w:numFmt w:val="bullet"/>
+      <w:lvlText w:val="o"/>
+      <w:lvlJc w:val="left"/>
+      <w:pPr>
+        <w:tabs>
+          <w:tab w:val="num" w:pos="1440"/>
+        </w:tabs>
+        <w:ind w:left="1440" w:hanging="360"/>
+      </w:pPr>
+      <w:rPr>
+        <w:rFonts w:ascii="Courier New" w:hAnsi="Courier New" w:hint="default"/>
+        <w:sz w:val="20"/>
+      </w:rPr>
+    </w:lvl>
+    <w:lvl w:ilvl="2" w:tentative="1">
+      <w:start w:val="1"/>
+      <w:numFmt w:val="bullet"/>
+      <w:lvlText w:val=""/>
+      <w:lvlJc w:val="left"/>
+      <w:pPr>
+        <w:tabs>
+          <w:tab w:val="num" w:pos="2160"/>
+        </w:tabs>
+        <w:ind w:left="2160" w:hanging="360"/>
+      </w:pPr>
+      <w:rPr>
+        <w:rFonts w:ascii="Wingdings" w:hAnsi="Wingdings" w:hint="default"/>
+        <w:sz w:val="20"/>
+      </w:rPr>
+    </w:lvl>
+    <w:lvl w:ilvl="3" w:tentative="1">
+      <w:start w:val="1"/>
+      <w:numFmt w:val="bullet"/>
+      <w:lvlText w:val=""/>
+      <w:lvlJc w:val="left"/>
+      <w:pPr>
+        <w:tabs>
+          <w:tab w:val="num" w:pos="2880"/>
+        </w:tabs>
+        <w:ind w:left="2880" w:hanging="360"/>
+      </w:pPr>
+      <w:rPr>
+        <w:rFonts w:ascii="Wingdings" w:hAnsi="Wingdings" w:hint="default"/>
+        <w:sz w:val="20"/>
+      </w:rPr>
+    </w:lvl>
+    <w:lvl w:ilvl="4" w:tentative="1">
+      <w:start w:val="1"/>
+      <w:numFmt w:val="bullet"/>
+      <w:lvlText w:val=""/>
+      <w:lvlJc w:val="left"/>
+      <w:pPr>
+        <w:tabs>
+          <w:tab w:val="num" w:pos="3600"/>
+        </w:tabs>
+        <w:ind w:left="3600" w:hanging="360"/>
+      </w:pPr>
+      <w:rPr>
+        <w:rFonts w:ascii="Wingdings" w:hAnsi="Wingdings" w:hint="default"/>
+        <w:sz w:val="20"/>
+      </w:rPr>
+    </w:lvl>
+    <w:lvl w:ilvl="5" w:tentative="1">
+      <w:start w:val="1"/>
+      <w:numFmt w:val="bullet"/>
+      <w:lvlText w:val=""/>
+      <w:lvlJc w:val="left"/>
+      <w:pPr>
+        <w:tabs>
+          <w:tab w:val="num" w:pos="4320"/>
+        </w:tabs>
+        <w:ind w:left="4320" w:hanging="360"/>
+      </w:pPr>
+      <w:rPr>
+        <w:rFonts w:ascii="Wingdings" w:hAnsi="Wingdings" w:hint="default"/>
+        <w:sz w:val="20"/>
+      </w:rPr>
+    </w:lvl>
+    <w:lvl w:ilvl="6" w:tentative="1">
+      <w:start w:val="1"/>
+      <w:numFmt w:val="bullet"/>
+      <w:lvlText w:val=""/>
+      <w:lvlJc w:val="left"/>
+      <w:pPr>
+        <w:tabs>
+          <w:tab w:val="num" w:pos="5040"/>
+        </w:tabs>
+        <w:ind w:left="5040" w:hanging="360"/>
+      </w:pPr>
+      <w:rPr>
+        <w:rFonts w:ascii="Wingdings" w:hAnsi="Wingdings" w:hint="default"/>
+        <w:sz w:val="20"/>
+      </w:rPr>
+    </w:lvl>
+    <w:lvl w:ilvl="7" w:tentative="1">
+      <w:start w:val="1"/>
+      <w:numFmt w:val="bullet"/>
+      <w:lvlText w:val=""/>
+      <w:lvlJc w:val="left"/>
+      <w:pPr>
+        <w:tabs>
+          <w:tab w:val="num" w:pos="5760"/>
+        </w:tabs>
+        <w:ind w:left="5760" w:hanging="360"/>
+      </w:pPr>
+      <w:rPr>
+        <w:rFonts w:ascii="Wingdings" w:hAnsi="Wingdings" w:hint="default"/>
+        <w:sz w:val="20"/>
+      </w:rPr>
+    </w:lvl>
+    <w:lvl w:ilvl="8" w:tentative="1">
+      <w:start w:val="1"/>
+      <w:numFmt w:val="bullet"/>
+      <w:lvlText w:val=""/>
+      <w:lvlJc w:val="left"/>
+      <w:pPr>
+        <w:tabs>
+          <w:tab w:val="num" w:pos="6480"/>
+        </w:tabs>
+        <w:ind w:left="6480" w:hanging="360"/>
+      </w:pPr>
+      <w:rPr>
+        <w:rFonts w:ascii="Wingdings" w:hAnsi="Wingdings" w:hint="default"/>
+        <w:sz w:val="20"/>
+      </w:rPr>
+    </w:lvl>
+  </w:abstractNum>
+  <w:abstractNum w:abstractNumId="18" w15:restartNumberingAfterBreak="0">
     <w:nsid w:val="469749A6"/>
     <w:multiLevelType w:val="multilevel"/>
     <w:tmpl w:val="5D2A94C6"/>
@@ -4921,7 +7835,7 @@
       </w:rPr>
     </w:lvl>
   </w:abstractNum>
-  <w:abstractNum w:abstractNumId="10" w15:restartNumberingAfterBreak="0">
+  <w:abstractNum w:abstractNumId="19" w15:restartNumberingAfterBreak="0">
     <w:nsid w:val="49994528"/>
     <w:multiLevelType w:val="multilevel"/>
     <w:tmpl w:val="8E1E7D92"/>
@@ -5070,7 +7984,156 @@
       </w:rPr>
     </w:lvl>
   </w:abstractNum>
-  <w:abstractNum w:abstractNumId="11" w15:restartNumberingAfterBreak="0">
+  <w:abstractNum w:abstractNumId="20" w15:restartNumberingAfterBreak="0">
+    <w:nsid w:val="4A5324C6"/>
+    <w:multiLevelType w:val="multilevel"/>
+    <w:tmpl w:val="E5740F10"/>
+    <w:lvl w:ilvl="0">
+      <w:start w:val="1"/>
+      <w:numFmt w:val="bullet"/>
+      <w:lvlText w:val=""/>
+      <w:lvlJc w:val="left"/>
+      <w:pPr>
+        <w:tabs>
+          <w:tab w:val="num" w:pos="720"/>
+        </w:tabs>
+        <w:ind w:left="720" w:hanging="360"/>
+      </w:pPr>
+      <w:rPr>
+        <w:rFonts w:ascii="Symbol" w:hAnsi="Symbol" w:hint="default"/>
+        <w:sz w:val="20"/>
+      </w:rPr>
+    </w:lvl>
+    <w:lvl w:ilvl="1" w:tentative="1">
+      <w:start w:val="1"/>
+      <w:numFmt w:val="bullet"/>
+      <w:lvlText w:val="o"/>
+      <w:lvlJc w:val="left"/>
+      <w:pPr>
+        <w:tabs>
+          <w:tab w:val="num" w:pos="1440"/>
+        </w:tabs>
+        <w:ind w:left="1440" w:hanging="360"/>
+      </w:pPr>
+      <w:rPr>
+        <w:rFonts w:ascii="Courier New" w:hAnsi="Courier New" w:hint="default"/>
+        <w:sz w:val="20"/>
+      </w:rPr>
+    </w:lvl>
+    <w:lvl w:ilvl="2" w:tentative="1">
+      <w:start w:val="1"/>
+      <w:numFmt w:val="bullet"/>
+      <w:lvlText w:val=""/>
+      <w:lvlJc w:val="left"/>
+      <w:pPr>
+        <w:tabs>
+          <w:tab w:val="num" w:pos="2160"/>
+        </w:tabs>
+        <w:ind w:left="2160" w:hanging="360"/>
+      </w:pPr>
+      <w:rPr>
+        <w:rFonts w:ascii="Wingdings" w:hAnsi="Wingdings" w:hint="default"/>
+        <w:sz w:val="20"/>
+      </w:rPr>
+    </w:lvl>
+    <w:lvl w:ilvl="3" w:tentative="1">
+      <w:start w:val="1"/>
+      <w:numFmt w:val="bullet"/>
+      <w:lvlText w:val=""/>
+      <w:lvlJc w:val="left"/>
+      <w:pPr>
+        <w:tabs>
+          <w:tab w:val="num" w:pos="2880"/>
+        </w:tabs>
+        <w:ind w:left="2880" w:hanging="360"/>
+      </w:pPr>
+      <w:rPr>
+        <w:rFonts w:ascii="Wingdings" w:hAnsi="Wingdings" w:hint="default"/>
+        <w:sz w:val="20"/>
+      </w:rPr>
+    </w:lvl>
+    <w:lvl w:ilvl="4" w:tentative="1">
+      <w:start w:val="1"/>
+      <w:numFmt w:val="bullet"/>
+      <w:lvlText w:val=""/>
+      <w:lvlJc w:val="left"/>
+      <w:pPr>
+        <w:tabs>
+          <w:tab w:val="num" w:pos="3600"/>
+        </w:tabs>
+        <w:ind w:left="3600" w:hanging="360"/>
+      </w:pPr>
+      <w:rPr>
+        <w:rFonts w:ascii="Wingdings" w:hAnsi="Wingdings" w:hint="default"/>
+        <w:sz w:val="20"/>
+      </w:rPr>
+    </w:lvl>
+    <w:lvl w:ilvl="5" w:tentative="1">
+      <w:start w:val="1"/>
+      <w:numFmt w:val="bullet"/>
+      <w:lvlText w:val=""/>
+      <w:lvlJc w:val="left"/>
+      <w:pPr>
+        <w:tabs>
+          <w:tab w:val="num" w:pos="4320"/>
+        </w:tabs>
+        <w:ind w:left="4320" w:hanging="360"/>
+      </w:pPr>
+      <w:rPr>
+        <w:rFonts w:ascii="Wingdings" w:hAnsi="Wingdings" w:hint="default"/>
+        <w:sz w:val="20"/>
+      </w:rPr>
+    </w:lvl>
+    <w:lvl w:ilvl="6" w:tentative="1">
+      <w:start w:val="1"/>
+      <w:numFmt w:val="bullet"/>
+      <w:lvlText w:val=""/>
+      <w:lvlJc w:val="left"/>
+      <w:pPr>
+        <w:tabs>
+          <w:tab w:val="num" w:pos="5040"/>
+        </w:tabs>
+        <w:ind w:left="5040" w:hanging="360"/>
+      </w:pPr>
+      <w:rPr>
+        <w:rFonts w:ascii="Wingdings" w:hAnsi="Wingdings" w:hint="default"/>
+        <w:sz w:val="20"/>
+      </w:rPr>
+    </w:lvl>
+    <w:lvl w:ilvl="7" w:tentative="1">
+      <w:start w:val="1"/>
+      <w:numFmt w:val="bullet"/>
+      <w:lvlText w:val=""/>
+      <w:lvlJc w:val="left"/>
+      <w:pPr>
+        <w:tabs>
+          <w:tab w:val="num" w:pos="5760"/>
+        </w:tabs>
+        <w:ind w:left="5760" w:hanging="360"/>
+      </w:pPr>
+      <w:rPr>
+        <w:rFonts w:ascii="Wingdings" w:hAnsi="Wingdings" w:hint="default"/>
+        <w:sz w:val="20"/>
+      </w:rPr>
+    </w:lvl>
+    <w:lvl w:ilvl="8" w:tentative="1">
+      <w:start w:val="1"/>
+      <w:numFmt w:val="bullet"/>
+      <w:lvlText w:val=""/>
+      <w:lvlJc w:val="left"/>
+      <w:pPr>
+        <w:tabs>
+          <w:tab w:val="num" w:pos="6480"/>
+        </w:tabs>
+        <w:ind w:left="6480" w:hanging="360"/>
+      </w:pPr>
+      <w:rPr>
+        <w:rFonts w:ascii="Wingdings" w:hAnsi="Wingdings" w:hint="default"/>
+        <w:sz w:val="20"/>
+      </w:rPr>
+    </w:lvl>
+  </w:abstractNum>
+  <w:abstractNum w:abstractNumId="21" w15:restartNumberingAfterBreak="0">
     <w:nsid w:val="4B5253D5"/>
     <w:multiLevelType w:val="multilevel"/>
     <w:tmpl w:val="A8FECD14"/>
@@ -5219,7 +8282,7 @@
       </w:rPr>
     </w:lvl>
   </w:abstractNum>
-  <w:abstractNum w:abstractNumId="12" w15:restartNumberingAfterBreak="0">
+  <w:abstractNum w:abstractNumId="22" w15:restartNumberingAfterBreak="0">
     <w:nsid w:val="4C397429"/>
     <w:multiLevelType w:val="multilevel"/>
     <w:tmpl w:val="2712234E"/>
@@ -5368,7 +8431,7 @@
       </w:rPr>
     </w:lvl>
   </w:abstractNum>
-  <w:abstractNum w:abstractNumId="13" w15:restartNumberingAfterBreak="0">
+  <w:abstractNum w:abstractNumId="23" w15:restartNumberingAfterBreak="0">
     <w:nsid w:val="4CD31116"/>
     <w:multiLevelType w:val="multilevel"/>
     <w:tmpl w:val="54E8CCEA"/>
@@ -5517,7 +8580,7 @@
       </w:rPr>
     </w:lvl>
   </w:abstractNum>
-  <w:abstractNum w:abstractNumId="14" w15:restartNumberingAfterBreak="0">
+  <w:abstractNum w:abstractNumId="24" w15:restartNumberingAfterBreak="0">
     <w:nsid w:val="52EA2794"/>
     <w:multiLevelType w:val="multilevel"/>
     <w:tmpl w:val="2FC2ABF2"/>
@@ -5666,7 +8729,7 @@
       </w:rPr>
     </w:lvl>
   </w:abstractNum>
-  <w:abstractNum w:abstractNumId="15" w15:restartNumberingAfterBreak="0">
+  <w:abstractNum w:abstractNumId="25" w15:restartNumberingAfterBreak="0">
     <w:nsid w:val="58130AA6"/>
     <w:multiLevelType w:val="multilevel"/>
     <w:tmpl w:val="79CAAF96"/>
@@ -5815,7 +8878,7 @@
       </w:rPr>
     </w:lvl>
   </w:abstractNum>
-  <w:abstractNum w:abstractNumId="16" w15:restartNumberingAfterBreak="0">
+  <w:abstractNum w:abstractNumId="26" w15:restartNumberingAfterBreak="0">
     <w:nsid w:val="5AB066DB"/>
     <w:multiLevelType w:val="multilevel"/>
     <w:tmpl w:val="6832B650"/>
@@ -5964,7 +9027,156 @@
       </w:rPr>
     </w:lvl>
   </w:abstractNum>
-  <w:abstractNum w:abstractNumId="17" w15:restartNumberingAfterBreak="0">
+  <w:abstractNum w:abstractNumId="27" w15:restartNumberingAfterBreak="0">
+    <w:nsid w:val="688B6FEA"/>
+    <w:multiLevelType w:val="multilevel"/>
+    <w:tmpl w:val="673A795E"/>
+    <w:lvl w:ilvl="0">
+      <w:start w:val="1"/>
+      <w:numFmt w:val="bullet"/>
+      <w:lvlText w:val=""/>
+      <w:lvlJc w:val="left"/>
+      <w:pPr>
+        <w:tabs>
+          <w:tab w:val="num" w:pos="720"/>
+        </w:tabs>
+        <w:ind w:left="720" w:hanging="360"/>
+      </w:pPr>
+      <w:rPr>
+        <w:rFonts w:ascii="Symbol" w:hAnsi="Symbol" w:hint="default"/>
+        <w:sz w:val="20"/>
+      </w:rPr>
+    </w:lvl>
+    <w:lvl w:ilvl="1" w:tentative="1">
+      <w:start w:val="1"/>
+      <w:numFmt w:val="bullet"/>
+      <w:lvlText w:val="o"/>
+      <w:lvlJc w:val="left"/>
+      <w:pPr>
+        <w:tabs>
+          <w:tab w:val="num" w:pos="1440"/>
+        </w:tabs>
+        <w:ind w:left="1440" w:hanging="360"/>
+      </w:pPr>
+      <w:rPr>
+        <w:rFonts w:ascii="Courier New" w:hAnsi="Courier New" w:hint="default"/>
+        <w:sz w:val="20"/>
+      </w:rPr>
+    </w:lvl>
+    <w:lvl w:ilvl="2" w:tentative="1">
+      <w:start w:val="1"/>
+      <w:numFmt w:val="bullet"/>
+      <w:lvlText w:val=""/>
+      <w:lvlJc w:val="left"/>
+      <w:pPr>
+        <w:tabs>
+          <w:tab w:val="num" w:pos="2160"/>
+        </w:tabs>
+        <w:ind w:left="2160" w:hanging="360"/>
+      </w:pPr>
+      <w:rPr>
+        <w:rFonts w:ascii="Wingdings" w:hAnsi="Wingdings" w:hint="default"/>
+        <w:sz w:val="20"/>
+      </w:rPr>
+    </w:lvl>
+    <w:lvl w:ilvl="3" w:tentative="1">
+      <w:start w:val="1"/>
+      <w:numFmt w:val="bullet"/>
+      <w:lvlText w:val=""/>
+      <w:lvlJc w:val="left"/>
+      <w:pPr>
+        <w:tabs>
+          <w:tab w:val="num" w:pos="2880"/>
+        </w:tabs>
+        <w:ind w:left="2880" w:hanging="360"/>
+      </w:pPr>
+      <w:rPr>
+        <w:rFonts w:ascii="Wingdings" w:hAnsi="Wingdings" w:hint="default"/>
+        <w:sz w:val="20"/>
+      </w:rPr>
+    </w:lvl>
+    <w:lvl w:ilvl="4" w:tentative="1">
+      <w:start w:val="1"/>
+      <w:numFmt w:val="bullet"/>
+      <w:lvlText w:val=""/>
+      <w:lvlJc w:val="left"/>
+      <w:pPr>
+        <w:tabs>
+          <w:tab w:val="num" w:pos="3600"/>
+        </w:tabs>
+        <w:ind w:left="3600" w:hanging="360"/>
+      </w:pPr>
+      <w:rPr>
+        <w:rFonts w:ascii="Wingdings" w:hAnsi="Wingdings" w:hint="default"/>
+        <w:sz w:val="20"/>
+      </w:rPr>
+    </w:lvl>
+    <w:lvl w:ilvl="5" w:tentative="1">
+      <w:start w:val="1"/>
+      <w:numFmt w:val="bullet"/>
+      <w:lvlText w:val=""/>
+      <w:lvlJc w:val="left"/>
+      <w:pPr>
+        <w:tabs>
+          <w:tab w:val="num" w:pos="4320"/>
+        </w:tabs>
+        <w:ind w:left="4320" w:hanging="360"/>
+      </w:pPr>
+      <w:rPr>
+        <w:rFonts w:ascii="Wingdings" w:hAnsi="Wingdings" w:hint="default"/>
+        <w:sz w:val="20"/>
+      </w:rPr>
+    </w:lvl>
+    <w:lvl w:ilvl="6" w:tentative="1">
+      <w:start w:val="1"/>
+      <w:numFmt w:val="bullet"/>
+      <w:lvlText w:val=""/>
+      <w:lvlJc w:val="left"/>
+      <w:pPr>
+        <w:tabs>
+          <w:tab w:val="num" w:pos="5040"/>
+        </w:tabs>
+        <w:ind w:left="5040" w:hanging="360"/>
+      </w:pPr>
+      <w:rPr>
+        <w:rFonts w:ascii="Wingdings" w:hAnsi="Wingdings" w:hint="default"/>
+        <w:sz w:val="20"/>
+      </w:rPr>
+    </w:lvl>
+    <w:lvl w:ilvl="7" w:tentative="1">
+      <w:start w:val="1"/>
+      <w:numFmt w:val="bullet"/>
+      <w:lvlText w:val=""/>
+      <w:lvlJc w:val="left"/>
+      <w:pPr>
+        <w:tabs>
+          <w:tab w:val="num" w:pos="5760"/>
+        </w:tabs>
+        <w:ind w:left="5760" w:hanging="360"/>
+      </w:pPr>
+      <w:rPr>
+        <w:rFonts w:ascii="Wingdings" w:hAnsi="Wingdings" w:hint="default"/>
+        <w:sz w:val="20"/>
+      </w:rPr>
+    </w:lvl>
+    <w:lvl w:ilvl="8" w:tentative="1">
+      <w:start w:val="1"/>
+      <w:numFmt w:val="bullet"/>
+      <w:lvlText w:val=""/>
+      <w:lvlJc w:val="left"/>
+      <w:pPr>
+        <w:tabs>
+          <w:tab w:val="num" w:pos="6480"/>
+        </w:tabs>
+        <w:ind w:left="6480" w:hanging="360"/>
+      </w:pPr>
+      <w:rPr>
+        <w:rFonts w:ascii="Wingdings" w:hAnsi="Wingdings" w:hint="default"/>
+        <w:sz w:val="20"/>
+      </w:rPr>
+    </w:lvl>
+  </w:abstractNum>
+  <w:abstractNum w:abstractNumId="28" w15:restartNumberingAfterBreak="0">
     <w:nsid w:val="6D396D2E"/>
     <w:multiLevelType w:val="multilevel"/>
     <w:tmpl w:val="B98498BE"/>
@@ -6077,7 +9289,7 @@
       </w:pPr>
     </w:lvl>
   </w:abstractNum>
-  <w:abstractNum w:abstractNumId="18" w15:restartNumberingAfterBreak="0">
+  <w:abstractNum w:abstractNumId="29" w15:restartNumberingAfterBreak="0">
     <w:nsid w:val="6E614DA2"/>
     <w:multiLevelType w:val="multilevel"/>
     <w:tmpl w:val="044E766C"/>
@@ -6226,7 +9438,7 @@
       </w:rPr>
     </w:lvl>
   </w:abstractNum>
-  <w:abstractNum w:abstractNumId="19" w15:restartNumberingAfterBreak="0">
+  <w:abstractNum w:abstractNumId="30" w15:restartNumberingAfterBreak="0">
     <w:nsid w:val="6EA63806"/>
     <w:multiLevelType w:val="multilevel"/>
     <w:tmpl w:val="089E0A4A"/>
@@ -6375,7 +9587,7 @@
       </w:rPr>
     </w:lvl>
   </w:abstractNum>
-  <w:abstractNum w:abstractNumId="20" w15:restartNumberingAfterBreak="0">
+  <w:abstractNum w:abstractNumId="31" w15:restartNumberingAfterBreak="0">
     <w:nsid w:val="738B72FB"/>
     <w:multiLevelType w:val="multilevel"/>
     <w:tmpl w:val="BE6A9166"/>
@@ -6524,7 +9736,7 @@
       </w:rPr>
     </w:lvl>
   </w:abstractNum>
-  <w:abstractNum w:abstractNumId="21" w15:restartNumberingAfterBreak="0">
+  <w:abstractNum w:abstractNumId="32" w15:restartNumberingAfterBreak="0">
     <w:nsid w:val="7725290C"/>
     <w:multiLevelType w:val="multilevel"/>
     <w:tmpl w:val="DF9CDF72"/>
@@ -6673,7 +9885,305 @@
       </w:rPr>
     </w:lvl>
   </w:abstractNum>
-  <w:abstractNum w:abstractNumId="22" w15:restartNumberingAfterBreak="0">
+  <w:abstractNum w:abstractNumId="33" w15:restartNumberingAfterBreak="0">
+    <w:nsid w:val="78BD455D"/>
+    <w:multiLevelType w:val="multilevel"/>
+    <w:tmpl w:val="8ACC5592"/>
+    <w:lvl w:ilvl="0">
+      <w:start w:val="1"/>
+      <w:numFmt w:val="bullet"/>
+      <w:lvlText w:val=""/>
+      <w:lvlJc w:val="left"/>
+      <w:pPr>
+        <w:tabs>
+          <w:tab w:val="num" w:pos="720"/>
+        </w:tabs>
+        <w:ind w:left="720" w:hanging="360"/>
+      </w:pPr>
+      <w:rPr>
+        <w:rFonts w:ascii="Symbol" w:hAnsi="Symbol" w:hint="default"/>
+        <w:sz w:val="20"/>
+      </w:rPr>
+    </w:lvl>
+    <w:lvl w:ilvl="1" w:tentative="1">
+      <w:start w:val="1"/>
+      <w:numFmt w:val="bullet"/>
+      <w:lvlText w:val="o"/>
+      <w:lvlJc w:val="left"/>
+      <w:pPr>
+        <w:tabs>
+          <w:tab w:val="num" w:pos="1440"/>
+        </w:tabs>
+        <w:ind w:left="1440" w:hanging="360"/>
+      </w:pPr>
+      <w:rPr>
+        <w:rFonts w:ascii="Courier New" w:hAnsi="Courier New" w:hint="default"/>
+        <w:sz w:val="20"/>
+      </w:rPr>
+    </w:lvl>
+    <w:lvl w:ilvl="2" w:tentative="1">
+      <w:start w:val="1"/>
+      <w:numFmt w:val="bullet"/>
+      <w:lvlText w:val=""/>
+      <w:lvlJc w:val="left"/>
+      <w:pPr>
+        <w:tabs>
+          <w:tab w:val="num" w:pos="2160"/>
+        </w:tabs>
+        <w:ind w:left="2160" w:hanging="360"/>
+      </w:pPr>
+      <w:rPr>
+        <w:rFonts w:ascii="Wingdings" w:hAnsi="Wingdings" w:hint="default"/>
+        <w:sz w:val="20"/>
+      </w:rPr>
+    </w:lvl>
+    <w:lvl w:ilvl="3" w:tentative="1">
+      <w:start w:val="1"/>
+      <w:numFmt w:val="bullet"/>
+      <w:lvlText w:val=""/>
+      <w:lvlJc w:val="left"/>
+      <w:pPr>
+        <w:tabs>
+          <w:tab w:val="num" w:pos="2880"/>
+        </w:tabs>
+        <w:ind w:left="2880" w:hanging="360"/>
+      </w:pPr>
+      <w:rPr>
+        <w:rFonts w:ascii="Wingdings" w:hAnsi="Wingdings" w:hint="default"/>
+        <w:sz w:val="20"/>
+      </w:rPr>
+    </w:lvl>
+    <w:lvl w:ilvl="4" w:tentative="1">
+      <w:start w:val="1"/>
+      <w:numFmt w:val="bullet"/>
+      <w:lvlText w:val=""/>
+      <w:lvlJc w:val="left"/>
+      <w:pPr>
+        <w:tabs>
+          <w:tab w:val="num" w:pos="3600"/>
+        </w:tabs>
+        <w:ind w:left="3600" w:hanging="360"/>
+      </w:pPr>
+      <w:rPr>
+        <w:rFonts w:ascii="Wingdings" w:hAnsi="Wingdings" w:hint="default"/>
+        <w:sz w:val="20"/>
+      </w:rPr>
+    </w:lvl>
+    <w:lvl w:ilvl="5" w:tentative="1">
+      <w:start w:val="1"/>
+      <w:numFmt w:val="bullet"/>
+      <w:lvlText w:val=""/>
+      <w:lvlJc w:val="left"/>
+      <w:pPr>
+        <w:tabs>
+          <w:tab w:val="num" w:pos="4320"/>
+        </w:tabs>
+        <w:ind w:left="4320" w:hanging="360"/>
+      </w:pPr>
+      <w:rPr>
+        <w:rFonts w:ascii="Wingdings" w:hAnsi="Wingdings" w:hint="default"/>
+        <w:sz w:val="20"/>
+      </w:rPr>
+    </w:lvl>
+    <w:lvl w:ilvl="6" w:tentative="1">
+      <w:start w:val="1"/>
+      <w:numFmt w:val="bullet"/>
+      <w:lvlText w:val=""/>
+      <w:lvlJc w:val="left"/>
+      <w:pPr>
+        <w:tabs>
+          <w:tab w:val="num" w:pos="5040"/>
+        </w:tabs>
+        <w:ind w:left="5040" w:hanging="360"/>
+      </w:pPr>
+      <w:rPr>
+        <w:rFonts w:ascii="Wingdings" w:hAnsi="Wingdings" w:hint="default"/>
+        <w:sz w:val="20"/>
+      </w:rPr>
+    </w:lvl>
+    <w:lvl w:ilvl="7" w:tentative="1">
+      <w:start w:val="1"/>
+      <w:numFmt w:val="bullet"/>
+      <w:lvlText w:val=""/>
+      <w:lvlJc w:val="left"/>
+      <w:pPr>
+        <w:tabs>
+          <w:tab w:val="num" w:pos="5760"/>
+        </w:tabs>
+        <w:ind w:left="5760" w:hanging="360"/>
+      </w:pPr>
+      <w:rPr>
+        <w:rFonts w:ascii="Wingdings" w:hAnsi="Wingdings" w:hint="default"/>
+        <w:sz w:val="20"/>
+      </w:rPr>
+    </w:lvl>
+    <w:lvl w:ilvl="8" w:tentative="1">
+      <w:start w:val="1"/>
+      <w:numFmt w:val="bullet"/>
+      <w:lvlText w:val=""/>
+      <w:lvlJc w:val="left"/>
+      <w:pPr>
+        <w:tabs>
+          <w:tab w:val="num" w:pos="6480"/>
+        </w:tabs>
+        <w:ind w:left="6480" w:hanging="360"/>
+      </w:pPr>
+      <w:rPr>
+        <w:rFonts w:ascii="Wingdings" w:hAnsi="Wingdings" w:hint="default"/>
+        <w:sz w:val="20"/>
+      </w:rPr>
+    </w:lvl>
+  </w:abstractNum>
+  <w:abstractNum w:abstractNumId="34" w15:restartNumberingAfterBreak="0">
+    <w:nsid w:val="78E074C3"/>
+    <w:multiLevelType w:val="multilevel"/>
+    <w:tmpl w:val="59EE6632"/>
+    <w:lvl w:ilvl="0">
+      <w:start w:val="1"/>
+      <w:numFmt w:val="bullet"/>
+      <w:lvlText w:val=""/>
+      <w:lvlJc w:val="left"/>
+      <w:pPr>
+        <w:tabs>
+          <w:tab w:val="num" w:pos="720"/>
+        </w:tabs>
+        <w:ind w:left="720" w:hanging="360"/>
+      </w:pPr>
+      <w:rPr>
+        <w:rFonts w:ascii="Symbol" w:hAnsi="Symbol" w:hint="default"/>
+        <w:sz w:val="20"/>
+      </w:rPr>
+    </w:lvl>
+    <w:lvl w:ilvl="1" w:tentative="1">
+      <w:start w:val="1"/>
+      <w:numFmt w:val="bullet"/>
+      <w:lvlText w:val="o"/>
+      <w:lvlJc w:val="left"/>
+      <w:pPr>
+        <w:tabs>
+          <w:tab w:val="num" w:pos="1440"/>
+        </w:tabs>
+        <w:ind w:left="1440" w:hanging="360"/>
+      </w:pPr>
+      <w:rPr>
+        <w:rFonts w:ascii="Courier New" w:hAnsi="Courier New" w:hint="default"/>
+        <w:sz w:val="20"/>
+      </w:rPr>
+    </w:lvl>
+    <w:lvl w:ilvl="2" w:tentative="1">
+      <w:start w:val="1"/>
+      <w:numFmt w:val="bullet"/>
+      <w:lvlText w:val=""/>
+      <w:lvlJc w:val="left"/>
+      <w:pPr>
+        <w:tabs>
+          <w:tab w:val="num" w:pos="2160"/>
+        </w:tabs>
+        <w:ind w:left="2160" w:hanging="360"/>
+      </w:pPr>
+      <w:rPr>
+        <w:rFonts w:ascii="Wingdings" w:hAnsi="Wingdings" w:hint="default"/>
+        <w:sz w:val="20"/>
+      </w:rPr>
+    </w:lvl>
+    <w:lvl w:ilvl="3" w:tentative="1">
+      <w:start w:val="1"/>
+      <w:numFmt w:val="bullet"/>
+      <w:lvlText w:val=""/>
+      <w:lvlJc w:val="left"/>
+      <w:pPr>
+        <w:tabs>
+          <w:tab w:val="num" w:pos="2880"/>
+        </w:tabs>
+        <w:ind w:left="2880" w:hanging="360"/>
+      </w:pPr>
+      <w:rPr>
+        <w:rFonts w:ascii="Wingdings" w:hAnsi="Wingdings" w:hint="default"/>
+        <w:sz w:val="20"/>
+      </w:rPr>
+    </w:lvl>
+    <w:lvl w:ilvl="4" w:tentative="1">
+      <w:start w:val="1"/>
+      <w:numFmt w:val="bullet"/>
+      <w:lvlText w:val=""/>
+      <w:lvlJc w:val="left"/>
+      <w:pPr>
+        <w:tabs>
+          <w:tab w:val="num" w:pos="3600"/>
+        </w:tabs>
+        <w:ind w:left="3600" w:hanging="360"/>
+      </w:pPr>
+      <w:rPr>
+        <w:rFonts w:ascii="Wingdings" w:hAnsi="Wingdings" w:hint="default"/>
+        <w:sz w:val="20"/>
+      </w:rPr>
+    </w:lvl>
+    <w:lvl w:ilvl="5" w:tentative="1">
+      <w:start w:val="1"/>
+      <w:numFmt w:val="bullet"/>
+      <w:lvlText w:val=""/>
+      <w:lvlJc w:val="left"/>
+      <w:pPr>
+        <w:tabs>
+          <w:tab w:val="num" w:pos="4320"/>
+        </w:tabs>
+        <w:ind w:left="4320" w:hanging="360"/>
+      </w:pPr>
+      <w:rPr>
+        <w:rFonts w:ascii="Wingdings" w:hAnsi="Wingdings" w:hint="default"/>
+        <w:sz w:val="20"/>
+      </w:rPr>
+    </w:lvl>
+    <w:lvl w:ilvl="6" w:tentative="1">
+      <w:start w:val="1"/>
+      <w:numFmt w:val="bullet"/>
+      <w:lvlText w:val=""/>
+      <w:lvlJc w:val="left"/>
+      <w:pPr>
+        <w:tabs>
+          <w:tab w:val="num" w:pos="5040"/>
+        </w:tabs>
+        <w:ind w:left="5040" w:hanging="360"/>
+      </w:pPr>
+      <w:rPr>
+        <w:rFonts w:ascii="Wingdings" w:hAnsi="Wingdings" w:hint="default"/>
+        <w:sz w:val="20"/>
+      </w:rPr>
+    </w:lvl>
+    <w:lvl w:ilvl="7" w:tentative="1">
+      <w:start w:val="1"/>
+      <w:numFmt w:val="bullet"/>
+      <w:lvlText w:val=""/>
+      <w:lvlJc w:val="left"/>
+      <w:pPr>
+        <w:tabs>
+          <w:tab w:val="num" w:pos="5760"/>
+        </w:tabs>
+        <w:ind w:left="5760" w:hanging="360"/>
+      </w:pPr>
+      <w:rPr>
+        <w:rFonts w:ascii="Wingdings" w:hAnsi="Wingdings" w:hint="default"/>
+        <w:sz w:val="20"/>
+      </w:rPr>
+    </w:lvl>
+    <w:lvl w:ilvl="8" w:tentative="1">
+      <w:start w:val="1"/>
+      <w:numFmt w:val="bullet"/>
+      <w:lvlText w:val=""/>
+      <w:lvlJc w:val="left"/>
+      <w:pPr>
+        <w:tabs>
+          <w:tab w:val="num" w:pos="6480"/>
+        </w:tabs>
+        <w:ind w:left="6480" w:hanging="360"/>
+      </w:pPr>
+      <w:rPr>
+        <w:rFonts w:ascii="Wingdings" w:hAnsi="Wingdings" w:hint="default"/>
+        <w:sz w:val="20"/>
+      </w:rPr>
+    </w:lvl>
+  </w:abstractNum>
+  <w:abstractNum w:abstractNumId="35" w15:restartNumberingAfterBreak="0">
     <w:nsid w:val="7C5649E7"/>
     <w:multiLevelType w:val="multilevel"/>
     <w:tmpl w:val="DE6A2B26"/>
@@ -6822,7 +10332,7 @@
       </w:rPr>
     </w:lvl>
   </w:abstractNum>
-  <w:abstractNum w:abstractNumId="23" w15:restartNumberingAfterBreak="0">
+  <w:abstractNum w:abstractNumId="36" w15:restartNumberingAfterBreak="0">
     <w:nsid w:val="7DB611C3"/>
     <w:multiLevelType w:val="multilevel"/>
     <w:tmpl w:val="2550E8EC"/>
@@ -6975,73 +10485,112 @@
     <w:abstractNumId w:val="1"/>
   </w:num>
   <w:num w:numId="2" w16cid:durableId="1653604631">
-    <w:abstractNumId w:val="7"/>
+    <w:abstractNumId w:val="10"/>
   </w:num>
   <w:num w:numId="3" w16cid:durableId="1496454927">
+    <w:abstractNumId w:val="32"/>
+  </w:num>
+  <w:num w:numId="4" w16cid:durableId="1617326450">
+    <w:abstractNumId w:val="25"/>
+  </w:num>
+  <w:num w:numId="5" w16cid:durableId="1003973182">
+    <w:abstractNumId w:val="29"/>
+  </w:num>
+  <w:num w:numId="6" w16cid:durableId="223877540">
+    <w:abstractNumId w:val="4"/>
+  </w:num>
+  <w:num w:numId="7" w16cid:durableId="127867886">
+    <w:abstractNumId w:val="24"/>
+  </w:num>
+  <w:num w:numId="8" w16cid:durableId="386688840">
+    <w:abstractNumId w:val="28"/>
+  </w:num>
+  <w:num w:numId="9" w16cid:durableId="1292707220">
+    <w:abstractNumId w:val="35"/>
+  </w:num>
+  <w:num w:numId="10" w16cid:durableId="334190749">
     <w:abstractNumId w:val="21"/>
   </w:num>
-  <w:num w:numId="4" w16cid:durableId="1617326450">
-    <w:abstractNumId w:val="15"/>
+  <w:num w:numId="11" w16cid:durableId="1700157911">
+    <w:abstractNumId w:val="26"/>
   </w:num>
-  <w:num w:numId="5" w16cid:durableId="1003973182">
+  <w:num w:numId="12" w16cid:durableId="217206565">
     <w:abstractNumId w:val="18"/>
   </w:num>
-  <w:num w:numId="6" w16cid:durableId="223877540">
-    <w:abstractNumId w:val="2"/>
+  <w:num w:numId="13" w16cid:durableId="655106818">
+    <w:abstractNumId w:val="36"/>
   </w:num>
-  <w:num w:numId="7" w16cid:durableId="127867886">
-    <w:abstractNumId w:val="14"/>
-  </w:num>
-  <w:num w:numId="8" w16cid:durableId="386688840">
-    <w:abstractNumId w:val="17"/>
-  </w:num>
-  <w:num w:numId="9" w16cid:durableId="1292707220">
+  <w:num w:numId="14" w16cid:durableId="1535925039">
     <w:abstractNumId w:val="22"/>
   </w:num>
-  <w:num w:numId="10" w16cid:durableId="334190749">
-    <w:abstractNumId w:val="11"/>
+  <w:num w:numId="15" w16cid:durableId="994576772">
+    <w:abstractNumId w:val="31"/>
   </w:num>
-  <w:num w:numId="11" w16cid:durableId="1700157911">
-    <w:abstractNumId w:val="16"/>
-  </w:num>
-  <w:num w:numId="12" w16cid:durableId="217206565">
-    <w:abstractNumId w:val="9"/>
-  </w:num>
-  <w:num w:numId="13" w16cid:durableId="655106818">
+  <w:num w:numId="16" w16cid:durableId="1755544963">
     <w:abstractNumId w:val="23"/>
   </w:num>
-  <w:num w:numId="14" w16cid:durableId="1535925039">
-    <w:abstractNumId w:val="12"/>
-  </w:num>
-  <w:num w:numId="15" w16cid:durableId="994576772">
-    <w:abstractNumId w:val="20"/>
-  </w:num>
-  <w:num w:numId="16" w16cid:durableId="1755544963">
-    <w:abstractNumId w:val="13"/>
-  </w:num>
   <w:num w:numId="17" w16cid:durableId="1180970003">
-    <w:abstractNumId w:val="5"/>
+    <w:abstractNumId w:val="8"/>
   </w:num>
   <w:num w:numId="18" w16cid:durableId="1183130779">
     <w:abstractNumId w:val="0"/>
   </w:num>
   <w:num w:numId="19" w16cid:durableId="1448693778">
-    <w:abstractNumId w:val="4"/>
+    <w:abstractNumId w:val="6"/>
   </w:num>
   <w:num w:numId="20" w16cid:durableId="1405102408">
+    <w:abstractNumId w:val="5"/>
+  </w:num>
+  <w:num w:numId="21" w16cid:durableId="2116706457">
+    <w:abstractNumId w:val="30"/>
+  </w:num>
+  <w:num w:numId="22" w16cid:durableId="1615745274">
+    <w:abstractNumId w:val="9"/>
+  </w:num>
+  <w:num w:numId="23" w16cid:durableId="1537815125">
+    <w:abstractNumId w:val="19"/>
+  </w:num>
+  <w:num w:numId="24" w16cid:durableId="37364981">
+    <w:abstractNumId w:val="12"/>
+  </w:num>
+  <w:num w:numId="25" w16cid:durableId="1268656193">
+    <w:abstractNumId w:val="13"/>
+  </w:num>
+  <w:num w:numId="26" w16cid:durableId="85853804">
     <w:abstractNumId w:val="3"/>
   </w:num>
-  <w:num w:numId="21" w16cid:durableId="2116706457">
-    <w:abstractNumId w:val="19"/>
+  <w:num w:numId="27" w16cid:durableId="414521797">
+    <w:abstractNumId w:val="2"/>
   </w:num>
-  <w:num w:numId="22" w16cid:durableId="1615745274">
-    <w:abstractNumId w:val="6"/>
+  <w:num w:numId="28" w16cid:durableId="1290941236">
+    <w:abstractNumId w:val="16"/>
   </w:num>
-  <w:num w:numId="23" w16cid:durableId="1537815125">
-    <w:abstractNumId w:val="10"/>
+  <w:num w:numId="29" w16cid:durableId="981234873">
+    <w:abstractNumId w:val="11"/>
   </w:num>
-  <w:num w:numId="24" w16cid:durableId="37364981">
-    <w:abstractNumId w:val="8"/>
+  <w:num w:numId="30" w16cid:durableId="838497020">
+    <w:abstractNumId w:val="14"/>
+  </w:num>
+  <w:num w:numId="31" w16cid:durableId="264575265">
+    <w:abstractNumId w:val="20"/>
+  </w:num>
+  <w:num w:numId="32" w16cid:durableId="978650842">
+    <w:abstractNumId w:val="15"/>
+  </w:num>
+  <w:num w:numId="33" w16cid:durableId="1900357633">
+    <w:abstractNumId w:val="34"/>
+  </w:num>
+  <w:num w:numId="34" w16cid:durableId="991641642">
+    <w:abstractNumId w:val="27"/>
+  </w:num>
+  <w:num w:numId="35" w16cid:durableId="635379523">
+    <w:abstractNumId w:val="17"/>
+  </w:num>
+  <w:num w:numId="36" w16cid:durableId="485972317">
+    <w:abstractNumId w:val="33"/>
+  </w:num>
+  <w:num w:numId="37" w16cid:durableId="26831474">
+    <w:abstractNumId w:val="7"/>
   </w:num>
 </w:numbering>
 </file>

</xml_diff>